<commit_message>
fix(document-engine): no link around all the text, and an alignment option
Clearing the originals' dead links by writing an empty address over everything
was saved as a hyperlink to nowhere around all the text, which some viewers
draw as links. Links are now cleared one portion at a time, and a test refuses
any hyperlink. The import takes --align and --out, to compare left-aligned
running text with justified.

Claude-Session: https://claude.ai/code/session_019fFLd3rEWZKkUNU1RuQAwk
</commit_message>
<xml_diff>
--- a/packages/document-engine/templates/1.1_decision_training.docx
+++ b/packages/document-engine/templates/1.1_decision_training.docx
@@ -21,21 +21,17 @@
           <w:szCs w:val="20"/>
         </w:rPr>
       </w:pPr>
-      <w:hyperlink r:id="rId2">
-        <w:r>
-          <w:rPr>
-            <w:rStyle w:val="Hyperlink"/>
-            <w:rFonts w:eastAsia="Arial" w:cs="Arial" w:ascii="Arial" w:hAnsi="Arial"/>
-            <w:b/>
-            <w:color w:val="auto"/>
-            <w:sz w:val="24"/>
-            <w:szCs w:val="20"/>
-            <w:u w:val="none"/>
-            <w:lang w:val="ro-RO"/>
-          </w:rPr>
-          <w:t>DECIZIA</w:t>
-        </w:r>
-      </w:hyperlink>
+      <w:r>
+        <w:rPr>
+          <w:rFonts w:eastAsia="Arial" w:cs="Arial" w:ascii="Arial" w:hAnsi="Arial"/>
+          <w:b/>
+          <w:color w:val="auto"/>
+          <w:sz w:val="24"/>
+          <w:szCs w:val="20"/>
+          <w:lang w:val="ro-RO"/>
+        </w:rPr>
+        <w:t>DECIZIA</w:t>
+      </w:r>
     </w:p>
     <w:p>
       <w:pPr>
@@ -54,20 +50,16 @@
           <w:szCs w:val="20"/>
         </w:rPr>
       </w:pPr>
-      <w:hyperlink r:id="rId3">
-        <w:r>
-          <w:rPr>
-            <w:rStyle w:val="Hyperlink"/>
-            <w:rFonts w:eastAsia="Arial" w:cs="Arial" w:ascii="Arial" w:hAnsi="Arial"/>
-            <w:color w:val="auto"/>
-            <w:sz w:val="20"/>
-            <w:szCs w:val="20"/>
-            <w:u w:val="none"/>
-            <w:lang w:val="ro-RO"/>
-          </w:rPr>
-          <w:t>Nr.: {{decisionNumber}} SSM Din: {{issueDate}}</w:t>
-        </w:r>
-      </w:hyperlink>
+      <w:r>
+        <w:rPr>
+          <w:rFonts w:eastAsia="Arial" w:cs="Arial" w:ascii="Arial" w:hAnsi="Arial"/>
+          <w:color w:val="auto"/>
+          <w:sz w:val="20"/>
+          <w:szCs w:val="20"/>
+          <w:lang w:val="ro-RO"/>
+        </w:rPr>
+        <w:t>Nr.: {{decisionNumber}} SSM Din: {{issueDate}}</w:t>
+      </w:r>
     </w:p>
     <w:p>
       <w:pPr>
@@ -79,74 +71,74 @@
         </w:numPr>
         <w:spacing w:before="0" w:after="120"/>
         <w:ind w:hanging="0" w:left="0"/>
-        <w:rPr>
-          <w:rFonts w:ascii="Arial" w:hAnsi="Arial" w:cs="Arial"/>
-          <w:sz w:val="20"/>
-          <w:szCs w:val="20"/>
-        </w:rPr>
-      </w:pPr>
-      <w:hyperlink r:id="rId4">
-        <w:r>
-          <w:rPr>
-            <w:rStyle w:val="Hyperlink"/>
-            <w:rFonts w:eastAsia="Arial" w:cs="Arial" w:ascii="Arial" w:hAnsi="Arial"/>
-            <w:color w:val="auto"/>
-            <w:sz w:val="20"/>
-            <w:szCs w:val="20"/>
-            <w:u w:val="none"/>
-            <w:lang w:val="ro-RO"/>
-          </w:rPr>
-          <w:t>În baza prevederilor legale în domeniul securității și sănătății în muncă din Legea 319/ 2006 Art. 8, alin. (1), alin. (4), și din H.G. 1425/ 2006 Art. 14, Art. 15, alin. (1), punctul 4, Art. 20, alin. (1), Art. 85, Art. 89 alin. (1), Art. 91, alin. (1), Art. 94, Art. 96, alin. (1) și alin. (4), {{client.representativeName}} în calitate de</w:t>
-        </w:r>
-        <w:r>
-          <w:rPr>
-            <w:rStyle w:val="Hyperlink"/>
-            <w:rFonts w:eastAsia="Arial" w:cs="Arial" w:ascii="Arial" w:hAnsi="Arial"/>
-            <w:color w:val="auto"/>
-            <w:sz w:val="20"/>
-            <w:szCs w:val="20"/>
-            <w:u w:val="none"/>
-            <w:lang w:val="ro-RO"/>
-          </w:rPr>
-          <w:t xml:space="preserve"> {{client.representativeRole}}</w:t>
-        </w:r>
-        <w:r>
-          <w:rPr>
-            <w:rStyle w:val="Hyperlink"/>
-            <w:rFonts w:eastAsia="Arial" w:cs="Arial" w:ascii="Arial" w:hAnsi="Arial"/>
-            <w:color w:val="auto"/>
-            <w:sz w:val="20"/>
-            <w:szCs w:val="20"/>
-            <w:u w:val="none"/>
-            <w:lang w:val="ro-RO"/>
-          </w:rPr>
-          <w:t xml:space="preserve"> în cadrul </w:t>
-        </w:r>
-        <w:r>
-          <w:rPr>
-            <w:rStyle w:val="Hyperlink"/>
-            <w:rFonts w:eastAsia="Arial" w:cs="Arial" w:ascii="Arial" w:hAnsi="Arial"/>
-            <w:color w:val="auto"/>
-            <w:sz w:val="20"/>
-            <w:szCs w:val="20"/>
-            <w:u w:val="none"/>
-            <w:lang w:val="ro-RO"/>
-          </w:rPr>
-          <w:t>{{client.legalName}}</w:t>
-        </w:r>
-        <w:r>
-          <w:rPr>
-            <w:rStyle w:val="Hyperlink"/>
-            <w:rFonts w:eastAsia="Arial" w:cs="Arial" w:ascii="Arial" w:hAnsi="Arial"/>
-            <w:color w:val="auto"/>
-            <w:sz w:val="20"/>
-            <w:szCs w:val="20"/>
-            <w:u w:val="none"/>
-            <w:lang w:val="ro-RO"/>
-          </w:rPr>
-          <w:t>, începând cu data de {{issueDate}},</w:t>
-        </w:r>
-      </w:hyperlink>
+        <w:jc w:val="both"/>
+        <w:rPr>
+          <w:rFonts w:ascii="Arial" w:hAnsi="Arial" w:cs="Arial"/>
+          <w:sz w:val="20"/>
+          <w:szCs w:val="20"/>
+        </w:rPr>
+      </w:pPr>
+      <w:r>
+        <w:rPr>
+          <w:rFonts w:eastAsia="Arial" w:cs="Arial" w:ascii="Arial" w:hAnsi="Arial"/>
+          <w:color w:val="auto"/>
+          <w:sz w:val="20"/>
+          <w:szCs w:val="20"/>
+          <w:lang w:val="ro-RO"/>
+        </w:rPr>
+        <w:t>În baza prevederilor legale în domeniul securității și sănătății în muncă din Legea 319/ 2006 Art. 8, alin. (1), alin. (4), și din H.G. 1425/ 2006 Art. 14, Art. 15, alin. (1), punctul 4, Art. 20, alin. (1), Art. 85, Art. 89 alin. (1), Art. 91, alin. (1), Art. 94, Art. 96, alin. (1) și alin. (4), {{client.representativeName}} în calitate de</w:t>
+      </w:r>
+      <w:r>
+        <w:rPr>
+          <w:rFonts w:eastAsia="Arial" w:cs="Arial" w:ascii="Arial" w:hAnsi="Arial"/>
+          <w:color w:val="auto"/>
+          <w:sz w:val="20"/>
+          <w:szCs w:val="20"/>
+          <w:lang w:val="ro-RO"/>
+        </w:rPr>
+        <w:t xml:space="preserve"> {{client.representativeRole}}</w:t>
+      </w:r>
+      <w:r>
+        <w:rPr>
+          <w:rFonts w:eastAsia="Arial" w:cs="Arial" w:ascii="Arial" w:hAnsi="Arial"/>
+          <w:color w:val="auto"/>
+          <w:sz w:val="20"/>
+          <w:szCs w:val="20"/>
+          <w:lang w:val="ro-RO"/>
+        </w:rPr>
+        <w:t xml:space="preserve"> în cadrul </w:t>
+      </w:r>
+      <w:r>
+        <w:rPr>
+          <w:rFonts w:eastAsia="Arial" w:cs="Arial" w:ascii="Arial" w:hAnsi="Arial"/>
+          <w:color w:val="auto"/>
+          <w:sz w:val="20"/>
+          <w:szCs w:val="20"/>
+          <w:lang w:val="ro-RO"/>
+        </w:rPr>
+        <w:t>{{cli</w:t>
+      </w:r>
+      <w:r>
+        <w:rPr>
+          <w:rStyle w:val="PageNumber"/>
+          <w:rFonts w:eastAsia="Arial" w:cs="Arial" w:ascii="Arial" w:hAnsi="Arial"/>
+          <w:color w:val="auto"/>
+          <w:sz w:val="20"/>
+          <w:szCs w:val="20"/>
+          <w:lang w:val="ro-RO"/>
+        </w:rPr>
+        <w:t>ent.legalName}}</w:t>
+      </w:r>
+      <w:r>
+        <w:rPr>
+          <w:rFonts w:eastAsia="Arial" w:cs="Arial" w:ascii="Arial" w:hAnsi="Arial"/>
+          <w:color w:val="auto"/>
+          <w:sz w:val="20"/>
+          <w:szCs w:val="20"/>
+          <w:lang w:val="ro-RO"/>
+        </w:rPr>
+        <w:t>, începând cu data de {{issueDate}},</w:t>
+      </w:r>
     </w:p>
     <w:p>
       <w:pPr>
@@ -163,21 +155,17 @@
           <w:szCs w:val="20"/>
         </w:rPr>
       </w:pPr>
-      <w:hyperlink r:id="rId5">
-        <w:r>
-          <w:rPr>
-            <w:rStyle w:val="Hyperlink"/>
-            <w:rFonts w:eastAsia="Arial" w:cs="Arial" w:ascii="Arial" w:hAnsi="Arial"/>
-            <w:b/>
-            <w:color w:val="auto"/>
-            <w:sz w:val="20"/>
-            <w:szCs w:val="20"/>
-            <w:u w:val="none"/>
-            <w:lang w:val="ro-RO"/>
-          </w:rPr>
-          <w:t>DECIDE:</w:t>
-        </w:r>
-      </w:hyperlink>
+      <w:r>
+        <w:rPr>
+          <w:rFonts w:eastAsia="Arial" w:cs="Arial" w:ascii="Arial" w:hAnsi="Arial"/>
+          <w:b/>
+          <w:color w:val="auto"/>
+          <w:sz w:val="20"/>
+          <w:szCs w:val="20"/>
+          <w:lang w:val="ro-RO"/>
+        </w:rPr>
+        <w:t>DECIDE:</w:t>
+      </w:r>
     </w:p>
     <w:p>
       <w:pPr>
@@ -195,20 +183,37 @@
           <w:szCs w:val="20"/>
         </w:rPr>
       </w:pPr>
-      <w:hyperlink r:id="rId6">
-        <w:r>
-          <w:rPr>
-            <w:rStyle w:val="Hyperlink"/>
-            <w:rFonts w:eastAsia="Arial" w:cs="Arial" w:ascii="Arial" w:hAnsi="Arial"/>
-            <w:color w:val="auto"/>
-            <w:sz w:val="20"/>
-            <w:szCs w:val="20"/>
-            <w:u w:val="none"/>
-            <w:lang w:val="ro-RO"/>
-          </w:rPr>
-          <w:t>Efectuarea instruirilor în domeniul securității și sănătății în muncă la personalul angajat al {{client.legalName}}, se va realiza astfel:</w:t>
-        </w:r>
-      </w:hyperlink>
+      <w:r>
+        <w:rPr>
+          <w:rFonts w:eastAsia="Arial" w:cs="Arial" w:ascii="Arial" w:hAnsi="Arial"/>
+          <w:color w:val="auto"/>
+          <w:sz w:val="20"/>
+          <w:szCs w:val="20"/>
+          <w:lang w:val="ro-RO"/>
+        </w:rPr>
+        <w:t>Efectuarea instruirilor în domeniul securității și sănătății în muncă la personalul angajat al {{cl</w:t>
+      </w:r>
+      <w:r>
+        <w:rPr>
+          <w:rStyle w:val="PageNumber"/>
+          <w:rFonts w:eastAsia="Arial" w:cs="Arial" w:ascii="Arial" w:hAnsi="Arial"/>
+          <w:color w:val="auto"/>
+          <w:sz w:val="20"/>
+          <w:szCs w:val="20"/>
+          <w:lang w:val="ro-RO"/>
+        </w:rPr>
+        <w:t>ient.legalName}}</w:t>
+      </w:r>
+      <w:r>
+        <w:rPr>
+          <w:rFonts w:eastAsia="Arial" w:cs="Arial" w:ascii="Arial" w:hAnsi="Arial"/>
+          <w:color w:val="auto"/>
+          <w:sz w:val="20"/>
+          <w:szCs w:val="20"/>
+          <w:lang w:val="ro-RO"/>
+        </w:rPr>
+        <w:t>, se va realiza astfel:</w:t>
+      </w:r>
     </w:p>
     <w:p>
       <w:pPr>
@@ -227,20 +232,27 @@
           <w:szCs w:val="20"/>
         </w:rPr>
       </w:pPr>
-      <w:hyperlink r:id="rId7">
-        <w:r>
-          <w:rPr>
-            <w:rStyle w:val="Hyperlink"/>
-            <w:rFonts w:eastAsia="Arial" w:cs="Arial" w:ascii="Arial" w:hAnsi="Arial"/>
-            <w:color w:val="auto"/>
-            <w:sz w:val="20"/>
-            <w:szCs w:val="20"/>
-            <w:u w:val="none"/>
-            <w:lang w:val="ro-RO"/>
-          </w:rPr>
-          <w:t>Personalul din cadrul serviciului extern de prevenire și protecție {{provider.legalName}}, va efectua instruirea introductiv-generală la angajații {{client.legalName}}</w:t>
-        </w:r>
-      </w:hyperlink>
+      <w:r>
+        <w:rPr>
+          <w:rFonts w:eastAsia="Arial" w:cs="Arial" w:ascii="Arial" w:hAnsi="Arial"/>
+          <w:color w:val="auto"/>
+          <w:sz w:val="20"/>
+          <w:szCs w:val="20"/>
+          <w:lang w:val="ro-RO"/>
+        </w:rPr>
+        <w:t>Personalul din cadrul serviciului extern de prevenire și protecție {{provider.legalName}}, va efectua instruirea introductiv-generală la angajații {{cli</w:t>
+      </w:r>
+      <w:r>
+        <w:rPr>
+          <w:rStyle w:val="PageNumber"/>
+          <w:rFonts w:eastAsia="Arial" w:cs="Arial" w:ascii="Arial" w:hAnsi="Arial"/>
+          <w:color w:val="auto"/>
+          <w:sz w:val="20"/>
+          <w:szCs w:val="20"/>
+          <w:lang w:val="ro-RO"/>
+        </w:rPr>
+        <w:t>ent.legalName}}</w:t>
+      </w:r>
     </w:p>
     <w:p>
       <w:pPr>
@@ -259,68 +271,77 @@
           <w:szCs w:val="20"/>
         </w:rPr>
       </w:pPr>
-      <w:hyperlink r:id="rId8">
-        <w:r>
-          <w:rPr>
-            <w:rStyle w:val="Hyperlink"/>
-            <w:rFonts w:eastAsia="Arial" w:cs="Arial" w:ascii="Arial" w:hAnsi="Arial"/>
-            <w:color w:val="auto"/>
-            <w:sz w:val="20"/>
-            <w:szCs w:val="20"/>
-            <w:u w:val="none"/>
-            <w:lang w:val="ro-RO"/>
-          </w:rPr>
-          <w:t>Personalul din cadrul serviciului extern de prevenire și protecție {{provider.legalName}} va efectua instruirea la locul de muncă și instruirea periodică pentru șefii locului de muncă din cadrul {{client.legalName}}: {{#workplaceManagers}</w:t>
-        </w:r>
-        <w:r>
-          <w:rPr>
-            <w:rStyle w:val="Hyperlink"/>
-            <w:rFonts w:eastAsia="Arial" w:cs="Arial" w:ascii="Arial" w:hAnsi="Arial"/>
-            <w:color w:val="auto"/>
-            <w:sz w:val="20"/>
-            <w:szCs w:val="20"/>
-            <w:u w:val="none"/>
-            <w:lang w:val="ro-RO"/>
-          </w:rPr>
-          <w:t>}</w:t>
-        </w:r>
-        <w:r>
-          <w:rPr>
-            <w:rStyle w:val="Hyperlink"/>
-            <w:rFonts w:eastAsia="Arial" w:cs="Arial" w:ascii="Arial" w:hAnsi="Arial"/>
-            <w:color w:val="auto"/>
-            <w:sz w:val="20"/>
-            <w:szCs w:val="20"/>
-            <w:u w:val="none"/>
-            <w:lang w:val="ro-RO"/>
-          </w:rPr>
-          <w:t xml:space="preserve">{{name}}, având </w:t>
-        </w:r>
-        <w:r>
-          <w:rPr>
-            <w:rStyle w:val="Hyperlink"/>
-            <w:rFonts w:eastAsia="Arial" w:cs="Arial" w:ascii="Arial" w:hAnsi="Arial"/>
-            <w:color w:val="auto"/>
-            <w:sz w:val="20"/>
-            <w:szCs w:val="20"/>
-            <w:u w:val="none"/>
-            <w:lang w:val="ro-RO"/>
-          </w:rPr>
-          <w:t>funcția de {{jobT</w:t>
-        </w:r>
-        <w:r>
-          <w:rPr>
-            <w:rStyle w:val="Hyperlink"/>
-            <w:rFonts w:eastAsia="Arial" w:cs="Arial" w:ascii="Arial" w:hAnsi="Arial"/>
-            <w:color w:val="auto"/>
-            <w:sz w:val="20"/>
-            <w:szCs w:val="20"/>
-            <w:u w:val="none"/>
-            <w:lang w:val="ro-RO"/>
-          </w:rPr>
-          <w:t>itle}} în cadrul societății; {{/workplaceManagers}}</w:t>
-        </w:r>
-      </w:hyperlink>
+      <w:r>
+        <w:rPr>
+          <w:rFonts w:eastAsia="Arial" w:cs="Arial" w:ascii="Arial" w:hAnsi="Arial"/>
+          <w:color w:val="auto"/>
+          <w:sz w:val="20"/>
+          <w:szCs w:val="20"/>
+          <w:lang w:val="ro-RO"/>
+        </w:rPr>
+        <w:t>Personalul din cadrul serviciului extern de prevenire și protecție {{provider.legalName}} va efectua instruirea la locul de muncă și instruirea periodică pentru șefii locului de muncă din cadrul {{cli</w:t>
+      </w:r>
+      <w:r>
+        <w:rPr>
+          <w:rStyle w:val="PageNumber"/>
+          <w:rFonts w:eastAsia="Arial" w:cs="Arial" w:ascii="Arial" w:hAnsi="Arial"/>
+          <w:color w:val="auto"/>
+          <w:sz w:val="20"/>
+          <w:szCs w:val="20"/>
+          <w:lang w:val="ro-RO"/>
+        </w:rPr>
+        <w:t>ent.legalName}}</w:t>
+      </w:r>
+      <w:r>
+        <w:rPr>
+          <w:rFonts w:eastAsia="Arial" w:cs="Arial" w:ascii="Arial" w:hAnsi="Arial"/>
+          <w:color w:val="auto"/>
+          <w:sz w:val="20"/>
+          <w:szCs w:val="20"/>
+          <w:lang w:val="ro-RO"/>
+        </w:rPr>
+        <w:t>: {{#workplaceManagers}</w:t>
+      </w:r>
+      <w:r>
+        <w:rPr>
+          <w:rFonts w:eastAsia="Arial" w:cs="Arial" w:ascii="Arial" w:hAnsi="Arial"/>
+          <w:color w:val="auto"/>
+          <w:sz w:val="20"/>
+          <w:szCs w:val="20"/>
+          <w:lang w:val="ro-RO"/>
+        </w:rPr>
+        <w:t>}</w:t>
+      </w:r>
+      <w:r>
+        <w:rPr>
+          <w:rFonts w:eastAsia="Arial" w:cs="Arial" w:ascii="Arial" w:hAnsi="Arial"/>
+          <w:color w:val="auto"/>
+          <w:sz w:val="20"/>
+          <w:szCs w:val="20"/>
+          <w:lang w:val="ro-RO"/>
+        </w:rPr>
+        <w:t xml:space="preserve">{{name}}, având </w:t>
+      </w:r>
+      <w:r>
+        <w:rPr>
+          <w:rFonts w:eastAsia="Arial" w:cs="Arial" w:ascii="Arial" w:hAnsi="Arial"/>
+          <w:color w:val="auto"/>
+          <w:sz w:val="20"/>
+          <w:szCs w:val="20"/>
+          <w:lang w:val="ro-RO"/>
+        </w:rPr>
+        <w:t>funcția de {{jobT</w:t>
+      </w:r>
+      <w:r>
+        <w:rPr>
+          <w:rFonts w:eastAsia="Arial" w:cs="Arial" w:ascii="Arial" w:hAnsi="Arial"/>
+          <w:color w:val="auto"/>
+          <w:sz w:val="20"/>
+          <w:szCs w:val="20"/>
+          <w:lang w:val="ro-RO"/>
+        </w:rPr>
+        <w:t>itle}} în cadrul societății; {{/workplaceManagers}}</w:t>
+      </w:r>
     </w:p>
     <w:p>
       <w:pPr>
@@ -339,20 +360,16 @@
           <w:szCs w:val="20"/>
         </w:rPr>
       </w:pPr>
-      <w:hyperlink r:id="rId9">
-        <w:r>
-          <w:rPr>
-            <w:rStyle w:val="Hyperlink"/>
-            <w:rFonts w:eastAsia="Arial" w:cs="Arial" w:ascii="Arial" w:hAnsi="Arial"/>
-            <w:color w:val="auto"/>
-            <w:sz w:val="20"/>
-            <w:szCs w:val="20"/>
-            <w:u w:val="none"/>
-            <w:lang w:val="ro-RO"/>
-          </w:rPr>
-          <w:t>{{#workplaceManagers}}</w:t>
-        </w:r>
-      </w:hyperlink>
+      <w:r>
+        <w:rPr>
+          <w:rFonts w:eastAsia="Arial" w:cs="Arial" w:ascii="Arial" w:hAnsi="Arial"/>
+          <w:color w:val="auto"/>
+          <w:sz w:val="20"/>
+          <w:szCs w:val="20"/>
+          <w:lang w:val="ro-RO"/>
+        </w:rPr>
+        <w:t>{{#workplaceManagers}}</w:t>
+      </w:r>
     </w:p>
     <w:p>
       <w:pPr>
@@ -371,20 +388,27 @@
           <w:szCs w:val="20"/>
         </w:rPr>
       </w:pPr>
-      <w:hyperlink r:id="rId10">
-        <w:r>
-          <w:rPr>
-            <w:rStyle w:val="Hyperlink"/>
-            <w:rFonts w:eastAsia="Arial" w:cs="Arial" w:ascii="Arial" w:hAnsi="Arial"/>
-            <w:color w:val="auto"/>
-            <w:sz w:val="20"/>
-            <w:szCs w:val="20"/>
-            <w:u w:val="none"/>
-            <w:lang w:val="ro-RO"/>
-          </w:rPr>
-          <w:t>{{name}} având funcția de {{jobTitle}} va efectua instruirea la locul de muncă și instruirea periodică pentru întreg personalul din cadrul {{client.legalName}}</w:t>
-        </w:r>
-      </w:hyperlink>
+      <w:r>
+        <w:rPr>
+          <w:rFonts w:eastAsia="Arial" w:cs="Arial" w:ascii="Arial" w:hAnsi="Arial"/>
+          <w:color w:val="auto"/>
+          <w:sz w:val="20"/>
+          <w:szCs w:val="20"/>
+          <w:lang w:val="ro-RO"/>
+        </w:rPr>
+        <w:t>{{name}} având funcția de {{jobTitle}} va efectua instruirea la locul de muncă și instruirea periodică pentru întreg personalul din cadrul {{cli</w:t>
+      </w:r>
+      <w:r>
+        <w:rPr>
+          <w:rStyle w:val="PageNumber"/>
+          <w:rFonts w:eastAsia="Arial" w:cs="Arial" w:ascii="Arial" w:hAnsi="Arial"/>
+          <w:color w:val="auto"/>
+          <w:sz w:val="20"/>
+          <w:szCs w:val="20"/>
+          <w:lang w:val="ro-RO"/>
+        </w:rPr>
+        <w:t>ent.legalName}}</w:t>
+      </w:r>
     </w:p>
     <w:p>
       <w:pPr>
@@ -403,22 +427,18 @@
           <w:szCs w:val="20"/>
         </w:rPr>
       </w:pPr>
-      <w:hyperlink r:id="rId11">
-        <w:r>
-          <w:rPr>
-            <w:rStyle w:val="Hyperlink"/>
-            <w:rFonts w:eastAsia="Arial" w:cs="Arial" w:ascii="Arial" w:hAnsi="Arial"/>
-            <w:b/>
-            <w:bCs/>
-            <w:color w:val="auto"/>
-            <w:sz w:val="20"/>
-            <w:szCs w:val="20"/>
-            <w:u w:val="none"/>
-            <w:lang w:val="ro-RO"/>
-          </w:rPr>
-          <w:t>{{/workplaceManagers}}</w:t>
-        </w:r>
-      </w:hyperlink>
+      <w:r>
+        <w:rPr>
+          <w:rFonts w:eastAsia="Arial" w:cs="Arial" w:ascii="Arial" w:hAnsi="Arial"/>
+          <w:b/>
+          <w:bCs/>
+          <w:color w:val="auto"/>
+          <w:sz w:val="20"/>
+          <w:szCs w:val="20"/>
+          <w:lang w:val="ro-RO"/>
+        </w:rPr>
+        <w:t>{{/workplaceManagers}}</w:t>
+      </w:r>
     </w:p>
     <w:p>
       <w:pPr>
@@ -436,20 +456,37 @@
           <w:szCs w:val="20"/>
         </w:rPr>
       </w:pPr>
-      <w:hyperlink r:id="rId12">
-        <w:r>
-          <w:rPr>
-            <w:rStyle w:val="Hyperlink"/>
-            <w:rFonts w:eastAsia="Arial" w:cs="Arial" w:ascii="Arial" w:hAnsi="Arial"/>
-            <w:color w:val="auto"/>
-            <w:sz w:val="20"/>
-            <w:szCs w:val="20"/>
-            <w:u w:val="none"/>
-            <w:lang w:val="ro-RO"/>
-          </w:rPr>
-          <w:t>Instruirea în domeniul securității și sănătății în muncă în cadrul {{client.legalName}}, se va executa astfel:</w:t>
-        </w:r>
-      </w:hyperlink>
+      <w:r>
+        <w:rPr>
+          <w:rFonts w:eastAsia="Arial" w:cs="Arial" w:ascii="Arial" w:hAnsi="Arial"/>
+          <w:color w:val="auto"/>
+          <w:sz w:val="20"/>
+          <w:szCs w:val="20"/>
+          <w:lang w:val="ro-RO"/>
+        </w:rPr>
+        <w:t>Instruirea în domeniul securității și sănătății în muncă în cadrul {{cli</w:t>
+      </w:r>
+      <w:r>
+        <w:rPr>
+          <w:rStyle w:val="PageNumber"/>
+          <w:rFonts w:eastAsia="Arial" w:cs="Arial" w:ascii="Arial" w:hAnsi="Arial"/>
+          <w:color w:val="auto"/>
+          <w:sz w:val="20"/>
+          <w:szCs w:val="20"/>
+          <w:lang w:val="ro-RO"/>
+        </w:rPr>
+        <w:t>ent.legalName}}</w:t>
+      </w:r>
+      <w:r>
+        <w:rPr>
+          <w:rFonts w:eastAsia="Arial" w:cs="Arial" w:ascii="Arial" w:hAnsi="Arial"/>
+          <w:color w:val="auto"/>
+          <w:sz w:val="20"/>
+          <w:szCs w:val="20"/>
+          <w:lang w:val="ro-RO"/>
+        </w:rPr>
+        <w:t>, se va executa astfel:</w:t>
+      </w:r>
     </w:p>
     <w:p>
       <w:pPr>
@@ -468,45 +505,40 @@
           <w:szCs w:val="20"/>
         </w:rPr>
       </w:pPr>
-      <w:hyperlink r:id="rId13">
-        <w:r>
-          <w:rPr>
-            <w:rStyle w:val="Hyperlink"/>
-            <w:rFonts w:eastAsia="Arial" w:cs="Arial" w:ascii="Arial" w:hAnsi="Arial"/>
-            <w:color w:val="auto"/>
-            <w:sz w:val="20"/>
-            <w:szCs w:val="20"/>
-            <w:u w:val="none"/>
-            <w:lang w:val="ro-RO"/>
-          </w:rPr>
-          <w:t xml:space="preserve">Instruirea </w:t>
-        </w:r>
-        <w:r>
-          <w:rPr>
-            <w:rStyle w:val="Hyperlink"/>
-            <w:rFonts w:eastAsia="Arial" w:cs="Arial" w:ascii="Arial" w:hAnsi="Arial"/>
-            <w:b/>
-            <w:color w:val="auto"/>
-            <w:sz w:val="20"/>
-            <w:szCs w:val="20"/>
-            <w:u w:val="none"/>
-            <w:lang w:val="ro-RO"/>
-          </w:rPr>
-          <w:t>introductiv-generală</w:t>
-        </w:r>
-        <w:r>
-          <w:rPr>
-            <w:rStyle w:val="Hyperlink"/>
-            <w:rFonts w:eastAsia="Arial" w:cs="Arial" w:ascii="Arial" w:hAnsi="Arial"/>
-            <w:color w:val="auto"/>
-            <w:sz w:val="20"/>
-            <w:szCs w:val="20"/>
-            <w:u w:val="none"/>
-            <w:lang w:val="ro-RO"/>
-          </w:rPr>
-          <w:t>:</w:t>
-        </w:r>
-      </w:hyperlink>
+      <w:r>
+        <w:rPr>
+          <w:rStyle w:val="tpa1"/>
+          <w:rFonts w:eastAsia="Arial" w:cs="Arial" w:ascii="Arial" w:hAnsi="Arial"/>
+          <w:color w:val="auto"/>
+          <w:sz w:val="20"/>
+          <w:szCs w:val="20"/>
+          <w:lang w:val="ro-RO"/>
+        </w:rPr>
+        <w:t xml:space="preserve">Instruirea </w:t>
+      </w:r>
+      <w:r>
+        <w:rPr>
+          <w:rStyle w:val="tpa1"/>
+          <w:rFonts w:eastAsia="Arial" w:cs="Arial" w:ascii="Arial" w:hAnsi="Arial"/>
+          <w:b/>
+          <w:color w:val="auto"/>
+          <w:sz w:val="20"/>
+          <w:szCs w:val="20"/>
+          <w:lang w:val="ro-RO"/>
+        </w:rPr>
+        <w:t>introductiv-generală</w:t>
+      </w:r>
+      <w:r>
+        <w:rPr>
+          <w:rStyle w:val="tpa1"/>
+          <w:rFonts w:eastAsia="Arial" w:cs="Arial" w:ascii="Arial" w:hAnsi="Arial"/>
+          <w:color w:val="auto"/>
+          <w:sz w:val="20"/>
+          <w:szCs w:val="20"/>
+          <w:lang w:val="ro-RO"/>
+        </w:rPr>
+        <w:t>:</w:t>
+      </w:r>
     </w:p>
     <w:p>
       <w:pPr>
@@ -524,20 +556,16 @@
           <w:szCs w:val="20"/>
         </w:rPr>
       </w:pPr>
-      <w:hyperlink r:id="rId14">
-        <w:r>
-          <w:rPr>
-            <w:rStyle w:val="Hyperlink"/>
-            <w:rFonts w:eastAsia="Arial" w:cs="Arial" w:ascii="Arial" w:hAnsi="Arial"/>
-            <w:color w:val="auto"/>
-            <w:sz w:val="20"/>
-            <w:szCs w:val="20"/>
-            <w:u w:val="none"/>
-            <w:lang w:val="ro-RO"/>
-          </w:rPr>
-          <w:t>Conf. H.G. 767/ 2016 - Durata instruirii introductiv-generale nu va fi mai mică de 4 ore;</w:t>
-        </w:r>
-      </w:hyperlink>
+      <w:r>
+        <w:rPr>
+          <w:rFonts w:eastAsia="Arial" w:cs="Arial" w:ascii="Arial" w:hAnsi="Arial"/>
+          <w:color w:val="auto"/>
+          <w:sz w:val="20"/>
+          <w:szCs w:val="20"/>
+          <w:lang w:val="ro-RO"/>
+        </w:rPr>
+        <w:t>Conf. H.G. 767/ 2016 - Durata instruirii introductiv-generale nu va fi mai mică de 4 ore;</w:t>
+      </w:r>
     </w:p>
     <w:p>
       <w:pPr>
@@ -555,20 +583,16 @@
           <w:szCs w:val="20"/>
         </w:rPr>
       </w:pPr>
-      <w:hyperlink r:id="rId15">
-        <w:r>
-          <w:rPr>
-            <w:rStyle w:val="Hyperlink"/>
-            <w:rFonts w:eastAsia="Arial" w:cs="Arial" w:ascii="Arial" w:hAnsi="Arial"/>
-            <w:color w:val="auto"/>
-            <w:sz w:val="20"/>
-            <w:szCs w:val="20"/>
-            <w:u w:val="none"/>
-            <w:lang w:val="ro-RO"/>
-          </w:rPr>
-          <w:t>Categorii de personal care participă la efectuarea instruirilor:</w:t>
-        </w:r>
-      </w:hyperlink>
+      <w:r>
+        <w:rPr>
+          <w:rFonts w:eastAsia="Arial" w:cs="Arial" w:ascii="Arial" w:hAnsi="Arial"/>
+          <w:color w:val="auto"/>
+          <w:sz w:val="20"/>
+          <w:szCs w:val="20"/>
+          <w:lang w:val="ro-RO"/>
+        </w:rPr>
+        <w:t>Categorii de personal care participă la efectuarea instruirilor:</w:t>
+      </w:r>
     </w:p>
     <w:p>
       <w:pPr>
@@ -586,22 +610,19 @@
           <w:szCs w:val="20"/>
         </w:rPr>
       </w:pPr>
-      <w:hyperlink r:id="rId16">
-        <w:bookmarkStart w:id="0" w:name="do|caV|si2|ar83|lia"/>
-        <w:bookmarkEnd w:id="0"/>
-        <w:r>
-          <w:rPr>
-            <w:rStyle w:val="Hyperlink"/>
-            <w:rFonts w:eastAsia="Arial" w:cs="Arial" w:ascii="Arial" w:hAnsi="Arial"/>
-            <w:color w:val="auto"/>
-            <w:sz w:val="20"/>
-            <w:szCs w:val="20"/>
-            <w:u w:val="none"/>
-            <w:lang w:val="ro-RO"/>
-          </w:rPr>
-          <w:t>la angajarea lucrătorilor definiți conform art. 5 lit. a) din legea 319/ 2006;</w:t>
-        </w:r>
-      </w:hyperlink>
+      <w:bookmarkStart w:id="0" w:name="do|caV|si2|ar83|lia"/>
+      <w:bookmarkEnd w:id="0"/>
+      <w:r>
+        <w:rPr>
+          <w:rStyle w:val="tli1"/>
+          <w:rFonts w:eastAsia="Arial" w:cs="Arial" w:ascii="Arial" w:hAnsi="Arial"/>
+          <w:color w:val="auto"/>
+          <w:sz w:val="20"/>
+          <w:szCs w:val="20"/>
+          <w:lang w:val="ro-RO"/>
+        </w:rPr>
+        <w:t>la angajarea lucrătorilor definiți conform art. 5 lit. a) din legea 319/ 2006;</w:t>
+      </w:r>
     </w:p>
     <w:p>
       <w:pPr>
@@ -620,22 +641,19 @@
           <w:lang w:val="pt-PT"/>
         </w:rPr>
       </w:pPr>
-      <w:hyperlink r:id="rId17">
-        <w:bookmarkStart w:id="1" w:name="do|caV|si2|ar83|lib"/>
-        <w:bookmarkEnd w:id="1"/>
-        <w:r>
-          <w:rPr>
-            <w:rStyle w:val="Hyperlink"/>
-            <w:rFonts w:eastAsia="Arial" w:cs="Arial" w:ascii="Arial" w:hAnsi="Arial"/>
-            <w:color w:val="auto"/>
-            <w:sz w:val="20"/>
-            <w:szCs w:val="20"/>
-            <w:u w:val="none"/>
-            <w:lang w:val="ro-RO"/>
-          </w:rPr>
-          <w:t>lucrătorilor detașați de la o întreprindere și/ sau unitate la alta;</w:t>
-        </w:r>
-      </w:hyperlink>
+      <w:bookmarkStart w:id="1" w:name="do|caV|si2|ar83|lib"/>
+      <w:bookmarkEnd w:id="1"/>
+      <w:r>
+        <w:rPr>
+          <w:rStyle w:val="tli1"/>
+          <w:rFonts w:eastAsia="Arial" w:cs="Arial" w:ascii="Arial" w:hAnsi="Arial"/>
+          <w:color w:val="auto"/>
+          <w:sz w:val="20"/>
+          <w:szCs w:val="20"/>
+          <w:lang w:val="ro-RO"/>
+        </w:rPr>
+        <w:t>lucrătorilor detașați de la o întreprindere și/ sau unitate la alta;</w:t>
+      </w:r>
     </w:p>
     <w:p>
       <w:pPr>
@@ -654,22 +672,19 @@
           <w:lang w:val="it-IT"/>
         </w:rPr>
       </w:pPr>
-      <w:hyperlink r:id="rId18">
-        <w:bookmarkStart w:id="2" w:name="do|caV|si2|ar83|lic"/>
-        <w:bookmarkEnd w:id="2"/>
-        <w:r>
-          <w:rPr>
-            <w:rStyle w:val="Hyperlink"/>
-            <w:rFonts w:eastAsia="Arial" w:cs="Arial" w:ascii="Arial" w:hAnsi="Arial"/>
-            <w:color w:val="auto"/>
-            <w:sz w:val="20"/>
-            <w:szCs w:val="20"/>
-            <w:u w:val="none"/>
-            <w:lang w:val="ro-RO"/>
-          </w:rPr>
-          <w:t>lucrătorilor delegați de la o întreprindere și/ sau unitate la alta;</w:t>
-        </w:r>
-      </w:hyperlink>
+      <w:bookmarkStart w:id="2" w:name="do|caV|si2|ar83|lic"/>
+      <w:bookmarkEnd w:id="2"/>
+      <w:r>
+        <w:rPr>
+          <w:rStyle w:val="tli1"/>
+          <w:rFonts w:eastAsia="Arial" w:cs="Arial" w:ascii="Arial" w:hAnsi="Arial"/>
+          <w:color w:val="auto"/>
+          <w:sz w:val="20"/>
+          <w:szCs w:val="20"/>
+          <w:lang w:val="ro-RO"/>
+        </w:rPr>
+        <w:t>lucrătorilor delegați de la o întreprindere și/ sau unitate la alta;</w:t>
+      </w:r>
     </w:p>
     <w:p>
       <w:pPr>
@@ -688,22 +703,19 @@
           <w:szCs w:val="20"/>
         </w:rPr>
       </w:pPr>
-      <w:hyperlink r:id="rId19">
-        <w:bookmarkStart w:id="3" w:name="do|caV|si2|ar83|lid"/>
-        <w:bookmarkEnd w:id="3"/>
-        <w:r>
-          <w:rPr>
-            <w:rStyle w:val="Hyperlink"/>
-            <w:rFonts w:eastAsia="Arial" w:cs="Arial" w:ascii="Arial" w:hAnsi="Arial"/>
-            <w:color w:val="auto"/>
-            <w:sz w:val="20"/>
-            <w:szCs w:val="20"/>
-            <w:u w:val="none"/>
-            <w:lang w:val="ro-RO"/>
-          </w:rPr>
-          <w:t>lucrătorului pus la dispoziție de către un agent de muncă temporar.</w:t>
-        </w:r>
-      </w:hyperlink>
+      <w:bookmarkStart w:id="3" w:name="do|caV|si2|ar83|lid"/>
+      <w:bookmarkEnd w:id="3"/>
+      <w:r>
+        <w:rPr>
+          <w:rStyle w:val="tli1"/>
+          <w:rFonts w:eastAsia="Arial" w:cs="Arial" w:ascii="Arial" w:hAnsi="Arial"/>
+          <w:color w:val="auto"/>
+          <w:sz w:val="20"/>
+          <w:szCs w:val="20"/>
+          <w:lang w:val="ro-RO"/>
+        </w:rPr>
+        <w:t>lucrătorului pus la dispoziție de către un agent de muncă temporar.</w:t>
+      </w:r>
     </w:p>
     <w:p>
       <w:pPr>
@@ -722,45 +734,40 @@
           <w:szCs w:val="20"/>
         </w:rPr>
       </w:pPr>
-      <w:hyperlink r:id="rId20">
-        <w:r>
-          <w:rPr>
-            <w:rStyle w:val="Hyperlink"/>
-            <w:rFonts w:eastAsia="Arial" w:cs="Arial" w:ascii="Arial" w:hAnsi="Arial"/>
-            <w:color w:val="auto"/>
-            <w:sz w:val="20"/>
-            <w:szCs w:val="20"/>
-            <w:u w:val="none"/>
-            <w:lang w:val="ro-RO"/>
-          </w:rPr>
-          <w:t xml:space="preserve">Instruirea </w:t>
-        </w:r>
-        <w:r>
-          <w:rPr>
-            <w:rStyle w:val="Hyperlink"/>
-            <w:rFonts w:eastAsia="Arial" w:cs="Arial" w:ascii="Arial" w:hAnsi="Arial"/>
-            <w:b/>
-            <w:color w:val="auto"/>
-            <w:sz w:val="20"/>
-            <w:szCs w:val="20"/>
-            <w:u w:val="none"/>
-            <w:lang w:val="ro-RO"/>
-          </w:rPr>
-          <w:t>la locul de muncă</w:t>
-        </w:r>
-        <w:r>
-          <w:rPr>
-            <w:rStyle w:val="Hyperlink"/>
-            <w:rFonts w:eastAsia="Arial" w:cs="Arial" w:ascii="Arial" w:hAnsi="Arial"/>
-            <w:color w:val="auto"/>
-            <w:sz w:val="20"/>
-            <w:szCs w:val="20"/>
-            <w:u w:val="none"/>
-            <w:lang w:val="ro-RO"/>
-          </w:rPr>
-          <w:t>:</w:t>
-        </w:r>
-      </w:hyperlink>
+      <w:r>
+        <w:rPr>
+          <w:rStyle w:val="tpa1"/>
+          <w:rFonts w:eastAsia="Arial" w:cs="Arial" w:ascii="Arial" w:hAnsi="Arial"/>
+          <w:color w:val="auto"/>
+          <w:sz w:val="20"/>
+          <w:szCs w:val="20"/>
+          <w:lang w:val="ro-RO"/>
+        </w:rPr>
+        <w:t xml:space="preserve">Instruirea </w:t>
+      </w:r>
+      <w:r>
+        <w:rPr>
+          <w:rStyle w:val="tal1"/>
+          <w:rFonts w:eastAsia="Arial" w:cs="Arial" w:ascii="Arial" w:hAnsi="Arial"/>
+          <w:b/>
+          <w:color w:val="auto"/>
+          <w:sz w:val="20"/>
+          <w:szCs w:val="20"/>
+          <w:lang w:val="ro-RO"/>
+        </w:rPr>
+        <w:t>la locul de muncă</w:t>
+      </w:r>
+      <w:r>
+        <w:rPr>
+          <w:rStyle w:val="tpa1"/>
+          <w:rFonts w:eastAsia="Arial" w:cs="Arial" w:ascii="Arial" w:hAnsi="Arial"/>
+          <w:color w:val="auto"/>
+          <w:sz w:val="20"/>
+          <w:szCs w:val="20"/>
+          <w:lang w:val="ro-RO"/>
+        </w:rPr>
+        <w:t>:</w:t>
+      </w:r>
     </w:p>
     <w:p>
       <w:pPr>
@@ -778,20 +785,16 @@
           <w:szCs w:val="20"/>
         </w:rPr>
       </w:pPr>
-      <w:hyperlink r:id="rId21">
-        <w:r>
-          <w:rPr>
-            <w:rStyle w:val="Hyperlink"/>
-            <w:rFonts w:eastAsia="Arial" w:cs="Arial" w:ascii="Arial" w:hAnsi="Arial"/>
-            <w:color w:val="auto"/>
-            <w:sz w:val="20"/>
-            <w:szCs w:val="20"/>
-            <w:u w:val="none"/>
-            <w:lang w:val="ro-RO"/>
-          </w:rPr>
-          <w:t>Conf. H.G. 767/ 2016 pct.4 - Durata instruirii la locul de muncă nu va fi mai mică de 4 ore;</w:t>
-        </w:r>
-      </w:hyperlink>
+      <w:r>
+        <w:rPr>
+          <w:rFonts w:eastAsia="Arial" w:cs="Arial" w:ascii="Arial" w:hAnsi="Arial"/>
+          <w:color w:val="auto"/>
+          <w:sz w:val="20"/>
+          <w:szCs w:val="20"/>
+          <w:lang w:val="ro-RO"/>
+        </w:rPr>
+        <w:t>Conf. H.G. 767/ 2016 pct.4 - Durata instruirii la locul de muncă nu va fi mai mică de 4 ore;</w:t>
+      </w:r>
     </w:p>
     <w:p>
       <w:pPr>
@@ -809,20 +812,16 @@
           <w:szCs w:val="20"/>
         </w:rPr>
       </w:pPr>
-      <w:hyperlink r:id="rId22">
-        <w:r>
-          <w:rPr>
-            <w:rStyle w:val="Hyperlink"/>
-            <w:rFonts w:eastAsia="Arial" w:cs="Arial" w:ascii="Arial" w:hAnsi="Arial"/>
-            <w:color w:val="auto"/>
-            <w:sz w:val="20"/>
-            <w:szCs w:val="20"/>
-            <w:u w:val="none"/>
-            <w:lang w:val="ro-RO"/>
-          </w:rPr>
-          <w:t>Categorii de personal care participă la efectuarea instruirilor:</w:t>
-        </w:r>
-      </w:hyperlink>
+      <w:r>
+        <w:rPr>
+          <w:rFonts w:eastAsia="Arial" w:cs="Arial" w:ascii="Arial" w:hAnsi="Arial"/>
+          <w:color w:val="auto"/>
+          <w:sz w:val="20"/>
+          <w:szCs w:val="20"/>
+          <w:lang w:val="ro-RO"/>
+        </w:rPr>
+        <w:t>Categorii de personal care participă la efectuarea instruirilor:</w:t>
+      </w:r>
     </w:p>
     <w:p>
       <w:pPr>
@@ -840,20 +839,17 @@
           <w:szCs w:val="20"/>
         </w:rPr>
       </w:pPr>
-      <w:hyperlink r:id="rId23">
-        <w:r>
-          <w:rPr>
-            <w:rStyle w:val="Hyperlink"/>
-            <w:rFonts w:eastAsia="Arial" w:cs="Arial" w:ascii="Arial" w:hAnsi="Arial"/>
-            <w:color w:val="auto"/>
-            <w:sz w:val="20"/>
-            <w:szCs w:val="20"/>
-            <w:u w:val="none"/>
-            <w:lang w:val="ro-RO"/>
-          </w:rPr>
-          <w:t>la angajarea lucrătorilor definiți conform art. 5 lit. a) din legea 319/ 2006;</w:t>
-        </w:r>
-      </w:hyperlink>
+      <w:r>
+        <w:rPr>
+          <w:rStyle w:val="tli1"/>
+          <w:rFonts w:eastAsia="Arial" w:cs="Arial" w:ascii="Arial" w:hAnsi="Arial"/>
+          <w:color w:val="auto"/>
+          <w:sz w:val="20"/>
+          <w:szCs w:val="20"/>
+          <w:lang w:val="ro-RO"/>
+        </w:rPr>
+        <w:t>la angajarea lucrătorilor definiți conform art. 5 lit. a) din legea 319/ 2006;</w:t>
+      </w:r>
     </w:p>
     <w:p>
       <w:pPr>
@@ -872,20 +868,17 @@
           <w:lang w:val="pt-PT"/>
         </w:rPr>
       </w:pPr>
-      <w:hyperlink r:id="rId24">
-        <w:r>
-          <w:rPr>
-            <w:rStyle w:val="Hyperlink"/>
-            <w:rFonts w:eastAsia="Arial" w:cs="Arial" w:ascii="Arial" w:hAnsi="Arial"/>
-            <w:color w:val="auto"/>
-            <w:sz w:val="20"/>
-            <w:szCs w:val="20"/>
-            <w:u w:val="none"/>
-            <w:lang w:val="ro-RO"/>
-          </w:rPr>
-          <w:t>lucrătorilor detașați de la o întreprindere și/ sau unitate la alta;</w:t>
-        </w:r>
-      </w:hyperlink>
+      <w:r>
+        <w:rPr>
+          <w:rStyle w:val="tli1"/>
+          <w:rFonts w:eastAsia="Arial" w:cs="Arial" w:ascii="Arial" w:hAnsi="Arial"/>
+          <w:color w:val="auto"/>
+          <w:sz w:val="20"/>
+          <w:szCs w:val="20"/>
+          <w:lang w:val="ro-RO"/>
+        </w:rPr>
+        <w:t>lucrătorilor detașați de la o întreprindere și/ sau unitate la alta;</w:t>
+      </w:r>
     </w:p>
     <w:p>
       <w:pPr>
@@ -904,20 +897,17 @@
           <w:lang w:val="it-IT"/>
         </w:rPr>
       </w:pPr>
-      <w:hyperlink r:id="rId25">
-        <w:r>
-          <w:rPr>
-            <w:rStyle w:val="Hyperlink"/>
-            <w:rFonts w:eastAsia="Arial" w:cs="Arial" w:ascii="Arial" w:hAnsi="Arial"/>
-            <w:color w:val="auto"/>
-            <w:sz w:val="20"/>
-            <w:szCs w:val="20"/>
-            <w:u w:val="none"/>
-            <w:lang w:val="ro-RO"/>
-          </w:rPr>
-          <w:t>lucrătorilor delegați de la o întreprindere și/ sau unitate la alta;</w:t>
-        </w:r>
-      </w:hyperlink>
+      <w:r>
+        <w:rPr>
+          <w:rStyle w:val="tli1"/>
+          <w:rFonts w:eastAsia="Arial" w:cs="Arial" w:ascii="Arial" w:hAnsi="Arial"/>
+          <w:color w:val="auto"/>
+          <w:sz w:val="20"/>
+          <w:szCs w:val="20"/>
+          <w:lang w:val="ro-RO"/>
+        </w:rPr>
+        <w:t>lucrătorilor delegați de la o întreprindere și/ sau unitate la alta;</w:t>
+      </w:r>
     </w:p>
     <w:p>
       <w:pPr>
@@ -936,20 +926,17 @@
           <w:szCs w:val="20"/>
         </w:rPr>
       </w:pPr>
-      <w:hyperlink r:id="rId26">
-        <w:r>
-          <w:rPr>
-            <w:rStyle w:val="Hyperlink"/>
-            <w:rFonts w:eastAsia="Arial" w:cs="Arial" w:ascii="Arial" w:hAnsi="Arial"/>
-            <w:color w:val="auto"/>
-            <w:sz w:val="20"/>
-            <w:szCs w:val="20"/>
-            <w:u w:val="none"/>
-            <w:lang w:val="ro-RO"/>
-          </w:rPr>
-          <w:t>lucrătorului pus la dispoziție de către un agent de muncă temporar.</w:t>
-        </w:r>
-      </w:hyperlink>
+      <w:r>
+        <w:rPr>
+          <w:rStyle w:val="tli1"/>
+          <w:rFonts w:eastAsia="Arial" w:cs="Arial" w:ascii="Arial" w:hAnsi="Arial"/>
+          <w:color w:val="auto"/>
+          <w:sz w:val="20"/>
+          <w:szCs w:val="20"/>
+          <w:lang w:val="ro-RO"/>
+        </w:rPr>
+        <w:t>lucrătorului pus la dispoziție de către un agent de muncă temporar.</w:t>
+      </w:r>
     </w:p>
     <w:p>
       <w:pPr>
@@ -968,47 +955,41 @@
           <w:szCs w:val="20"/>
         </w:rPr>
       </w:pPr>
-      <w:hyperlink r:id="rId27">
-        <w:bookmarkStart w:id="4" w:name="do|caV|si3|ar90|al2"/>
-        <w:bookmarkEnd w:id="4"/>
-        <w:r>
-          <w:rPr>
-            <w:rStyle w:val="Hyperlink"/>
-            <w:rFonts w:eastAsia="Arial" w:cs="Arial" w:ascii="Arial" w:hAnsi="Arial"/>
-            <w:color w:val="auto"/>
-            <w:sz w:val="20"/>
-            <w:szCs w:val="20"/>
-            <w:u w:val="none"/>
-            <w:lang w:val="ro-RO"/>
-          </w:rPr>
-          <w:t>Instruirea la locul de muncă se face tuturor lucrătorilor prevăzuți la art. 83</w:t>
-        </w:r>
-        <w:r>
-          <w:rPr>
-            <w:rStyle w:val="Hyperlink"/>
-            <w:rFonts w:eastAsia="Arial" w:cs="Arial" w:ascii="Arial" w:hAnsi="Arial"/>
-            <w:i/>
-            <w:color w:val="auto"/>
-            <w:sz w:val="20"/>
-            <w:szCs w:val="20"/>
-            <w:u w:val="none"/>
-            <w:lang w:val="ro-RO"/>
-          </w:rPr>
-          <w:t xml:space="preserve"> din H.G. 1425/ 2006</w:t>
-        </w:r>
-        <w:r>
-          <w:rPr>
-            <w:rStyle w:val="Hyperlink"/>
-            <w:rFonts w:eastAsia="Arial" w:cs="Arial" w:ascii="Arial" w:hAnsi="Arial"/>
-            <w:color w:val="auto"/>
-            <w:sz w:val="20"/>
-            <w:szCs w:val="20"/>
-            <w:u w:val="none"/>
-            <w:lang w:val="ro-RO"/>
-          </w:rPr>
-          <w:t>, inclusiv la schimbarea locului de muncă în cadrul întreprinderii și/sau al unității.</w:t>
-        </w:r>
-      </w:hyperlink>
+      <w:bookmarkStart w:id="4" w:name="do|caV|si3|ar90|al2"/>
+      <w:bookmarkEnd w:id="4"/>
+      <w:r>
+        <w:rPr>
+          <w:rStyle w:val="tal1"/>
+          <w:rFonts w:eastAsia="Arial" w:cs="Arial" w:ascii="Arial" w:hAnsi="Arial"/>
+          <w:color w:val="auto"/>
+          <w:sz w:val="20"/>
+          <w:szCs w:val="20"/>
+          <w:lang w:val="ro-RO"/>
+        </w:rPr>
+        <w:t>Instruirea la locul de muncă se face tuturor lucrătorilor prevăzuți la art. 83</w:t>
+      </w:r>
+      <w:r>
+        <w:rPr>
+          <w:rFonts w:eastAsia="Arial" w:cs="Arial" w:ascii="Arial" w:hAnsi="Arial"/>
+          <w:i/>
+          <w:color w:val="auto"/>
+          <w:sz w:val="20"/>
+          <w:szCs w:val="20"/>
+          <w:lang w:val="ro-RO"/>
+        </w:rPr>
+        <w:t xml:space="preserve"> din H.G. 1425/ 2006</w:t>
+      </w:r>
+      <w:r>
+        <w:rPr>
+          <w:rStyle w:val="tal1"/>
+          <w:rFonts w:eastAsia="Arial" w:cs="Arial" w:ascii="Arial" w:hAnsi="Arial"/>
+          <w:color w:val="auto"/>
+          <w:sz w:val="20"/>
+          <w:szCs w:val="20"/>
+          <w:lang w:val="ro-RO"/>
+        </w:rPr>
+        <w:t>, inclusiv la schimbarea locului de muncă în cadrul întreprinderii și/sau al unității.</w:t>
+      </w:r>
     </w:p>
     <w:p>
       <w:pPr>
@@ -1026,45 +1007,40 @@
           <w:szCs w:val="20"/>
         </w:rPr>
       </w:pPr>
-      <w:hyperlink r:id="rId28">
-        <w:r>
-          <w:rPr>
-            <w:rStyle w:val="Hyperlink"/>
-            <w:rFonts w:eastAsia="Arial" w:cs="Arial" w:ascii="Arial" w:hAnsi="Arial"/>
-            <w:color w:val="auto"/>
-            <w:sz w:val="20"/>
-            <w:szCs w:val="20"/>
-            <w:u w:val="none"/>
-            <w:lang w:val="ro-RO"/>
-          </w:rPr>
-          <w:t xml:space="preserve">Instruirea </w:t>
-        </w:r>
-        <w:r>
-          <w:rPr>
-            <w:rStyle w:val="Hyperlink"/>
-            <w:rFonts w:eastAsia="Arial" w:cs="Arial" w:ascii="Arial" w:hAnsi="Arial"/>
-            <w:b/>
-            <w:color w:val="auto"/>
-            <w:sz w:val="20"/>
-            <w:szCs w:val="20"/>
-            <w:u w:val="none"/>
-            <w:lang w:val="ro-RO"/>
-          </w:rPr>
-          <w:t>periodică</w:t>
-        </w:r>
-        <w:r>
-          <w:rPr>
-            <w:rStyle w:val="Hyperlink"/>
-            <w:rFonts w:eastAsia="Arial" w:cs="Arial" w:ascii="Arial" w:hAnsi="Arial"/>
-            <w:color w:val="auto"/>
-            <w:sz w:val="20"/>
-            <w:szCs w:val="20"/>
-            <w:u w:val="none"/>
-            <w:lang w:val="ro-RO"/>
-          </w:rPr>
-          <w:t>:</w:t>
-        </w:r>
-      </w:hyperlink>
+      <w:r>
+        <w:rPr>
+          <w:rStyle w:val="tpa1"/>
+          <w:rFonts w:eastAsia="Arial" w:cs="Arial" w:ascii="Arial" w:hAnsi="Arial"/>
+          <w:color w:val="auto"/>
+          <w:sz w:val="20"/>
+          <w:szCs w:val="20"/>
+          <w:lang w:val="ro-RO"/>
+        </w:rPr>
+        <w:t xml:space="preserve">Instruirea </w:t>
+      </w:r>
+      <w:r>
+        <w:rPr>
+          <w:rStyle w:val="tpa1"/>
+          <w:rFonts w:eastAsia="Arial" w:cs="Arial" w:ascii="Arial" w:hAnsi="Arial"/>
+          <w:b/>
+          <w:color w:val="auto"/>
+          <w:sz w:val="20"/>
+          <w:szCs w:val="20"/>
+          <w:lang w:val="ro-RO"/>
+        </w:rPr>
+        <w:t>periodică</w:t>
+      </w:r>
+      <w:r>
+        <w:rPr>
+          <w:rStyle w:val="tpa1"/>
+          <w:rFonts w:eastAsia="Arial" w:cs="Arial" w:ascii="Arial" w:hAnsi="Arial"/>
+          <w:color w:val="auto"/>
+          <w:sz w:val="20"/>
+          <w:szCs w:val="20"/>
+          <w:lang w:val="ro-RO"/>
+        </w:rPr>
+        <w:t>:</w:t>
+      </w:r>
     </w:p>
     <w:p>
       <w:pPr>
@@ -1083,45 +1059,39 @@
           <w:szCs w:val="20"/>
         </w:rPr>
       </w:pPr>
-      <w:hyperlink r:id="rId29">
-        <w:r>
-          <w:rPr>
-            <w:rStyle w:val="Hyperlink"/>
-            <w:rFonts w:eastAsia="Arial" w:cs="Arial" w:ascii="Arial" w:hAnsi="Arial"/>
-            <w:color w:val="auto"/>
-            <w:sz w:val="20"/>
-            <w:szCs w:val="20"/>
-            <w:u w:val="none"/>
-            <w:lang w:val="ro-RO"/>
-          </w:rPr>
-          <w:t xml:space="preserve">Se face tuturor lucrătorilor prevăzuți la art. 83 </w:t>
-        </w:r>
-        <w:r>
-          <w:rPr>
-            <w:rStyle w:val="Hyperlink"/>
-            <w:rFonts w:eastAsia="Arial" w:cs="Arial" w:ascii="Arial" w:hAnsi="Arial"/>
-            <w:i/>
-            <w:color w:val="auto"/>
-            <w:sz w:val="20"/>
-            <w:szCs w:val="20"/>
-            <w:u w:val="none"/>
-            <w:lang w:val="ro-RO"/>
-          </w:rPr>
-          <w:t xml:space="preserve">din H.G. 1425/ 2006 </w:t>
-        </w:r>
-        <w:r>
-          <w:rPr>
-            <w:rStyle w:val="Hyperlink"/>
-            <w:rFonts w:eastAsia="Arial" w:cs="Arial" w:ascii="Arial" w:hAnsi="Arial"/>
-            <w:color w:val="auto"/>
-            <w:sz w:val="20"/>
-            <w:szCs w:val="20"/>
-            <w:u w:val="none"/>
-            <w:lang w:val="ro-RO"/>
-          </w:rPr>
-          <w:t>și are drept scop reîmprospătarea și actualizarea cunoștințelor în domeniul securității și sănătății în muncă.</w:t>
-        </w:r>
-      </w:hyperlink>
+      <w:r>
+        <w:rPr>
+          <w:rStyle w:val="tpa1"/>
+          <w:rFonts w:eastAsia="Arial" w:cs="Arial" w:ascii="Arial" w:hAnsi="Arial"/>
+          <w:color w:val="auto"/>
+          <w:sz w:val="20"/>
+          <w:szCs w:val="20"/>
+          <w:lang w:val="ro-RO"/>
+        </w:rPr>
+        <w:t xml:space="preserve">Se face tuturor lucrătorilor prevăzuți la art. 83 </w:t>
+      </w:r>
+      <w:r>
+        <w:rPr>
+          <w:rFonts w:eastAsia="Arial" w:cs="Arial" w:ascii="Arial" w:hAnsi="Arial"/>
+          <w:i/>
+          <w:color w:val="auto"/>
+          <w:sz w:val="20"/>
+          <w:szCs w:val="20"/>
+          <w:lang w:val="ro-RO"/>
+        </w:rPr>
+        <w:t xml:space="preserve">din H.G. 1425/ 2006 </w:t>
+      </w:r>
+      <w:r>
+        <w:rPr>
+          <w:rStyle w:val="tpa1"/>
+          <w:rFonts w:eastAsia="Arial" w:cs="Arial" w:ascii="Arial" w:hAnsi="Arial"/>
+          <w:color w:val="auto"/>
+          <w:sz w:val="20"/>
+          <w:szCs w:val="20"/>
+          <w:lang w:val="ro-RO"/>
+        </w:rPr>
+        <w:t>și are drept scop reîmprospătarea și actualizarea cunoștințelor în domeniul securității și sănătății în muncă.</w:t>
+      </w:r>
     </w:p>
     <w:p>
       <w:pPr>
@@ -1139,70 +1109,59 @@
           <w:szCs w:val="20"/>
         </w:rPr>
       </w:pPr>
-      <w:hyperlink r:id="rId30">
-        <w:r>
-          <w:rPr>
-            <w:rStyle w:val="Hyperlink"/>
-            <w:rFonts w:eastAsia="Arial" w:cs="Arial" w:ascii="Arial" w:hAnsi="Arial"/>
-            <w:color w:val="auto"/>
-            <w:sz w:val="20"/>
-            <w:szCs w:val="20"/>
-            <w:u w:val="none"/>
-            <w:lang w:val="ro-RO"/>
-          </w:rPr>
-          <w:t xml:space="preserve">Conf. H.G. 767/ 2016, pct. 6) În cadrul {{client.legalName}}, </w:t>
-        </w:r>
-        <w:r>
-          <w:rPr>
-            <w:rStyle w:val="Hyperlink"/>
-            <w:rFonts w:eastAsia="Arial" w:cs="Arial" w:ascii="Arial" w:hAnsi="Arial"/>
-            <w:color w:val="auto"/>
-            <w:sz w:val="20"/>
-            <w:szCs w:val="20"/>
-            <w:u w:val="none"/>
-            <w:shd w:fill="FFFFFF" w:val="clear"/>
-            <w:lang w:val="ro-RO"/>
-          </w:rPr>
-          <w:t>durata instruirii periodice</w:t>
-        </w:r>
-        <w:r>
-          <w:rPr>
-            <w:rStyle w:val="Hyperlink"/>
-            <w:rFonts w:eastAsia="Arial" w:cs="Arial" w:ascii="Arial" w:hAnsi="Arial"/>
-            <w:color w:val="auto"/>
-            <w:sz w:val="20"/>
-            <w:szCs w:val="20"/>
-            <w:u w:val="none"/>
-            <w:lang w:val="ro-RO"/>
-          </w:rPr>
-          <w:t xml:space="preserve"> va fi de </w:t>
-        </w:r>
-        <w:r>
-          <w:rPr>
-            <w:rStyle w:val="Hyperlink"/>
-            <w:rFonts w:eastAsia="Arial" w:cs="Arial" w:ascii="Arial" w:hAnsi="Arial"/>
-            <w:b/>
-            <w:color w:val="auto"/>
-            <w:sz w:val="20"/>
-            <w:szCs w:val="20"/>
-            <w:u w:val="none"/>
-            <w:lang w:val="ro-RO"/>
-          </w:rPr>
-          <w:t>{{training.periodicDuration}}</w:t>
-        </w:r>
-        <w:r>
-          <w:rPr>
-            <w:rStyle w:val="Hyperlink"/>
-            <w:rFonts w:eastAsia="Arial" w:cs="Arial" w:ascii="Arial" w:hAnsi="Arial"/>
-            <w:color w:val="auto"/>
-            <w:sz w:val="20"/>
-            <w:szCs w:val="20"/>
-            <w:u w:val="none"/>
-            <w:lang w:val="ro-RO"/>
-          </w:rPr>
-          <w:t>;</w:t>
-        </w:r>
-      </w:hyperlink>
+      <w:r>
+        <w:rPr>
+          <w:rFonts w:eastAsia="Arial" w:cs="Arial" w:ascii="Arial" w:hAnsi="Arial"/>
+          <w:color w:val="auto"/>
+          <w:sz w:val="20"/>
+          <w:szCs w:val="20"/>
+          <w:lang w:val="ro-RO"/>
+        </w:rPr>
+        <w:t xml:space="preserve">Conf. H.G. 767/ 2016, pct. 6) În cadrul {{client.legalName}}, </w:t>
+      </w:r>
+      <w:r>
+        <w:rPr>
+          <w:rStyle w:val="spar"/>
+          <w:rFonts w:eastAsia="Arial" w:cs="Arial" w:ascii="Arial" w:hAnsi="Arial"/>
+          <w:color w:val="auto"/>
+          <w:sz w:val="20"/>
+          <w:szCs w:val="20"/>
+          <w:shd w:fill="FFFFFF" w:val="clear"/>
+          <w:lang w:val="ro-RO"/>
+        </w:rPr>
+        <w:t>durata instruirii periodice</w:t>
+      </w:r>
+      <w:r>
+        <w:rPr>
+          <w:rFonts w:eastAsia="Arial" w:cs="Arial" w:ascii="Arial" w:hAnsi="Arial"/>
+          <w:color w:val="auto"/>
+          <w:sz w:val="20"/>
+          <w:szCs w:val="20"/>
+          <w:lang w:val="ro-RO"/>
+        </w:rPr>
+        <w:t xml:space="preserve"> va fi de </w:t>
+      </w:r>
+      <w:r>
+        <w:rPr>
+          <w:rFonts w:eastAsia="Arial" w:cs="Arial" w:ascii="Arial" w:hAnsi="Arial"/>
+          <w:b/>
+          <w:color w:val="auto"/>
+          <w:sz w:val="20"/>
+          <w:szCs w:val="20"/>
+          <w:lang w:val="ro-RO"/>
+        </w:rPr>
+        <w:t>{{training.periodicDuration}}</w:t>
+      </w:r>
+      <w:r>
+        <w:rPr>
+          <w:rFonts w:eastAsia="Arial" w:cs="Arial" w:ascii="Arial" w:hAnsi="Arial"/>
+          <w:color w:val="auto"/>
+          <w:sz w:val="20"/>
+          <w:szCs w:val="20"/>
+          <w:lang w:val="ro-RO"/>
+        </w:rPr>
+        <w:t>;</w:t>
+      </w:r>
     </w:p>
     <w:p>
       <w:pPr>
@@ -1220,45 +1179,58 @@
           <w:szCs w:val="20"/>
         </w:rPr>
       </w:pPr>
-      <w:hyperlink r:id="rId31">
-        <w:r>
-          <w:rPr>
-            <w:rStyle w:val="Hyperlink"/>
-            <w:rFonts w:eastAsia="Arial" w:cs="Arial" w:ascii="Arial" w:hAnsi="Arial"/>
-            <w:color w:val="auto"/>
-            <w:sz w:val="20"/>
-            <w:szCs w:val="20"/>
-            <w:u w:val="none"/>
-            <w:lang w:val="ro-RO"/>
-          </w:rPr>
-          <w:t xml:space="preserve">Având în vedere specificul activităților desfășurate în cadrul {{client.legalName}}, conform prevederilor din </w:t>
-        </w:r>
-        <w:r>
-          <w:rPr>
-            <w:rStyle w:val="Hyperlink"/>
-            <w:rFonts w:eastAsia="Arial" w:cs="Arial" w:ascii="Arial" w:hAnsi="Arial"/>
-            <w:i/>
-            <w:color w:val="auto"/>
-            <w:sz w:val="20"/>
-            <w:szCs w:val="20"/>
-            <w:u w:val="none"/>
-            <w:lang w:val="ro-RO"/>
-          </w:rPr>
-          <w:t>HG 1425/2006, Art. 96, alin (2)</w:t>
-        </w:r>
-        <w:r>
-          <w:rPr>
-            <w:rStyle w:val="Hyperlink"/>
-            <w:rFonts w:eastAsia="Arial" w:cs="Arial" w:ascii="Arial" w:hAnsi="Arial"/>
-            <w:color w:val="auto"/>
-            <w:sz w:val="20"/>
-            <w:szCs w:val="20"/>
-            <w:u w:val="none"/>
-            <w:lang w:val="ro-RO"/>
-          </w:rPr>
-          <w:t xml:space="preserve"> stabilesc următoarele intervale de timp pentru efectuarea instructajelor periodice:</w:t>
-        </w:r>
-      </w:hyperlink>
+      <w:r>
+        <w:rPr>
+          <w:rFonts w:eastAsia="Arial" w:cs="Arial" w:ascii="Arial" w:hAnsi="Arial"/>
+          <w:color w:val="auto"/>
+          <w:sz w:val="20"/>
+          <w:szCs w:val="20"/>
+          <w:lang w:val="ro-RO"/>
+        </w:rPr>
+        <w:t>Având în vedere specificul activităților desfășurate în cadrul {{cli</w:t>
+      </w:r>
+      <w:r>
+        <w:rPr>
+          <w:rStyle w:val="PageNumber"/>
+          <w:rFonts w:eastAsia="Arial" w:cs="Arial" w:ascii="Arial" w:hAnsi="Arial"/>
+          <w:color w:val="auto"/>
+          <w:sz w:val="20"/>
+          <w:szCs w:val="20"/>
+          <w:lang w:val="ro-RO"/>
+        </w:rPr>
+        <w:t>ent.legalName}}</w:t>
+      </w:r>
+      <w:r>
+        <w:rPr>
+          <w:rFonts w:eastAsia="Arial" w:cs="Arial" w:ascii="Arial" w:hAnsi="Arial"/>
+          <w:color w:val="auto"/>
+          <w:sz w:val="20"/>
+          <w:szCs w:val="20"/>
+          <w:lang w:val="ro-RO"/>
+        </w:rPr>
+        <w:t xml:space="preserve">, conform prevederilor din </w:t>
+      </w:r>
+      <w:r>
+        <w:rPr>
+          <w:rFonts w:eastAsia="Arial" w:cs="Arial" w:ascii="Arial" w:hAnsi="Arial"/>
+          <w:i/>
+          <w:color w:val="auto"/>
+          <w:sz w:val="20"/>
+          <w:szCs w:val="20"/>
+          <w:lang w:val="ro-RO"/>
+        </w:rPr>
+        <w:t>HG 1425/2006, Art. 96, alin (2)</w:t>
+      </w:r>
+      <w:r>
+        <w:rPr>
+          <w:rFonts w:eastAsia="Arial" w:cs="Arial" w:ascii="Arial" w:hAnsi="Arial"/>
+          <w:color w:val="auto"/>
+          <w:sz w:val="20"/>
+          <w:szCs w:val="20"/>
+          <w:lang w:val="ro-RO"/>
+        </w:rPr>
+        <w:t xml:space="preserve"> stabilesc următoarele intervale de timp pentru efectuarea instructajelor periodice:</w:t>
+      </w:r>
     </w:p>
     <w:p>
       <w:pPr>
@@ -1276,111 +1248,104 @@
           <w:szCs w:val="20"/>
         </w:rPr>
       </w:pPr>
-      <w:hyperlink r:id="rId32">
-        <w:r>
-          <w:rPr>
-            <w:rStyle w:val="Hyperlink"/>
-            <w:rFonts w:eastAsia="Arial" w:cs="Arial" w:ascii="Arial" w:hAnsi="Arial"/>
-            <w:color w:val="auto"/>
-            <w:sz w:val="20"/>
-            <w:szCs w:val="20"/>
-            <w:u w:val="none"/>
-            <w:lang w:val="ro-RO"/>
-          </w:rPr>
-          <w:t xml:space="preserve">personalul tehnic-administrativ și șefii de locuri de muncă, va fi instruit </w:t>
-        </w:r>
-        <w:r>
-          <w:rPr>
-            <w:rStyle w:val="Hyperlink"/>
-            <w:rFonts w:eastAsia="Arial" w:cs="Arial" w:ascii="Arial" w:hAnsi="Arial"/>
-            <w:b/>
-            <w:bCs/>
-            <w:color w:val="auto"/>
-            <w:sz w:val="20"/>
-            <w:szCs w:val="20"/>
-            <w:u w:val="none"/>
-            <w:lang w:val="ro-RO"/>
-          </w:rPr>
-          <w:t>{{training.administrativeFrequency}}</w:t>
-        </w:r>
-        <w:r>
-          <w:rPr>
-            <w:rStyle w:val="Hyperlink"/>
-            <w:rFonts w:eastAsia="Arial" w:cs="Arial" w:ascii="Arial" w:hAnsi="Arial"/>
-            <w:b/>
-            <w:color w:val="auto"/>
-            <w:sz w:val="20"/>
-            <w:szCs w:val="20"/>
-            <w:u w:val="none"/>
-            <w:lang w:val="ro-RO"/>
-          </w:rPr>
-          <w:t xml:space="preserve"> </w:t>
-        </w:r>
-        <w:r>
-          <w:rPr>
-            <w:rStyle w:val="Hyperlink"/>
-            <w:rFonts w:eastAsia="Arial" w:cs="Arial" w:ascii="Arial" w:hAnsi="Arial"/>
-            <w:color w:val="auto"/>
-            <w:sz w:val="20"/>
-            <w:szCs w:val="20"/>
-            <w:u w:val="none"/>
-            <w:lang w:val="ro-RO"/>
-          </w:rPr>
-          <w:t>respectiv în lunile</w:t>
-        </w:r>
-        <w:r>
-          <w:rPr>
-            <w:rStyle w:val="Hyperlink"/>
-            <w:rFonts w:eastAsia="Arial" w:cs="Arial" w:ascii="Arial" w:hAnsi="Arial"/>
-            <w:b/>
-            <w:color w:val="auto"/>
-            <w:sz w:val="20"/>
-            <w:szCs w:val="20"/>
-            <w:u w:val="none"/>
-            <w:lang w:val="ro-RO"/>
-          </w:rPr>
-          <w:t xml:space="preserve"> {{training</w:t>
-        </w:r>
-        <w:r>
-          <w:rPr>
-            <w:rStyle w:val="Hyperlink"/>
-            <w:rFonts w:eastAsia="Arial" w:cs="Arial" w:ascii="Arial" w:hAnsi="Arial"/>
-            <w:b/>
-            <w:bCs/>
-            <w:color w:val="auto"/>
-            <w:sz w:val="20"/>
-            <w:szCs w:val="20"/>
-            <w:u w:val="none"/>
-            <w:lang w:val="ro-RO"/>
-          </w:rPr>
-          <w:t xml:space="preserve">.administrativeMonths}}, </w:t>
-        </w:r>
-        <w:r>
-          <w:rPr>
-            <w:rStyle w:val="Hyperlink"/>
-            <w:rFonts w:eastAsia="Arial" w:cs="Arial" w:ascii="Arial" w:hAnsi="Arial"/>
-            <w:b/>
-            <w:color w:val="auto"/>
-            <w:sz w:val="20"/>
-            <w:szCs w:val="20"/>
-            <w:u w:val="none"/>
-            <w:lang w:val="ro-RO"/>
-          </w:rPr>
-          <w:t>în perioada (ziua) {{training.dayFrom}} – {{training.dayTo}} ale lunii</w:t>
-        </w:r>
-        <w:r>
-          <w:rPr>
-            <w:rStyle w:val="Hyperlink"/>
-            <w:rFonts w:eastAsia="Arial" w:cs="Arial" w:ascii="Arial" w:hAnsi="Arial"/>
-            <w:color w:val="auto"/>
-            <w:sz w:val="20"/>
-            <w:szCs w:val="20"/>
-            <w:u w:val="none"/>
-            <w:lang w:val="ro-RO"/>
-          </w:rPr>
-          <w:t>;</w:t>
-        </w:r>
-      </w:hyperlink>
+      <w:r>
+        <w:rPr>
+          <w:rFonts w:eastAsia="Arial" w:cs="Arial" w:ascii="Arial" w:hAnsi="Arial"/>
+          <w:color w:val="auto"/>
+          <w:sz w:val="20"/>
+          <w:szCs w:val="20"/>
+          <w:u w:val="single"/>
+          <w:lang w:val="ro-RO"/>
+        </w:rPr>
+        <w:t xml:space="preserve">personalul tehnic-administrativ </w:t>
+      </w:r>
+      <w:r>
+        <w:rPr>
+          <w:rFonts w:eastAsia="Arial" w:cs="Arial" w:ascii="Arial" w:hAnsi="Arial"/>
+          <w:color w:val="auto"/>
+          <w:sz w:val="20"/>
+          <w:szCs w:val="20"/>
+          <w:lang w:val="ro-RO"/>
+        </w:rPr>
+        <w:t xml:space="preserve">și șefii de locuri de muncă, va fi instruit </w:t>
+      </w:r>
+      <w:r>
+        <w:rPr>
+          <w:rFonts w:eastAsia="Arial" w:cs="Arial" w:ascii="Arial" w:hAnsi="Arial"/>
+          <w:b/>
+          <w:bCs/>
+          <w:color w:val="auto"/>
+          <w:sz w:val="20"/>
+          <w:szCs w:val="20"/>
+          <w:lang w:val="ro-RO"/>
+        </w:rPr>
+        <w:t>{{training.administrativeFrequency}}</w:t>
+      </w:r>
+      <w:r>
+        <w:rPr>
+          <w:rFonts w:eastAsia="Arial" w:cs="Arial" w:ascii="Arial" w:hAnsi="Arial"/>
+          <w:b/>
+          <w:color w:val="auto"/>
+          <w:sz w:val="20"/>
+          <w:szCs w:val="20"/>
+          <w:lang w:val="ro-RO"/>
+        </w:rPr>
+        <w:t xml:space="preserve"> </w:t>
+      </w:r>
+      <w:r>
+        <w:rPr>
+          <w:rFonts w:eastAsia="Arial" w:cs="Arial" w:ascii="Arial" w:hAnsi="Arial"/>
+          <w:color w:val="auto"/>
+          <w:sz w:val="20"/>
+          <w:szCs w:val="20"/>
+          <w:lang w:val="ro-RO"/>
+        </w:rPr>
+        <w:t>respectiv în lunile</w:t>
+      </w:r>
+      <w:r>
+        <w:rPr>
+          <w:rFonts w:eastAsia="Arial" w:cs="Arial" w:ascii="Arial" w:hAnsi="Arial"/>
+          <w:b/>
+          <w:color w:val="auto"/>
+          <w:sz w:val="20"/>
+          <w:szCs w:val="20"/>
+          <w:lang w:val="ro-RO"/>
+        </w:rPr>
+        <w:t xml:space="preserve"> {{training</w:t>
+      </w:r>
+      <w:r>
+        <w:rPr>
+          <w:rFonts w:eastAsia="Arial" w:cs="Arial" w:ascii="Arial" w:hAnsi="Arial"/>
+          <w:b/>
+          <w:bCs/>
+          <w:color w:val="auto"/>
+          <w:sz w:val="20"/>
+          <w:szCs w:val="20"/>
+          <w:lang w:val="ro-RO"/>
+        </w:rPr>
+        <w:t xml:space="preserve">.administrativeMonths}}, </w:t>
+      </w:r>
+      <w:r>
+        <w:rPr>
+          <w:rFonts w:eastAsia="Arial" w:cs="Arial" w:ascii="Arial" w:hAnsi="Arial"/>
+          <w:b/>
+          <w:color w:val="auto"/>
+          <w:sz w:val="20"/>
+          <w:szCs w:val="20"/>
+          <w:lang w:val="ro-RO"/>
+        </w:rPr>
+        <w:t>în perioada (ziua) {{training.dayFrom}} – {{training.dayTo}} ale lunii</w:t>
+      </w:r>
+      <w:r>
+        <w:rPr>
+          <w:rFonts w:eastAsia="Arial" w:cs="Arial" w:ascii="Arial" w:hAnsi="Arial"/>
+          <w:color w:val="auto"/>
+          <w:sz w:val="20"/>
+          <w:szCs w:val="20"/>
+          <w:lang w:val="ro-RO"/>
+        </w:rPr>
+        <w:t>;</w:t>
+      </w:r>
     </w:p>
     <w:p>
       <w:pPr>
@@ -1398,111 +1363,104 @@
           <w:szCs w:val="20"/>
         </w:rPr>
       </w:pPr>
-      <w:hyperlink r:id="rId33">
-        <w:r>
-          <w:rPr>
-            <w:rStyle w:val="Hyperlink"/>
-            <w:rFonts w:eastAsia="Arial" w:cs="Arial" w:ascii="Arial" w:hAnsi="Arial"/>
-            <w:color w:val="auto"/>
-            <w:sz w:val="20"/>
-            <w:szCs w:val="20"/>
-            <w:u w:val="none"/>
-            <w:lang w:val="ro-RO"/>
-          </w:rPr>
-          <w:t xml:space="preserve">personalul de execuție, va fi instruit </w:t>
-        </w:r>
-        <w:r>
-          <w:rPr>
-            <w:rStyle w:val="Hyperlink"/>
-            <w:rFonts w:eastAsia="Arial" w:cs="Arial" w:ascii="Arial" w:hAnsi="Arial"/>
-            <w:b/>
-            <w:bCs/>
-            <w:color w:val="auto"/>
-            <w:sz w:val="20"/>
-            <w:szCs w:val="20"/>
-            <w:u w:val="none"/>
-            <w:lang w:val="ro-RO"/>
-          </w:rPr>
-          <w:t>{{training.workerFrequency}}</w:t>
-        </w:r>
-        <w:r>
-          <w:rPr>
-            <w:rStyle w:val="Hyperlink"/>
-            <w:rFonts w:eastAsia="Arial" w:cs="Arial" w:ascii="Arial" w:hAnsi="Arial"/>
-            <w:b/>
-            <w:color w:val="auto"/>
-            <w:sz w:val="20"/>
-            <w:szCs w:val="20"/>
-            <w:u w:val="none"/>
-            <w:lang w:val="ro-RO"/>
-          </w:rPr>
-          <w:t xml:space="preserve"> </w:t>
-        </w:r>
-        <w:r>
-          <w:rPr>
-            <w:rStyle w:val="Hyperlink"/>
-            <w:rFonts w:eastAsia="Arial" w:cs="Arial" w:ascii="Arial" w:hAnsi="Arial"/>
-            <w:color w:val="auto"/>
-            <w:sz w:val="20"/>
-            <w:szCs w:val="20"/>
-            <w:u w:val="none"/>
-            <w:lang w:val="ro-RO"/>
-          </w:rPr>
-          <w:t>respectiv în lunile</w:t>
-        </w:r>
-        <w:r>
-          <w:rPr>
-            <w:rStyle w:val="Hyperlink"/>
-            <w:rFonts w:eastAsia="Arial" w:cs="Arial" w:ascii="Arial" w:hAnsi="Arial"/>
-            <w:b/>
-            <w:color w:val="auto"/>
-            <w:sz w:val="20"/>
-            <w:szCs w:val="20"/>
-            <w:u w:val="none"/>
-            <w:lang w:val="ro-RO"/>
-          </w:rPr>
-          <w:t xml:space="preserve"> {{training.w</w:t>
-        </w:r>
-        <w:r>
-          <w:rPr>
-            <w:rStyle w:val="Hyperlink"/>
-            <w:rFonts w:eastAsia="Arial" w:cs="Arial" w:ascii="Arial" w:hAnsi="Arial"/>
-            <w:b/>
-            <w:bCs/>
-            <w:color w:val="auto"/>
-            <w:sz w:val="20"/>
-            <w:szCs w:val="20"/>
-            <w:u w:val="none"/>
-            <w:lang w:val="ro-RO"/>
-          </w:rPr>
-          <w:t xml:space="preserve">orkerMonths}}, </w:t>
-        </w:r>
-        <w:r>
-          <w:rPr>
-            <w:rStyle w:val="Hyperlink"/>
-            <w:rFonts w:eastAsia="Arial" w:cs="Arial" w:ascii="Arial" w:hAnsi="Arial"/>
-            <w:b/>
-            <w:color w:val="auto"/>
-            <w:sz w:val="20"/>
-            <w:szCs w:val="20"/>
-            <w:u w:val="none"/>
-            <w:lang w:val="ro-RO"/>
-          </w:rPr>
-          <w:t>în perioada (ziua) {{training.dayFrom}} – {{training.dayTo}} ale lunii</w:t>
-        </w:r>
-        <w:r>
-          <w:rPr>
-            <w:rStyle w:val="Hyperlink"/>
-            <w:rFonts w:eastAsia="Arial" w:cs="Arial" w:ascii="Arial" w:hAnsi="Arial"/>
-            <w:color w:val="auto"/>
-            <w:sz w:val="20"/>
-            <w:szCs w:val="20"/>
-            <w:u w:val="none"/>
-            <w:lang w:val="ro-RO"/>
-          </w:rPr>
-          <w:t>;</w:t>
-        </w:r>
-      </w:hyperlink>
+      <w:r>
+        <w:rPr>
+          <w:rFonts w:eastAsia="Arial" w:cs="Arial" w:ascii="Arial" w:hAnsi="Arial"/>
+          <w:color w:val="auto"/>
+          <w:sz w:val="20"/>
+          <w:szCs w:val="20"/>
+          <w:u w:val="single"/>
+          <w:lang w:val="ro-RO"/>
+        </w:rPr>
+        <w:t>personalul de execuție,</w:t>
+      </w:r>
+      <w:r>
+        <w:rPr>
+          <w:rFonts w:eastAsia="Arial" w:cs="Arial" w:ascii="Arial" w:hAnsi="Arial"/>
+          <w:color w:val="auto"/>
+          <w:sz w:val="20"/>
+          <w:szCs w:val="20"/>
+          <w:lang w:val="ro-RO"/>
+        </w:rPr>
+        <w:t xml:space="preserve"> va fi instruit </w:t>
+      </w:r>
+      <w:r>
+        <w:rPr>
+          <w:rFonts w:eastAsia="Arial" w:cs="Arial" w:ascii="Arial" w:hAnsi="Arial"/>
+          <w:b/>
+          <w:bCs/>
+          <w:color w:val="auto"/>
+          <w:sz w:val="20"/>
+          <w:szCs w:val="20"/>
+          <w:lang w:val="ro-RO"/>
+        </w:rPr>
+        <w:t>{{training.workerFrequency}}</w:t>
+      </w:r>
+      <w:r>
+        <w:rPr>
+          <w:rFonts w:eastAsia="Arial" w:cs="Arial" w:ascii="Arial" w:hAnsi="Arial"/>
+          <w:b/>
+          <w:color w:val="auto"/>
+          <w:sz w:val="20"/>
+          <w:szCs w:val="20"/>
+          <w:lang w:val="ro-RO"/>
+        </w:rPr>
+        <w:t xml:space="preserve"> </w:t>
+      </w:r>
+      <w:r>
+        <w:rPr>
+          <w:rFonts w:eastAsia="Arial" w:cs="Arial" w:ascii="Arial" w:hAnsi="Arial"/>
+          <w:color w:val="auto"/>
+          <w:sz w:val="20"/>
+          <w:szCs w:val="20"/>
+          <w:lang w:val="ro-RO"/>
+        </w:rPr>
+        <w:t>respectiv în lunile</w:t>
+      </w:r>
+      <w:r>
+        <w:rPr>
+          <w:rFonts w:eastAsia="Arial" w:cs="Arial" w:ascii="Arial" w:hAnsi="Arial"/>
+          <w:b/>
+          <w:color w:val="auto"/>
+          <w:sz w:val="20"/>
+          <w:szCs w:val="20"/>
+          <w:lang w:val="ro-RO"/>
+        </w:rPr>
+        <w:t xml:space="preserve"> {{training.w</w:t>
+      </w:r>
+      <w:r>
+        <w:rPr>
+          <w:rFonts w:eastAsia="Arial" w:cs="Arial" w:ascii="Arial" w:hAnsi="Arial"/>
+          <w:b/>
+          <w:bCs/>
+          <w:color w:val="auto"/>
+          <w:sz w:val="20"/>
+          <w:szCs w:val="20"/>
+          <w:lang w:val="ro-RO"/>
+        </w:rPr>
+        <w:t xml:space="preserve">orkerMonths}}, </w:t>
+      </w:r>
+      <w:r>
+        <w:rPr>
+          <w:rFonts w:eastAsia="Arial" w:cs="Arial" w:ascii="Arial" w:hAnsi="Arial"/>
+          <w:b/>
+          <w:color w:val="auto"/>
+          <w:sz w:val="20"/>
+          <w:szCs w:val="20"/>
+          <w:lang w:val="ro-RO"/>
+        </w:rPr>
+        <w:t>în perioada (ziua) {{training.dayFrom}} – {{training.dayTo}} ale lunii</w:t>
+      </w:r>
+      <w:r>
+        <w:rPr>
+          <w:rFonts w:eastAsia="Arial" w:cs="Arial" w:ascii="Arial" w:hAnsi="Arial"/>
+          <w:color w:val="auto"/>
+          <w:sz w:val="20"/>
+          <w:szCs w:val="20"/>
+          <w:lang w:val="ro-RO"/>
+        </w:rPr>
+        <w:t>;</w:t>
+      </w:r>
     </w:p>
     <w:p>
       <w:pPr>
@@ -1521,45 +1479,50 @@
           <w:szCs w:val="20"/>
         </w:rPr>
       </w:pPr>
-      <w:hyperlink r:id="rId34">
-        <w:r>
-          <w:rPr>
-            <w:rStyle w:val="Hyperlink"/>
-            <w:rFonts w:eastAsia="Arial" w:cs="Arial" w:ascii="Arial" w:hAnsi="Arial"/>
-            <w:color w:val="auto"/>
-            <w:sz w:val="20"/>
-            <w:szCs w:val="20"/>
-            <w:u w:val="none"/>
-            <w:lang w:val="ro-RO"/>
-          </w:rPr>
-          <w:t>Instruirea</w:t>
-        </w:r>
-        <w:r>
-          <w:rPr>
-            <w:rStyle w:val="Hyperlink"/>
-            <w:rFonts w:eastAsia="Arial" w:cs="Arial" w:ascii="Arial" w:hAnsi="Arial"/>
-            <w:b/>
-            <w:color w:val="auto"/>
-            <w:sz w:val="20"/>
-            <w:szCs w:val="20"/>
-            <w:u w:val="none"/>
-            <w:lang w:val="ro-RO"/>
-          </w:rPr>
-          <w:t xml:space="preserve"> periodică se face suplimentar </w:t>
-        </w:r>
-        <w:r>
-          <w:rPr>
-            <w:rStyle w:val="Hyperlink"/>
-            <w:rFonts w:eastAsia="Arial" w:cs="Arial" w:ascii="Arial" w:hAnsi="Arial"/>
-            <w:color w:val="auto"/>
-            <w:sz w:val="20"/>
-            <w:szCs w:val="20"/>
-            <w:u w:val="none"/>
-            <w:lang w:val="ro-RO"/>
-          </w:rPr>
-          <w:t>celei programate în următoarele cazuri:</w:t>
-        </w:r>
-      </w:hyperlink>
+      <w:r>
+        <w:rPr>
+          <w:rFonts w:eastAsia="Arial" w:cs="Arial" w:ascii="Arial" w:hAnsi="Arial"/>
+          <w:color w:val="auto"/>
+          <w:sz w:val="20"/>
+          <w:szCs w:val="20"/>
+          <w:lang w:val="ro-RO"/>
+        </w:rPr>
+        <w:t>I</w:t>
+      </w:r>
+      <w:r>
+        <w:rPr>
+          <w:rStyle w:val="tpa1"/>
+          <w:rFonts w:eastAsia="Arial" w:cs="Arial" w:ascii="Arial" w:hAnsi="Arial"/>
+          <w:color w:val="auto"/>
+          <w:sz w:val="20"/>
+          <w:szCs w:val="20"/>
+          <w:lang w:val="ro-RO"/>
+        </w:rPr>
+        <w:t>nstruirea</w:t>
+      </w:r>
+      <w:r>
+        <w:rPr>
+          <w:rStyle w:val="tpa1"/>
+          <w:rFonts w:eastAsia="Arial" w:cs="Arial" w:ascii="Arial" w:hAnsi="Arial"/>
+          <w:b/>
+          <w:color w:val="auto"/>
+          <w:sz w:val="20"/>
+          <w:szCs w:val="20"/>
+          <w:lang w:val="ro-RO"/>
+        </w:rPr>
+        <w:t xml:space="preserve"> periodică se face suplimentar </w:t>
+      </w:r>
+      <w:r>
+        <w:rPr>
+          <w:rStyle w:val="tpa1"/>
+          <w:rFonts w:eastAsia="Arial" w:cs="Arial" w:ascii="Arial" w:hAnsi="Arial"/>
+          <w:color w:val="auto"/>
+          <w:sz w:val="20"/>
+          <w:szCs w:val="20"/>
+          <w:lang w:val="ro-RO"/>
+        </w:rPr>
+        <w:t>celei programate în următoarele cazuri:</w:t>
+      </w:r>
     </w:p>
     <w:p>
       <w:pPr>
@@ -1574,21 +1537,17 @@
           <w:szCs w:val="20"/>
         </w:rPr>
       </w:pPr>
-      <w:hyperlink r:id="rId35">
-        <w:r>
-          <w:rPr>
-            <w:rStyle w:val="Hyperlink"/>
-            <w:rFonts w:eastAsia="Arial" w:cs="Arial" w:ascii="Arial" w:hAnsi="Arial"/>
-            <w:i/>
-            <w:color w:val="auto"/>
-            <w:sz w:val="20"/>
-            <w:szCs w:val="20"/>
-            <w:u w:val="none"/>
-            <w:lang w:val="ro-RO"/>
-          </w:rPr>
-          <w:t>(Preluare din H.G. 1425/ 2006 – Art. 98)</w:t>
-        </w:r>
-      </w:hyperlink>
+      <w:r>
+        <w:rPr>
+          <w:rFonts w:eastAsia="Arial" w:cs="Arial" w:ascii="Arial" w:hAnsi="Arial"/>
+          <w:i/>
+          <w:color w:val="auto"/>
+          <w:sz w:val="20"/>
+          <w:szCs w:val="20"/>
+          <w:lang w:val="ro-RO"/>
+        </w:rPr>
+        <w:t>(Preluare din H.G. 1425/ 2006 – Art. 98)</w:t>
+      </w:r>
     </w:p>
     <w:p>
       <w:pPr>
@@ -1606,20 +1565,17 @@
           <w:szCs w:val="20"/>
         </w:rPr>
       </w:pPr>
-      <w:hyperlink r:id="rId36">
-        <w:r>
-          <w:rPr>
-            <w:rStyle w:val="Hyperlink"/>
-            <w:rFonts w:eastAsia="Arial" w:cs="Arial" w:ascii="Arial" w:hAnsi="Arial"/>
-            <w:color w:val="auto"/>
-            <w:sz w:val="20"/>
-            <w:szCs w:val="20"/>
-            <w:u w:val="none"/>
-            <w:lang w:val="ro-RO"/>
-          </w:rPr>
-          <w:t>când un lucrător a lipsit peste 30 de zile lucrătoare;</w:t>
-        </w:r>
-      </w:hyperlink>
+      <w:r>
+        <w:rPr>
+          <w:rStyle w:val="tli1"/>
+          <w:rFonts w:eastAsia="Arial" w:cs="Arial" w:ascii="Arial" w:hAnsi="Arial"/>
+          <w:color w:val="auto"/>
+          <w:sz w:val="20"/>
+          <w:szCs w:val="20"/>
+          <w:lang w:val="ro-RO"/>
+        </w:rPr>
+        <w:t>când un lucrător a lipsit peste 30 de zile lucrătoare;</w:t>
+      </w:r>
     </w:p>
     <w:p>
       <w:pPr>
@@ -1637,20 +1593,17 @@
           <w:szCs w:val="20"/>
         </w:rPr>
       </w:pPr>
-      <w:hyperlink r:id="rId37">
-        <w:r>
-          <w:rPr>
-            <w:rStyle w:val="Hyperlink"/>
-            <w:rFonts w:eastAsia="Arial" w:cs="Arial" w:ascii="Arial" w:hAnsi="Arial"/>
-            <w:color w:val="auto"/>
-            <w:sz w:val="20"/>
-            <w:szCs w:val="20"/>
-            <w:u w:val="none"/>
-            <w:lang w:val="ro-RO"/>
-          </w:rPr>
-          <w:t>când au apărut modificări ale prevederilor de securitate și sănătate în muncă privind activitățile specifice ale locului de muncă și/ sau postului de lucru sau ale instrucțiunilor proprii, inclusiv datorită evoluției riscurilor sau apariției de noi riscuri în unitate;</w:t>
-        </w:r>
-      </w:hyperlink>
+      <w:r>
+        <w:rPr>
+          <w:rStyle w:val="tli1"/>
+          <w:rFonts w:eastAsia="Arial" w:cs="Arial" w:ascii="Arial" w:hAnsi="Arial"/>
+          <w:color w:val="auto"/>
+          <w:sz w:val="20"/>
+          <w:szCs w:val="20"/>
+          <w:lang w:val="ro-RO"/>
+        </w:rPr>
+        <w:t>când au apărut modificări ale prevederilor de securitate și sănătate în muncă privind activitățile specifice ale locului de muncă și/ sau postului de lucru sau ale instrucțiunilor proprii, inclusiv datorită evoluției riscurilor sau apariției de noi riscuri în unitate;</w:t>
+      </w:r>
     </w:p>
     <w:p>
       <w:pPr>
@@ -1669,20 +1622,17 @@
           <w:szCs w:val="20"/>
         </w:rPr>
       </w:pPr>
-      <w:hyperlink r:id="rId38">
-        <w:r>
-          <w:rPr>
-            <w:rStyle w:val="Hyperlink"/>
-            <w:rFonts w:eastAsia="Arial" w:cs="Arial" w:ascii="Arial" w:hAnsi="Arial"/>
-            <w:color w:val="auto"/>
-            <w:sz w:val="20"/>
-            <w:szCs w:val="20"/>
-            <w:u w:val="none"/>
-            <w:lang w:val="ro-RO"/>
-          </w:rPr>
-          <w:t>la reluarea activității după accident de muncă;</w:t>
-        </w:r>
-      </w:hyperlink>
+      <w:r>
+        <w:rPr>
+          <w:rStyle w:val="tli1"/>
+          <w:rFonts w:eastAsia="Arial" w:cs="Arial" w:ascii="Arial" w:hAnsi="Arial"/>
+          <w:color w:val="auto"/>
+          <w:sz w:val="20"/>
+          <w:szCs w:val="20"/>
+          <w:lang w:val="ro-RO"/>
+        </w:rPr>
+        <w:t>la reluarea activității după accident de muncă;</w:t>
+      </w:r>
     </w:p>
     <w:p>
       <w:pPr>
@@ -1700,20 +1650,17 @@
           <w:szCs w:val="20"/>
         </w:rPr>
       </w:pPr>
-      <w:hyperlink r:id="rId39">
-        <w:r>
-          <w:rPr>
-            <w:rStyle w:val="Hyperlink"/>
-            <w:rFonts w:eastAsia="Arial" w:cs="Arial" w:ascii="Arial" w:hAnsi="Arial"/>
-            <w:color w:val="auto"/>
-            <w:sz w:val="20"/>
-            <w:szCs w:val="20"/>
-            <w:u w:val="none"/>
-            <w:lang w:val="ro-RO"/>
-          </w:rPr>
-          <w:t>la executarea unor lucrări speciale;</w:t>
-        </w:r>
-      </w:hyperlink>
+      <w:r>
+        <w:rPr>
+          <w:rStyle w:val="tli1"/>
+          <w:rFonts w:eastAsia="Arial" w:cs="Arial" w:ascii="Arial" w:hAnsi="Arial"/>
+          <w:color w:val="auto"/>
+          <w:sz w:val="20"/>
+          <w:szCs w:val="20"/>
+          <w:lang w:val="ro-RO"/>
+        </w:rPr>
+        <w:t>la executarea unor lucrări speciale;</w:t>
+      </w:r>
     </w:p>
     <w:p>
       <w:pPr>
@@ -1731,20 +1678,17 @@
           <w:szCs w:val="20"/>
         </w:rPr>
       </w:pPr>
-      <w:hyperlink r:id="rId40">
-        <w:r>
-          <w:rPr>
-            <w:rStyle w:val="Hyperlink"/>
-            <w:rFonts w:eastAsia="Arial" w:cs="Arial" w:ascii="Arial" w:hAnsi="Arial"/>
-            <w:color w:val="auto"/>
-            <w:sz w:val="20"/>
-            <w:szCs w:val="20"/>
-            <w:u w:val="none"/>
-            <w:lang w:val="ro-RO"/>
-          </w:rPr>
-          <w:t>la introducerea unui echipament de muncă sau a unor modificări ale echipamentului existent;</w:t>
-        </w:r>
-      </w:hyperlink>
+      <w:r>
+        <w:rPr>
+          <w:rStyle w:val="tli1"/>
+          <w:rFonts w:eastAsia="Arial" w:cs="Arial" w:ascii="Arial" w:hAnsi="Arial"/>
+          <w:color w:val="auto"/>
+          <w:sz w:val="20"/>
+          <w:szCs w:val="20"/>
+          <w:lang w:val="ro-RO"/>
+        </w:rPr>
+        <w:t>la introducerea unui echipament de muncă sau a unor modificări ale echipamentului existent;</w:t>
+      </w:r>
     </w:p>
     <w:p>
       <w:pPr>
@@ -1762,20 +1706,17 @@
           <w:szCs w:val="20"/>
         </w:rPr>
       </w:pPr>
-      <w:hyperlink r:id="rId41">
-        <w:r>
-          <w:rPr>
-            <w:rStyle w:val="Hyperlink"/>
-            <w:rFonts w:eastAsia="Arial" w:cs="Arial" w:ascii="Arial" w:hAnsi="Arial"/>
-            <w:color w:val="auto"/>
-            <w:sz w:val="20"/>
-            <w:szCs w:val="20"/>
-            <w:u w:val="none"/>
-            <w:lang w:val="ro-RO"/>
-          </w:rPr>
-          <w:t>la modificarea tehnologiilor existente sau procedurilor de lucru;</w:t>
-        </w:r>
-      </w:hyperlink>
+      <w:r>
+        <w:rPr>
+          <w:rStyle w:val="tli1"/>
+          <w:rFonts w:eastAsia="Arial" w:cs="Arial" w:ascii="Arial" w:hAnsi="Arial"/>
+          <w:color w:val="auto"/>
+          <w:sz w:val="20"/>
+          <w:szCs w:val="20"/>
+          <w:lang w:val="ro-RO"/>
+        </w:rPr>
+        <w:t>la modificarea tehnologiilor existente sau procedurilor de lucru;</w:t>
+      </w:r>
     </w:p>
     <w:p>
       <w:pPr>
@@ -1793,20 +1734,17 @@
           <w:szCs w:val="20"/>
         </w:rPr>
       </w:pPr>
-      <w:hyperlink r:id="rId42">
-        <w:r>
-          <w:rPr>
-            <w:rStyle w:val="Hyperlink"/>
-            <w:rFonts w:eastAsia="Arial" w:cs="Arial" w:ascii="Arial" w:hAnsi="Arial"/>
-            <w:color w:val="auto"/>
-            <w:sz w:val="20"/>
-            <w:szCs w:val="20"/>
-            <w:u w:val="none"/>
-            <w:lang w:val="ro-RO"/>
-          </w:rPr>
-          <w:t>la introducerea oricărei noi tehnologii sau a unor proceduri de lucru.</w:t>
-        </w:r>
-      </w:hyperlink>
+      <w:r>
+        <w:rPr>
+          <w:rStyle w:val="tli1"/>
+          <w:rFonts w:eastAsia="Arial" w:cs="Arial" w:ascii="Arial" w:hAnsi="Arial"/>
+          <w:color w:val="auto"/>
+          <w:sz w:val="20"/>
+          <w:szCs w:val="20"/>
+          <w:lang w:val="ro-RO"/>
+        </w:rPr>
+        <w:t>la introducerea oricărei noi tehnologii sau a unor proceduri de lucru.</w:t>
+      </w:r>
     </w:p>
     <w:p>
       <w:pPr>
@@ -1827,46 +1765,39 @@
           <w:szCs w:val="20"/>
         </w:rPr>
       </w:pPr>
-      <w:hyperlink r:id="rId43">
-        <w:r>
-          <w:rPr>
-            <w:rStyle w:val="Hyperlink"/>
-            <w:rFonts w:eastAsia="Arial" w:cs="Arial" w:ascii="Arial" w:hAnsi="Arial"/>
-            <w:i/>
-            <w:color w:val="auto"/>
-            <w:sz w:val="20"/>
-            <w:szCs w:val="20"/>
-            <w:u w:val="none"/>
-            <w:lang w:val="ro-RO"/>
-          </w:rPr>
-          <w:t>(Preluare din H.G. 1425/ 2006 – Instruirea lucrătorilor – Art. 99 – conf. H.G. 767/ 2016, pct. 6)</w:t>
-        </w:r>
-        <w:r>
-          <w:rPr>
-            <w:rStyle w:val="Hyperlink"/>
-            <w:rFonts w:eastAsia="Arial" w:cs="Arial" w:ascii="Arial" w:hAnsi="Arial"/>
-            <w:color w:val="auto"/>
-            <w:sz w:val="20"/>
-            <w:szCs w:val="20"/>
-            <w:u w:val="none"/>
-            <w:lang w:val="ro-RO"/>
-          </w:rPr>
-          <w:t xml:space="preserve"> În cadrul {{client.legalName}}, </w:t>
-        </w:r>
-        <w:r>
-          <w:rPr>
-            <w:rStyle w:val="Hyperlink"/>
-            <w:rFonts w:eastAsia="Arial" w:cs="Arial" w:ascii="Arial" w:hAnsi="Arial"/>
-            <w:color w:val="auto"/>
-            <w:sz w:val="20"/>
-            <w:szCs w:val="20"/>
-            <w:u w:val="none"/>
-            <w:shd w:fill="FFFFFF" w:val="clear"/>
-            <w:lang w:val="ro-RO"/>
-          </w:rPr>
-          <w:t>durata instruirii periodice prevăzute la art. 98 se stabilește de către angajator, împreună cu:</w:t>
-        </w:r>
-      </w:hyperlink>
+      <w:r>
+        <w:rPr>
+          <w:rFonts w:eastAsia="Arial" w:cs="Arial" w:ascii="Arial" w:hAnsi="Arial"/>
+          <w:i/>
+          <w:color w:val="auto"/>
+          <w:sz w:val="20"/>
+          <w:szCs w:val="20"/>
+          <w:lang w:val="ro-RO"/>
+        </w:rPr>
+        <w:t>(Preluare din H.G. 1425/ 2006 – Instruirea lucrătorilor – Art. 99 – conf. H.G. 767/ 2016, pct. 6)</w:t>
+      </w:r>
+      <w:r>
+        <w:rPr>
+          <w:rFonts w:eastAsia="Arial" w:cs="Arial" w:ascii="Arial" w:hAnsi="Arial"/>
+          <w:color w:val="auto"/>
+          <w:sz w:val="20"/>
+          <w:szCs w:val="20"/>
+          <w:lang w:val="ro-RO"/>
+        </w:rPr>
+        <w:t xml:space="preserve"> În cadrul {{client.legalName}}, </w:t>
+      </w:r>
+      <w:r>
+        <w:rPr>
+          <w:rStyle w:val="spar"/>
+          <w:rFonts w:eastAsia="Arial" w:cs="Arial" w:ascii="Arial" w:hAnsi="Arial"/>
+          <w:color w:val="auto"/>
+          <w:sz w:val="20"/>
+          <w:szCs w:val="20"/>
+          <w:shd w:fill="FFFFFF" w:val="clear"/>
+          <w:lang w:val="ro-RO"/>
+        </w:rPr>
+        <w:t>durata instruirii periodice prevăzute la art. 98 se stabilește de către angajator, împreună cu:</w:t>
+      </w:r>
     </w:p>
     <w:p>
       <w:pPr>
@@ -1887,21 +1818,18 @@
           <w:shd w:fill="FFFFFF" w:val="clear"/>
         </w:rPr>
       </w:pPr>
-      <w:hyperlink r:id="rId44">
-        <w:r>
-          <w:rPr>
-            <w:rStyle w:val="Hyperlink"/>
-            <w:rFonts w:eastAsia="Arial" w:cs="Arial" w:ascii="Arial" w:hAnsi="Arial"/>
-            <w:color w:val="auto"/>
-            <w:sz w:val="20"/>
-            <w:szCs w:val="20"/>
-            <w:u w:val="none"/>
-            <w:shd w:fill="FFFFFF" w:val="clear"/>
-            <w:lang w:val="ro-RO"/>
-          </w:rPr>
-          <w:t>conducătorul locului de muncă respectiv, sau</w:t>
-        </w:r>
-      </w:hyperlink>
+      <w:r>
+        <w:rPr>
+          <w:rStyle w:val="slitbdy"/>
+          <w:rFonts w:eastAsia="Arial" w:cs="Arial" w:ascii="Arial" w:hAnsi="Arial"/>
+          <w:color w:val="auto"/>
+          <w:sz w:val="20"/>
+          <w:szCs w:val="20"/>
+          <w:shd w:fill="FFFFFF" w:val="clear"/>
+          <w:lang w:val="ro-RO"/>
+        </w:rPr>
+        <w:t>conducătorul locului de muncă respectiv, sau</w:t>
+      </w:r>
     </w:p>
     <w:p>
       <w:pPr>
@@ -1922,21 +1850,18 @@
           <w:shd w:fill="FFFFFF" w:val="clear"/>
         </w:rPr>
       </w:pPr>
-      <w:hyperlink r:id="rId45">
-        <w:r>
-          <w:rPr>
-            <w:rStyle w:val="Hyperlink"/>
-            <w:rFonts w:eastAsia="Arial" w:cs="Arial" w:ascii="Arial" w:hAnsi="Arial"/>
-            <w:color w:val="auto"/>
-            <w:sz w:val="20"/>
-            <w:szCs w:val="20"/>
-            <w:u w:val="none"/>
-            <w:shd w:fill="FFFFFF" w:val="clear"/>
-            <w:lang w:val="ro-RO"/>
-          </w:rPr>
-          <w:t>lucrătorul desemnat, sau</w:t>
-        </w:r>
-      </w:hyperlink>
+      <w:r>
+        <w:rPr>
+          <w:rStyle w:val="slitbdy"/>
+          <w:rFonts w:eastAsia="Arial" w:cs="Arial" w:ascii="Arial" w:hAnsi="Arial"/>
+          <w:color w:val="auto"/>
+          <w:sz w:val="20"/>
+          <w:szCs w:val="20"/>
+          <w:shd w:fill="FFFFFF" w:val="clear"/>
+          <w:lang w:val="ro-RO"/>
+        </w:rPr>
+        <w:t>lucrătorul desemnat, sau</w:t>
+      </w:r>
     </w:p>
     <w:p>
       <w:pPr>
@@ -1957,21 +1882,18 @@
           <w:shd w:fill="FFFFFF" w:val="clear"/>
         </w:rPr>
       </w:pPr>
-      <w:hyperlink r:id="rId46">
-        <w:r>
-          <w:rPr>
-            <w:rStyle w:val="Hyperlink"/>
-            <w:rFonts w:eastAsia="Arial" w:cs="Arial" w:ascii="Arial" w:hAnsi="Arial"/>
-            <w:color w:val="auto"/>
-            <w:sz w:val="20"/>
-            <w:szCs w:val="20"/>
-            <w:u w:val="none"/>
-            <w:shd w:fill="FFFFFF" w:val="clear"/>
-            <w:lang w:val="ro-RO"/>
-          </w:rPr>
-          <w:t>serviciul intern de prevenire și protecție, sau</w:t>
-        </w:r>
-      </w:hyperlink>
+      <w:r>
+        <w:rPr>
+          <w:rStyle w:val="slitbdy"/>
+          <w:rFonts w:eastAsia="Arial" w:cs="Arial" w:ascii="Arial" w:hAnsi="Arial"/>
+          <w:color w:val="auto"/>
+          <w:sz w:val="20"/>
+          <w:szCs w:val="20"/>
+          <w:shd w:fill="FFFFFF" w:val="clear"/>
+          <w:lang w:val="ro-RO"/>
+        </w:rPr>
+        <w:t>serviciul intern de prevenire și protecție, sau</w:t>
+      </w:r>
     </w:p>
     <w:p>
       <w:pPr>
@@ -1992,21 +1914,18 @@
           <w:shd w:fill="FFFFFF" w:val="clear"/>
         </w:rPr>
       </w:pPr>
-      <w:hyperlink r:id="rId47">
-        <w:r>
-          <w:rPr>
-            <w:rStyle w:val="Hyperlink"/>
-            <w:rFonts w:eastAsia="Arial" w:cs="Arial" w:ascii="Arial" w:hAnsi="Arial"/>
-            <w:color w:val="auto"/>
-            <w:sz w:val="20"/>
-            <w:szCs w:val="20"/>
-            <w:u w:val="none"/>
-            <w:shd w:fill="FFFFFF" w:val="clear"/>
-            <w:lang w:val="ro-RO"/>
-          </w:rPr>
-          <w:t>serviciul extern de prevenire și protecție.</w:t>
-        </w:r>
-      </w:hyperlink>
+      <w:r>
+        <w:rPr>
+          <w:rStyle w:val="slitbdy"/>
+          <w:rFonts w:eastAsia="Arial" w:cs="Arial" w:ascii="Arial" w:hAnsi="Arial"/>
+          <w:color w:val="auto"/>
+          <w:sz w:val="20"/>
+          <w:szCs w:val="20"/>
+          <w:shd w:fill="FFFFFF" w:val="clear"/>
+          <w:lang w:val="ro-RO"/>
+        </w:rPr>
+        <w:t>serviciul extern de prevenire și protecție.</w:t>
+      </w:r>
     </w:p>
     <w:p>
       <w:pPr>
@@ -2027,45 +1946,37 @@
           <w:shd w:fill="FFFFFF" w:val="clear"/>
         </w:rPr>
       </w:pPr>
-      <w:hyperlink r:id="rId48">
-        <w:r>
-          <w:rPr>
-            <w:rStyle w:val="Hyperlink"/>
-            <w:rFonts w:eastAsia="Arial" w:cs="Arial" w:ascii="Arial" w:hAnsi="Arial"/>
-            <w:color w:val="auto"/>
-            <w:sz w:val="20"/>
-            <w:szCs w:val="20"/>
-            <w:u w:val="none"/>
-            <w:lang w:val="ro-RO"/>
-          </w:rPr>
-          <w:t xml:space="preserve">Durata instruirii suplimentare va fi de </w:t>
-        </w:r>
-        <w:r>
-          <w:rPr>
-            <w:rStyle w:val="Hyperlink"/>
-            <w:rFonts w:eastAsia="Arial" w:cs="Arial" w:ascii="Arial" w:hAnsi="Arial"/>
-            <w:b/>
-            <w:color w:val="auto"/>
-            <w:sz w:val="20"/>
-            <w:szCs w:val="20"/>
-            <w:u w:val="none"/>
-            <w:lang w:val="ro-RO"/>
-          </w:rPr>
-          <w:t>4 ore</w:t>
-        </w:r>
-        <w:r>
-          <w:rPr>
-            <w:rStyle w:val="Hyperlink"/>
-            <w:rFonts w:eastAsia="Arial" w:cs="Arial" w:ascii="Arial" w:hAnsi="Arial"/>
-            <w:color w:val="auto"/>
-            <w:sz w:val="20"/>
-            <w:szCs w:val="20"/>
-            <w:u w:val="none"/>
-            <w:lang w:val="ro-RO"/>
-          </w:rPr>
-          <w:t>;</w:t>
-        </w:r>
-      </w:hyperlink>
+      <w:r>
+        <w:rPr>
+          <w:rFonts w:eastAsia="Arial" w:cs="Arial" w:ascii="Arial" w:hAnsi="Arial"/>
+          <w:color w:val="auto"/>
+          <w:sz w:val="20"/>
+          <w:szCs w:val="20"/>
+          <w:lang w:val="ro-RO"/>
+        </w:rPr>
+        <w:t xml:space="preserve">Durata instruirii suplimentare va fi de </w:t>
+      </w:r>
+      <w:r>
+        <w:rPr>
+          <w:rFonts w:eastAsia="Arial" w:cs="Arial" w:ascii="Arial" w:hAnsi="Arial"/>
+          <w:b/>
+          <w:color w:val="auto"/>
+          <w:sz w:val="20"/>
+          <w:szCs w:val="20"/>
+          <w:lang w:val="ro-RO"/>
+        </w:rPr>
+        <w:t>4 ore</w:t>
+      </w:r>
+      <w:r>
+        <w:rPr>
+          <w:rFonts w:eastAsia="Arial" w:cs="Arial" w:ascii="Arial" w:hAnsi="Arial"/>
+          <w:color w:val="auto"/>
+          <w:sz w:val="20"/>
+          <w:szCs w:val="20"/>
+          <w:lang w:val="ro-RO"/>
+        </w:rPr>
+        <w:t>;</w:t>
+      </w:r>
     </w:p>
     <w:p>
       <w:pPr>
@@ -2085,33 +1996,60 @@
           <w:szCs w:val="20"/>
         </w:rPr>
       </w:pPr>
-      <w:hyperlink r:id="rId49">
-        <w:r>
-          <w:rPr>
-            <w:rStyle w:val="Hyperlink"/>
-            <w:rFonts w:eastAsia="Arial" w:cs="Arial" w:ascii="Arial" w:hAnsi="Arial"/>
-            <w:i/>
-            <w:color w:val="auto"/>
-            <w:sz w:val="20"/>
-            <w:szCs w:val="20"/>
-            <w:u w:val="none"/>
-            <w:lang w:val="ro-RO"/>
-          </w:rPr>
-          <w:t>(Preluare din H.G. 1425/ 2006 –Art. 100)</w:t>
-        </w:r>
-        <w:r>
-          <w:rPr>
-            <w:rStyle w:val="Hyperlink"/>
-            <w:rFonts w:eastAsia="Arial" w:cs="Arial" w:ascii="Arial" w:hAnsi="Arial"/>
-            <w:color w:val="auto"/>
-            <w:sz w:val="20"/>
-            <w:szCs w:val="20"/>
-            <w:u w:val="none"/>
-            <w:lang w:val="ro-RO"/>
-          </w:rPr>
-          <w:t xml:space="preserve"> În cadrul {{client.legalName}}, instruirea periodică suplimentară se va efectua pe baza tematicilor întocmite de către serviciul extern de prevenire și protecție – {{provider.legalName}} și aprobate de către angajator care vor fi păstrate la persoana care efectuează instruirea. Instruirea suplimentară va cuprinde atât tematica de la instruirea introductiv-generală cât și tematica de la instruirea de la locul de muncă.</w:t>
-        </w:r>
-      </w:hyperlink>
+      <w:r>
+        <w:rPr>
+          <w:rFonts w:eastAsia="Arial" w:cs="Arial" w:ascii="Arial" w:hAnsi="Arial"/>
+          <w:i/>
+          <w:color w:val="auto"/>
+          <w:sz w:val="20"/>
+          <w:szCs w:val="20"/>
+          <w:lang w:val="ro-RO"/>
+        </w:rPr>
+        <w:t>(Preluare din H.G. 1425/ 2006 –Art. 100)</w:t>
+      </w:r>
+      <w:r>
+        <w:rPr>
+          <w:rFonts w:eastAsia="Arial" w:cs="Arial" w:ascii="Arial" w:hAnsi="Arial"/>
+          <w:color w:val="auto"/>
+          <w:sz w:val="20"/>
+          <w:szCs w:val="20"/>
+          <w:lang w:val="ro-RO"/>
+        </w:rPr>
+        <w:t xml:space="preserve"> În cadrul {{client.legalName}}, i</w:t>
+      </w:r>
+      <w:r>
+        <w:rPr>
+          <w:rStyle w:val="tpa1"/>
+          <w:rFonts w:eastAsia="Arial" w:cs="Arial" w:ascii="Arial" w:hAnsi="Arial"/>
+          <w:color w:val="auto"/>
+          <w:sz w:val="20"/>
+          <w:szCs w:val="20"/>
+          <w:lang w:val="ro-RO"/>
+        </w:rPr>
+        <w:t xml:space="preserve">nstruirea periodică suplimentară se va efectua pe baza tematicilor </w:t>
+      </w:r>
+      <w:r>
+        <w:rPr>
+          <w:rStyle w:val="tal1"/>
+          <w:rFonts w:eastAsia="Arial" w:cs="Arial" w:ascii="Arial" w:hAnsi="Arial"/>
+          <w:color w:val="auto"/>
+          <w:sz w:val="20"/>
+          <w:szCs w:val="20"/>
+          <w:lang w:val="ro-RO"/>
+        </w:rPr>
+        <w:t>întocmite de către serviciul extern de prevenire și protecție – {{provider.legalName}} și aprobate de către angajator</w:t>
+      </w:r>
+      <w:r>
+        <w:rPr>
+          <w:rStyle w:val="tpa1"/>
+          <w:rFonts w:eastAsia="Arial" w:cs="Arial" w:ascii="Arial" w:hAnsi="Arial"/>
+          <w:color w:val="auto"/>
+          <w:sz w:val="20"/>
+          <w:szCs w:val="20"/>
+          <w:lang w:val="ro-RO"/>
+        </w:rPr>
+        <w:t xml:space="preserve"> care vor fi păstrate la persoana care efectuează instruirea. Instruirea suplimentară va cuprinde atât tematica de la instruirea introductiv-generală cât și tematica de la instruirea de la locul de muncă.</w:t>
+      </w:r>
     </w:p>
     <w:p>
       <w:pPr>
@@ -2129,20 +2067,48 @@
           <w:szCs w:val="20"/>
         </w:rPr>
       </w:pPr>
-      <w:hyperlink r:id="rId50">
-        <w:r>
-          <w:rPr>
-            <w:rStyle w:val="Hyperlink"/>
-            <w:rFonts w:eastAsia="Arial" w:cs="Arial" w:ascii="Arial" w:hAnsi="Arial"/>
-            <w:color w:val="auto"/>
-            <w:sz w:val="20"/>
-            <w:szCs w:val="20"/>
-            <w:u w:val="none"/>
-            <w:lang w:val="ro-RO"/>
-          </w:rPr>
-          <w:t>Verificarea cunoștințelor angajaților din cadrul {{client.legalName}}, se va face pe bază de teste, de către serviciul extern de prevenire și protecție prin specialiștii în domeniul securității și sănătății în muncă din cadrul {{provider.legalName}}</w:t>
-        </w:r>
-      </w:hyperlink>
+      <w:r>
+        <w:rPr>
+          <w:rFonts w:eastAsia="Arial" w:cs="Arial" w:ascii="Arial" w:hAnsi="Arial"/>
+          <w:color w:val="auto"/>
+          <w:sz w:val="20"/>
+          <w:szCs w:val="20"/>
+          <w:lang w:val="ro-RO"/>
+        </w:rPr>
+        <w:t>Verificarea cunoștințelor angajaților din cadrul {{cli</w:t>
+      </w:r>
+      <w:r>
+        <w:rPr>
+          <w:rStyle w:val="PageNumber"/>
+          <w:rFonts w:eastAsia="Arial" w:cs="Arial" w:ascii="Arial" w:hAnsi="Arial"/>
+          <w:color w:val="auto"/>
+          <w:sz w:val="20"/>
+          <w:szCs w:val="20"/>
+          <w:lang w:val="ro-RO"/>
+        </w:rPr>
+        <w:t>ent.legalName}}</w:t>
+      </w:r>
+      <w:r>
+        <w:rPr>
+          <w:rFonts w:eastAsia="Arial" w:cs="Arial" w:ascii="Arial" w:hAnsi="Arial"/>
+          <w:color w:val="auto"/>
+          <w:sz w:val="20"/>
+          <w:szCs w:val="20"/>
+          <w:lang w:val="ro-RO"/>
+        </w:rPr>
+        <w:t>, se va face pe bază de teste, de către serviciul extern de prevenire și protecție prin specialiștii în domeniul securității și sănătății în muncă din cadrul {{pro</w:t>
+      </w:r>
+      <w:r>
+        <w:rPr>
+          <w:rStyle w:val="PageNumber"/>
+          <w:rFonts w:eastAsia="Arial" w:cs="Arial" w:ascii="Arial" w:hAnsi="Arial"/>
+          <w:color w:val="auto"/>
+          <w:sz w:val="20"/>
+          <w:szCs w:val="20"/>
+          <w:lang w:val="ro-RO"/>
+        </w:rPr>
+        <w:t>vider.legalName}}</w:t>
+      </w:r>
     </w:p>
     <w:p>
       <w:pPr>
@@ -2161,20 +2127,48 @@
           <w:szCs w:val="20"/>
         </w:rPr>
       </w:pPr>
-      <w:hyperlink r:id="rId51">
-        <w:r>
-          <w:rPr>
-            <w:rStyle w:val="Hyperlink"/>
-            <w:rFonts w:eastAsia="Arial" w:cs="Arial" w:ascii="Arial" w:hAnsi="Arial"/>
-            <w:color w:val="auto"/>
-            <w:sz w:val="20"/>
-            <w:szCs w:val="20"/>
-            <w:u w:val="none"/>
-            <w:lang w:val="ro-RO"/>
-          </w:rPr>
-          <w:t>Verificarea efectuării instruirii periodice, însușirea cunoștințelor și modul de respectare a prevederilor legislative, regulilor, instrucțiunilor, deciziilor în cadrul {{client.legalName}} se va face selectiv și/ sau cumulat de către angajator, având parte de consultanță prin specialiștii în domeniul securității și sănătății în muncă din cadrul {{provider.legalName}}</w:t>
-        </w:r>
-      </w:hyperlink>
+      <w:r>
+        <w:rPr>
+          <w:rFonts w:eastAsia="Arial" w:cs="Arial" w:ascii="Arial" w:hAnsi="Arial"/>
+          <w:color w:val="auto"/>
+          <w:sz w:val="20"/>
+          <w:szCs w:val="20"/>
+          <w:lang w:val="ro-RO"/>
+        </w:rPr>
+        <w:t>Verificarea efectuării instruirii periodice, însușirea cunoștințelor și modul de respectare a prevederilor legislative, regulilor, instrucțiunilor, deciziilor în cadrul {{cli</w:t>
+      </w:r>
+      <w:r>
+        <w:rPr>
+          <w:rStyle w:val="PageNumber"/>
+          <w:rFonts w:eastAsia="Arial" w:cs="Arial" w:ascii="Arial" w:hAnsi="Arial"/>
+          <w:color w:val="auto"/>
+          <w:sz w:val="20"/>
+          <w:szCs w:val="20"/>
+          <w:lang w:val="ro-RO"/>
+        </w:rPr>
+        <w:t>ent.legalName}}</w:t>
+      </w:r>
+      <w:r>
+        <w:rPr>
+          <w:rFonts w:eastAsia="Arial" w:cs="Arial" w:ascii="Arial" w:hAnsi="Arial"/>
+          <w:color w:val="auto"/>
+          <w:sz w:val="20"/>
+          <w:szCs w:val="20"/>
+          <w:lang w:val="ro-RO"/>
+        </w:rPr>
+        <w:t xml:space="preserve"> se va face selectiv și/ sau cumulat de către angajator, având parte de consultanță prin specialiștii în domeniul securității și sănătății în muncă din cadrul {{pro</w:t>
+      </w:r>
+      <w:r>
+        <w:rPr>
+          <w:rStyle w:val="PageNumber"/>
+          <w:rFonts w:eastAsia="Arial" w:cs="Arial" w:ascii="Arial" w:hAnsi="Arial"/>
+          <w:color w:val="auto"/>
+          <w:sz w:val="20"/>
+          <w:szCs w:val="20"/>
+          <w:lang w:val="ro-RO"/>
+        </w:rPr>
+        <w:t>vider.legalName}}</w:t>
+      </w:r>
     </w:p>
     <w:p>
       <w:pPr>
@@ -2192,45 +2186,37 @@
           <w:szCs w:val="20"/>
         </w:rPr>
       </w:pPr>
-      <w:hyperlink r:id="rId52">
-        <w:r>
-          <w:rPr>
-            <w:rStyle w:val="Hyperlink"/>
-            <w:rFonts w:eastAsia="Arial" w:cs="Arial" w:ascii="Arial" w:hAnsi="Arial"/>
-            <w:color w:val="auto"/>
-            <w:sz w:val="20"/>
-            <w:szCs w:val="20"/>
-            <w:u w:val="none"/>
-            <w:lang w:val="ro-RO"/>
-          </w:rPr>
-          <w:t>În cazul în care persoanele numite pe funcții cu atribuții în domeniul securității și sănătății în muncă (șefi de loc de muncă menționați mai sus), se schimbă, noii angajați vor lua la cunoștință despre prezenta decizie prin semnarea</w:t>
-        </w:r>
-        <w:r>
-          <w:rPr>
-            <w:rStyle w:val="Hyperlink"/>
-            <w:rFonts w:eastAsia="Arial" w:cs="Arial" w:ascii="Arial" w:hAnsi="Arial"/>
-            <w:b/>
-            <w:color w:val="auto"/>
-            <w:sz w:val="20"/>
-            <w:szCs w:val="20"/>
-            <w:u w:val="none"/>
-            <w:lang w:val="ro-RO"/>
-          </w:rPr>
-          <w:t xml:space="preserve"> </w:t>
-        </w:r>
-        <w:r>
-          <w:rPr>
-            <w:rStyle w:val="Hyperlink"/>
-            <w:rFonts w:eastAsia="Arial" w:cs="Arial" w:ascii="Arial" w:hAnsi="Arial"/>
-            <w:color w:val="auto"/>
-            <w:sz w:val="20"/>
-            <w:szCs w:val="20"/>
-            <w:u w:val="none"/>
-            <w:lang w:val="ro-RO"/>
-          </w:rPr>
-          <w:t>procesului verbal de luare la cunoștință și de primire a unui exemplar al prezentei decizii.</w:t>
-        </w:r>
-      </w:hyperlink>
+      <w:r>
+        <w:rPr>
+          <w:rFonts w:eastAsia="Arial" w:cs="Arial" w:ascii="Arial" w:hAnsi="Arial"/>
+          <w:color w:val="auto"/>
+          <w:sz w:val="20"/>
+          <w:szCs w:val="20"/>
+          <w:lang w:val="ro-RO"/>
+        </w:rPr>
+        <w:t>În cazul în care persoanele numite pe funcții cu atribuții în domeniul securității și sănătății în muncă (șefi de loc de muncă menționați mai sus), se schimbă, noii angajați vor lua la cunoștință despre prezenta decizie prin semnarea</w:t>
+      </w:r>
+      <w:r>
+        <w:rPr>
+          <w:rFonts w:eastAsia="Arial" w:cs="Arial" w:ascii="Arial" w:hAnsi="Arial"/>
+          <w:b/>
+          <w:color w:val="auto"/>
+          <w:sz w:val="20"/>
+          <w:szCs w:val="20"/>
+          <w:lang w:val="ro-RO"/>
+        </w:rPr>
+        <w:t xml:space="preserve"> </w:t>
+      </w:r>
+      <w:r>
+        <w:rPr>
+          <w:rFonts w:eastAsia="Arial" w:cs="Arial" w:ascii="Arial" w:hAnsi="Arial"/>
+          <w:color w:val="auto"/>
+          <w:sz w:val="20"/>
+          <w:szCs w:val="20"/>
+          <w:lang w:val="ro-RO"/>
+        </w:rPr>
+        <w:t>procesului verbal de luare la cunoștință și de primire a unui exemplar al prezentei decizii.</w:t>
+      </w:r>
     </w:p>
     <w:p>
       <w:pPr>
@@ -2248,20 +2234,16 @@
           <w:szCs w:val="20"/>
         </w:rPr>
       </w:pPr>
-      <w:hyperlink r:id="rId53">
-        <w:r>
-          <w:rPr>
-            <w:rStyle w:val="Hyperlink"/>
-            <w:rFonts w:eastAsia="Arial" w:cs="Arial" w:ascii="Arial" w:hAnsi="Arial"/>
-            <w:color w:val="auto"/>
-            <w:sz w:val="20"/>
-            <w:szCs w:val="20"/>
-            <w:u w:val="none"/>
-            <w:lang w:val="ro-RO"/>
-          </w:rPr>
-          <w:t>Prezența salariaților la instructaj este obligatorie și va fi asigurată de conducerea societății și/ sau de șeful locului de muncă (după caz).</w:t>
-        </w:r>
-      </w:hyperlink>
+      <w:r>
+        <w:rPr>
+          <w:rFonts w:eastAsia="Arial" w:cs="Arial" w:ascii="Arial" w:hAnsi="Arial"/>
+          <w:color w:val="auto"/>
+          <w:sz w:val="20"/>
+          <w:szCs w:val="20"/>
+          <w:lang w:val="ro-RO"/>
+        </w:rPr>
+        <w:t>Prezența salariaților la instructaj este obligatorie și va fi asigurată de conducerea societății și/ sau de șeful locului de muncă (după caz).</w:t>
+      </w:r>
     </w:p>
     <w:p>
       <w:pPr>
@@ -2279,20 +2261,16 @@
           <w:szCs w:val="20"/>
         </w:rPr>
       </w:pPr>
-      <w:hyperlink r:id="rId54">
-        <w:r>
-          <w:rPr>
-            <w:rStyle w:val="Hyperlink"/>
-            <w:rFonts w:eastAsia="Arial" w:cs="Arial" w:ascii="Arial" w:hAnsi="Arial"/>
-            <w:color w:val="auto"/>
-            <w:sz w:val="20"/>
-            <w:szCs w:val="20"/>
-            <w:u w:val="none"/>
-            <w:lang w:val="ro-RO"/>
-          </w:rPr>
-          <w:t>Prezenta decizie anulează orice decizie anterioară cu privire la persoanele responsabile cu efectuarea instruirilor în domeniul securității și sănătății în muncă.</w:t>
-        </w:r>
-      </w:hyperlink>
+      <w:r>
+        <w:rPr>
+          <w:rFonts w:eastAsia="Arial" w:cs="Arial" w:ascii="Arial" w:hAnsi="Arial"/>
+          <w:color w:val="auto"/>
+          <w:sz w:val="20"/>
+          <w:szCs w:val="20"/>
+          <w:lang w:val="ro-RO"/>
+        </w:rPr>
+        <w:t>Prezenta decizie anulează orice decizie anterioară cu privire la persoanele responsabile cu efectuarea instruirilor în domeniul securității și sănătății în muncă.</w:t>
+      </w:r>
     </w:p>
     <w:p>
       <w:pPr>
@@ -2310,20 +2288,37 @@
           <w:szCs w:val="20"/>
         </w:rPr>
       </w:pPr>
-      <w:hyperlink r:id="rId55">
-        <w:r>
-          <w:rPr>
-            <w:rStyle w:val="Hyperlink"/>
-            <w:rFonts w:eastAsia="Arial" w:cs="Arial" w:ascii="Arial" w:hAnsi="Arial"/>
-            <w:color w:val="auto"/>
-            <w:sz w:val="20"/>
-            <w:szCs w:val="20"/>
-            <w:u w:val="none"/>
-            <w:lang w:val="ro-RO"/>
-          </w:rPr>
-          <w:t>Prezenta decizie se comunică persoanelor desemnate și tuturor celor cu sarcini în domeniul securității și sănătății în muncă din cadrul {{client.legalName}}.</w:t>
-        </w:r>
-      </w:hyperlink>
+      <w:r>
+        <w:rPr>
+          <w:rFonts w:eastAsia="Arial" w:cs="Arial" w:ascii="Arial" w:hAnsi="Arial"/>
+          <w:color w:val="auto"/>
+          <w:sz w:val="20"/>
+          <w:szCs w:val="20"/>
+          <w:lang w:val="ro-RO"/>
+        </w:rPr>
+        <w:t>Prezenta decizie se comunică persoanelor desemnate și tuturor celor cu sarcini în domeniul securității și sănătății în muncă din cadrul {{cli</w:t>
+      </w:r>
+      <w:r>
+        <w:rPr>
+          <w:rStyle w:val="PageNumber"/>
+          <w:rFonts w:eastAsia="Arial" w:cs="Arial" w:ascii="Arial" w:hAnsi="Arial"/>
+          <w:color w:val="auto"/>
+          <w:sz w:val="20"/>
+          <w:szCs w:val="20"/>
+          <w:lang w:val="ro-RO"/>
+        </w:rPr>
+        <w:t>ent.legalName}}</w:t>
+      </w:r>
+      <w:r>
+        <w:rPr>
+          <w:rFonts w:eastAsia="Arial" w:cs="Arial" w:ascii="Arial" w:hAnsi="Arial"/>
+          <w:color w:val="auto"/>
+          <w:sz w:val="20"/>
+          <w:szCs w:val="20"/>
+          <w:lang w:val="ro-RO"/>
+        </w:rPr>
+        <w:t>.</w:t>
+      </w:r>
     </w:p>
     <w:p>
       <w:pPr>
@@ -2340,21 +2335,29 @@
           <w:szCs w:val="20"/>
         </w:rPr>
       </w:pPr>
-      <w:hyperlink r:id="rId56">
-        <w:r>
-          <w:rPr>
-            <w:rStyle w:val="Hyperlink"/>
-            <w:rFonts w:eastAsia="Arial" w:cs="Arial" w:ascii="Arial" w:hAnsi="Arial"/>
-            <w:b/>
-            <w:color w:val="auto"/>
-            <w:sz w:val="20"/>
-            <w:szCs w:val="20"/>
-            <w:u w:val="none"/>
-            <w:lang w:val="ro-RO"/>
-          </w:rPr>
-          <w:t>{{client.legalName}}</w:t>
-        </w:r>
-      </w:hyperlink>
+      <w:r>
+        <w:rPr>
+          <w:rFonts w:eastAsia="Arial" w:cs="Arial" w:ascii="Arial" w:hAnsi="Arial"/>
+          <w:b/>
+          <w:color w:val="auto"/>
+          <w:sz w:val="20"/>
+          <w:szCs w:val="20"/>
+          <w:lang w:val="ro-RO"/>
+        </w:rPr>
+        <w:t>{{cli</w:t>
+      </w:r>
+      <w:r>
+        <w:rPr>
+          <w:rStyle w:val="PageNumber"/>
+          <w:rFonts w:eastAsia="Arial" w:cs="Arial" w:ascii="Arial" w:hAnsi="Arial"/>
+          <w:b/>
+          <w:color w:val="auto"/>
+          <w:sz w:val="20"/>
+          <w:szCs w:val="20"/>
+          <w:lang w:val="ro-RO"/>
+        </w:rPr>
+        <w:t>ent.legalName}}</w:t>
+      </w:r>
     </w:p>
     <w:p>
       <w:pPr>
@@ -2370,20 +2373,16 @@
           <w:szCs w:val="20"/>
         </w:rPr>
       </w:pPr>
-      <w:hyperlink r:id="rId57">
-        <w:r>
-          <w:rPr>
-            <w:rStyle w:val="Hyperlink"/>
-            <w:rFonts w:eastAsia="Arial" w:cs="Arial" w:ascii="Arial" w:hAnsi="Arial"/>
-            <w:color w:val="auto"/>
-            <w:sz w:val="20"/>
-            <w:szCs w:val="20"/>
-            <w:u w:val="none"/>
-            <w:lang w:val="ro-RO"/>
-          </w:rPr>
-          <w:t>{{client.representativeRole}}</w:t>
-        </w:r>
-      </w:hyperlink>
+      <w:r>
+        <w:rPr>
+          <w:rFonts w:eastAsia="Arial" w:cs="Arial" w:ascii="Arial" w:hAnsi="Arial"/>
+          <w:color w:val="auto"/>
+          <w:sz w:val="20"/>
+          <w:szCs w:val="20"/>
+          <w:lang w:val="ro-RO"/>
+        </w:rPr>
+        <w:t>{{client.representativeRole}}</w:t>
+      </w:r>
     </w:p>
     <w:p>
       <w:pPr>
@@ -2400,21 +2399,17 @@
           <w:szCs w:val="20"/>
         </w:rPr>
       </w:pPr>
-      <w:hyperlink r:id="rId58">
-        <w:r>
-          <w:rPr>
-            <w:rStyle w:val="Hyperlink"/>
-            <w:rFonts w:eastAsia="Arial" w:cs="Arial" w:ascii="Arial" w:hAnsi="Arial"/>
-            <w:b/>
-            <w:color w:val="auto"/>
-            <w:sz w:val="20"/>
-            <w:szCs w:val="20"/>
-            <w:u w:val="none"/>
-            <w:lang w:val="ro-RO"/>
-          </w:rPr>
-          <w:t>{{client.representativeName}}</w:t>
-        </w:r>
-      </w:hyperlink>
+      <w:r>
+        <w:rPr>
+          <w:rFonts w:eastAsia="Arial" w:cs="Arial" w:ascii="Arial" w:hAnsi="Arial"/>
+          <w:b/>
+          <w:color w:val="auto"/>
+          <w:sz w:val="20"/>
+          <w:szCs w:val="20"/>
+          <w:lang w:val="ro-RO"/>
+        </w:rPr>
+        <w:t>{{client.representativeName}}</w:t>
+      </w:r>
     </w:p>
     <w:p>
       <w:pPr>
@@ -2432,21 +2427,17 @@
           <w:lang w:val="fr-FR"/>
         </w:rPr>
       </w:pPr>
-      <w:hyperlink r:id="rId59">
-        <w:r>
-          <w:rPr>
-            <w:rStyle w:val="Hyperlink"/>
-            <w:rFonts w:eastAsia="Arial" w:cs="Arial" w:ascii="Arial" w:hAnsi="Arial"/>
-            <w:b/>
-            <w:color w:val="auto"/>
-            <w:sz w:val="20"/>
-            <w:szCs w:val="20"/>
-            <w:u w:val="none"/>
-            <w:lang w:val="ro-RO"/>
-          </w:rPr>
-          <w:t>PROCES VERBAL DE LUARE LA CUNOȘTINȚĂ</w:t>
-        </w:r>
-      </w:hyperlink>
+      <w:r>
+        <w:rPr>
+          <w:rFonts w:eastAsia="Arial" w:cs="Arial" w:ascii="Arial" w:hAnsi="Arial"/>
+          <w:b/>
+          <w:color w:val="auto"/>
+          <w:sz w:val="20"/>
+          <w:szCs w:val="20"/>
+          <w:lang w:val="ro-RO"/>
+        </w:rPr>
+        <w:t>PROCES VERBAL DE LUARE LA CUNOȘTINȚĂ</w:t>
+      </w:r>
     </w:p>
     <w:p>
       <w:pPr>
@@ -2464,20 +2455,48 @@
           <w:lang w:val="fr-FR"/>
         </w:rPr>
       </w:pPr>
-      <w:hyperlink r:id="rId60">
-        <w:r>
-          <w:rPr>
-            <w:rStyle w:val="Hyperlink"/>
-            <w:rFonts w:eastAsia="Arial" w:cs="Arial" w:ascii="Arial" w:hAnsi="Arial"/>
-            <w:color w:val="auto"/>
-            <w:sz w:val="20"/>
-            <w:szCs w:val="20"/>
-            <w:u w:val="none"/>
-            <w:lang w:val="ro-RO"/>
-          </w:rPr>
-          <w:t>Prin semnătura din tabelul nominal de mai jos, fiecare persoană desemnată confirmă că a luat cunoștință de prezenta decizie și se obligă să respecte întocmai obligațiile, atribuțiile și răspunderile ce reies din decizia Nr. {{decisionNumber}} SSM din {{issueDate}}.</w:t>
-        </w:r>
-      </w:hyperlink>
+      <w:r>
+        <w:rPr>
+          <w:rStyle w:val="tpa1"/>
+          <w:rFonts w:eastAsia="Arial" w:cs="Arial" w:ascii="Arial" w:hAnsi="Arial"/>
+          <w:color w:val="auto"/>
+          <w:sz w:val="20"/>
+          <w:szCs w:val="20"/>
+          <w:lang w:val="ro-RO"/>
+        </w:rPr>
+        <w:t>Prin semnătura din tabelul nominal de mai jos, fiecare persoană des</w:t>
+      </w:r>
+      <w:r>
+        <w:rPr>
+          <w:rFonts w:eastAsia="Arial" w:cs="Arial" w:ascii="Arial" w:hAnsi="Arial"/>
+          <w:color w:val="auto"/>
+          <w:sz w:val="20"/>
+          <w:szCs w:val="20"/>
+          <w:lang w:val="ro-RO"/>
+        </w:rPr>
+        <w:t>e</w:t>
+      </w:r>
+      <w:r>
+        <w:rPr>
+          <w:rStyle w:val="tpa1"/>
+          <w:rFonts w:eastAsia="Arial" w:cs="Arial" w:ascii="Arial" w:hAnsi="Arial"/>
+          <w:color w:val="auto"/>
+          <w:sz w:val="20"/>
+          <w:szCs w:val="20"/>
+          <w:lang w:val="ro-RO"/>
+        </w:rPr>
+        <w:t xml:space="preserve">mnată confirmă că a luat cunoștință de prezenta decizie și se obligă să respecte întocmai obligațiile, atribuțiile și răspunderile ce reies din decizia Nr. {{decisionNumber}} SSM din </w:t>
+      </w:r>
+      <w:r>
+        <w:rPr>
+          <w:rFonts w:eastAsia="Arial" w:cs="Arial" w:ascii="Arial" w:hAnsi="Arial"/>
+          <w:color w:val="auto"/>
+          <w:sz w:val="20"/>
+          <w:szCs w:val="20"/>
+          <w:lang w:val="ro-RO"/>
+        </w:rPr>
+        <w:t>{{issueDate}}.</w:t>
+      </w:r>
     </w:p>
     <w:tbl>
       <w:tblPr>
@@ -2530,21 +2549,17 @@
                 <w:szCs w:val="20"/>
               </w:rPr>
             </w:pPr>
-            <w:hyperlink r:id="rId61">
-              <w:r>
-                <w:rPr>
-                  <w:rStyle w:val="Hyperlink"/>
-                  <w:rFonts w:eastAsia="Arial" w:cs="Arial" w:ascii="Arial" w:hAnsi="Arial"/>
-                  <w:b/>
-                  <w:color w:val="auto"/>
-                  <w:sz w:val="20"/>
-                  <w:szCs w:val="20"/>
-                  <w:u w:val="none"/>
-                  <w:lang w:val="ro-RO"/>
-                </w:rPr>
-                <w:t>Nr. crt.</w:t>
-              </w:r>
-            </w:hyperlink>
+            <w:r>
+              <w:rPr>
+                <w:rFonts w:eastAsia="Arial" w:cs="Arial" w:ascii="Arial" w:hAnsi="Arial"/>
+                <w:b/>
+                <w:color w:val="auto"/>
+                <w:sz w:val="20"/>
+                <w:szCs w:val="20"/>
+                <w:lang w:val="ro-RO"/>
+              </w:rPr>
+              <w:t>Nr. crt.</w:t>
+            </w:r>
           </w:p>
         </w:tc>
         <w:tc>
@@ -2572,21 +2587,17 @@
                 <w:szCs w:val="20"/>
               </w:rPr>
             </w:pPr>
-            <w:hyperlink r:id="rId62">
-              <w:r>
-                <w:rPr>
-                  <w:rStyle w:val="Hyperlink"/>
-                  <w:rFonts w:eastAsia="Arial" w:cs="Arial" w:ascii="Arial" w:hAnsi="Arial"/>
-                  <w:b/>
-                  <w:color w:val="auto"/>
-                  <w:sz w:val="20"/>
-                  <w:szCs w:val="20"/>
-                  <w:u w:val="none"/>
-                  <w:lang w:val="ro-RO"/>
-                </w:rPr>
-                <w:t>Numele și prenumele</w:t>
-              </w:r>
-            </w:hyperlink>
+            <w:r>
+              <w:rPr>
+                <w:rFonts w:eastAsia="Arial" w:cs="Arial" w:ascii="Arial" w:hAnsi="Arial"/>
+                <w:b/>
+                <w:color w:val="auto"/>
+                <w:sz w:val="20"/>
+                <w:szCs w:val="20"/>
+                <w:lang w:val="ro-RO"/>
+              </w:rPr>
+              <w:t>Numele și prenumele</w:t>
+            </w:r>
           </w:p>
         </w:tc>
         <w:tc>
@@ -2614,21 +2625,17 @@
                 <w:szCs w:val="20"/>
               </w:rPr>
             </w:pPr>
-            <w:hyperlink r:id="rId63">
-              <w:r>
-                <w:rPr>
-                  <w:rStyle w:val="Hyperlink"/>
-                  <w:rFonts w:eastAsia="Arial" w:cs="Arial" w:ascii="Arial" w:hAnsi="Arial"/>
-                  <w:b/>
-                  <w:color w:val="auto"/>
-                  <w:sz w:val="20"/>
-                  <w:szCs w:val="20"/>
-                  <w:u w:val="none"/>
-                  <w:lang w:val="ro-RO"/>
-                </w:rPr>
-                <w:t>Funcția</w:t>
-              </w:r>
-            </w:hyperlink>
+            <w:r>
+              <w:rPr>
+                <w:rFonts w:eastAsia="Arial" w:cs="Arial" w:ascii="Arial" w:hAnsi="Arial"/>
+                <w:b/>
+                <w:color w:val="auto"/>
+                <w:sz w:val="20"/>
+                <w:szCs w:val="20"/>
+                <w:lang w:val="ro-RO"/>
+              </w:rPr>
+              <w:t>Funcția</w:t>
+            </w:r>
           </w:p>
         </w:tc>
         <w:tc>
@@ -2656,21 +2663,17 @@
                 <w:szCs w:val="20"/>
               </w:rPr>
             </w:pPr>
-            <w:hyperlink r:id="rId64">
-              <w:r>
-                <w:rPr>
-                  <w:rStyle w:val="Hyperlink"/>
-                  <w:rFonts w:eastAsia="Arial" w:cs="Arial" w:ascii="Arial" w:hAnsi="Arial"/>
-                  <w:b/>
-                  <w:color w:val="auto"/>
-                  <w:sz w:val="20"/>
-                  <w:szCs w:val="20"/>
-                  <w:u w:val="none"/>
-                  <w:lang w:val="ro-RO"/>
-                </w:rPr>
-                <w:t>Data primirii</w:t>
-              </w:r>
-            </w:hyperlink>
+            <w:r>
+              <w:rPr>
+                <w:rFonts w:eastAsia="Arial" w:cs="Arial" w:ascii="Arial" w:hAnsi="Arial"/>
+                <w:b/>
+                <w:color w:val="auto"/>
+                <w:sz w:val="20"/>
+                <w:szCs w:val="20"/>
+                <w:lang w:val="ro-RO"/>
+              </w:rPr>
+              <w:t>Data primirii</w:t>
+            </w:r>
           </w:p>
         </w:tc>
         <w:tc>
@@ -2698,21 +2701,17 @@
                 <w:szCs w:val="20"/>
               </w:rPr>
             </w:pPr>
-            <w:hyperlink r:id="rId65">
-              <w:r>
-                <w:rPr>
-                  <w:rStyle w:val="Hyperlink"/>
-                  <w:rFonts w:eastAsia="Arial" w:cs="Arial" w:ascii="Arial" w:hAnsi="Arial"/>
-                  <w:b/>
-                  <w:color w:val="auto"/>
-                  <w:sz w:val="20"/>
-                  <w:szCs w:val="20"/>
-                  <w:u w:val="none"/>
-                  <w:lang w:val="ro-RO"/>
-                </w:rPr>
-                <w:t>Semnătura de primire</w:t>
-              </w:r>
-            </w:hyperlink>
+            <w:r>
+              <w:rPr>
+                <w:rFonts w:eastAsia="Arial" w:cs="Arial" w:ascii="Arial" w:hAnsi="Arial"/>
+                <w:b/>
+                <w:color w:val="auto"/>
+                <w:sz w:val="20"/>
+                <w:szCs w:val="20"/>
+                <w:lang w:val="ro-RO"/>
+              </w:rPr>
+              <w:t>Semnătura de primire</w:t>
+            </w:r>
           </w:p>
         </w:tc>
       </w:tr>
@@ -2747,24 +2746,20 @@
               <w:rPr>
                 <w:rFonts w:ascii="Arial" w:hAnsi="Arial" w:cs="Arial"/>
                 <w:b/>
+                <w:sz w:val="20"/>
+                <w:szCs w:val="20"/>
+              </w:rPr>
+            </w:pPr>
+            <w:r>
+              <w:rPr>
+                <w:rFonts w:eastAsia="Arial" w:cs="Arial" w:ascii="Arial" w:hAnsi="Arial"/>
+                <w:b/>
                 <w:color w:val="auto"/>
                 <w:sz w:val="20"/>
                 <w:szCs w:val="20"/>
                 <w:lang w:val="ro-RO"/>
               </w:rPr>
-            </w:pPr>
-            <w:hyperlink r:id="rId66">
-              <w:r>
-                <w:rPr>
-                  <w:rFonts w:eastAsia="Arial" w:cs="Arial" w:ascii="Arial" w:hAnsi="Arial"/>
-                  <w:b/>
-                  <w:color w:val="auto"/>
-                  <w:sz w:val="20"/>
-                  <w:szCs w:val="20"/>
-                  <w:lang w:val="ro-RO"/>
-                </w:rPr>
-              </w:r>
-            </w:hyperlink>
+            </w:r>
           </w:p>
         </w:tc>
         <w:tc>
@@ -2789,20 +2784,16 @@
                 <w:szCs w:val="20"/>
               </w:rPr>
             </w:pPr>
-            <w:hyperlink r:id="rId67">
-              <w:r>
-                <w:rPr>
-                  <w:rStyle w:val="Hyperlink"/>
-                  <w:rFonts w:eastAsia="Arial" w:cs="Arial" w:ascii="Arial" w:hAnsi="Arial"/>
-                  <w:color w:val="auto"/>
-                  <w:sz w:val="20"/>
-                  <w:szCs w:val="20"/>
-                  <w:u w:val="none"/>
-                  <w:lang w:val="ro-RO"/>
-                </w:rPr>
-                <w:t>{{#workplaceManagers}}{{name}}</w:t>
-              </w:r>
-            </w:hyperlink>
+            <w:r>
+              <w:rPr>
+                <w:rFonts w:eastAsia="Arial" w:cs="Arial" w:ascii="Arial" w:hAnsi="Arial"/>
+                <w:color w:val="auto"/>
+                <w:sz w:val="20"/>
+                <w:szCs w:val="20"/>
+                <w:lang w:val="ro-RO"/>
+              </w:rPr>
+              <w:t>{{#workplaceManagers}}{{name}}</w:t>
+            </w:r>
           </w:p>
         </w:tc>
         <w:tc>
@@ -2828,20 +2819,16 @@
                 <w:szCs w:val="20"/>
               </w:rPr>
             </w:pPr>
-            <w:hyperlink r:id="rId68">
-              <w:r>
-                <w:rPr>
-                  <w:rStyle w:val="Hyperlink"/>
-                  <w:rFonts w:eastAsia="Arial" w:cs="Arial" w:ascii="Arial" w:hAnsi="Arial"/>
-                  <w:color w:val="auto"/>
-                  <w:sz w:val="20"/>
-                  <w:szCs w:val="20"/>
-                  <w:u w:val="none"/>
-                  <w:lang w:val="ro-RO"/>
-                </w:rPr>
-                <w:t>{{jobTitle}}</w:t>
-              </w:r>
-            </w:hyperlink>
+            <w:r>
+              <w:rPr>
+                <w:rFonts w:eastAsia="Arial" w:cs="Arial" w:ascii="Arial" w:hAnsi="Arial"/>
+                <w:color w:val="auto"/>
+                <w:sz w:val="20"/>
+                <w:szCs w:val="20"/>
+                <w:lang w:val="ro-RO"/>
+              </w:rPr>
+              <w:t>{{jobTitle}}</w:t>
+            </w:r>
           </w:p>
         </w:tc>
         <w:tc>
@@ -2867,20 +2854,16 @@
                 <w:szCs w:val="20"/>
               </w:rPr>
             </w:pPr>
-            <w:hyperlink r:id="rId69">
-              <w:r>
-                <w:rPr>
-                  <w:rStyle w:val="Hyperlink"/>
-                  <w:rFonts w:eastAsia="Arial" w:cs="Arial" w:ascii="Arial" w:hAnsi="Arial"/>
-                  <w:color w:val="auto"/>
-                  <w:sz w:val="20"/>
-                  <w:szCs w:val="20"/>
-                  <w:u w:val="none"/>
-                  <w:lang w:val="ro-RO"/>
-                </w:rPr>
-                <w:t>{{issueDate}}{{/workplaceManagers}}</w:t>
-              </w:r>
-            </w:hyperlink>
+            <w:r>
+              <w:rPr>
+                <w:rFonts w:eastAsia="Arial" w:cs="Arial" w:ascii="Arial" w:hAnsi="Arial"/>
+                <w:color w:val="auto"/>
+                <w:sz w:val="20"/>
+                <w:szCs w:val="20"/>
+                <w:lang w:val="ro-RO"/>
+              </w:rPr>
+              <w:t>{{issueDate}}{{/workplaceManagers}}</w:t>
+            </w:r>
           </w:p>
         </w:tc>
         <w:tc>
@@ -2901,23 +2884,19 @@
               <w:spacing w:before="0" w:after="0"/>
               <w:rPr>
                 <w:rFonts w:ascii="Arial" w:hAnsi="Arial" w:cs="Arial"/>
+                <w:sz w:val="20"/>
+                <w:szCs w:val="20"/>
+              </w:rPr>
+            </w:pPr>
+            <w:r>
+              <w:rPr>
+                <w:rFonts w:eastAsia="Arial" w:cs="Arial" w:ascii="Arial" w:hAnsi="Arial"/>
                 <w:color w:val="auto"/>
                 <w:sz w:val="20"/>
                 <w:szCs w:val="20"/>
                 <w:lang w:val="ro-RO"/>
               </w:rPr>
-            </w:pPr>
-            <w:hyperlink r:id="rId70">
-              <w:r>
-                <w:rPr>
-                  <w:rFonts w:eastAsia="Arial" w:cs="Arial" w:ascii="Arial" w:hAnsi="Arial"/>
-                  <w:color w:val="auto"/>
-                  <w:sz w:val="20"/>
-                  <w:szCs w:val="20"/>
-                  <w:lang w:val="ro-RO"/>
-                </w:rPr>
-              </w:r>
-            </w:hyperlink>
+            </w:r>
           </w:p>
         </w:tc>
       </w:tr>
@@ -2951,24 +2930,20 @@
               <w:rPr>
                 <w:rFonts w:ascii="Arial" w:hAnsi="Arial" w:cs="Arial"/>
                 <w:b/>
+                <w:sz w:val="20"/>
+                <w:szCs w:val="20"/>
+              </w:rPr>
+            </w:pPr>
+            <w:r>
+              <w:rPr>
+                <w:rFonts w:eastAsia="Arial" w:cs="Arial" w:ascii="Arial" w:hAnsi="Arial"/>
+                <w:b/>
                 <w:color w:val="auto"/>
                 <w:sz w:val="20"/>
                 <w:szCs w:val="20"/>
                 <w:lang w:val="ro-RO"/>
               </w:rPr>
-            </w:pPr>
-            <w:hyperlink r:id="rId71">
-              <w:r>
-                <w:rPr>
-                  <w:rFonts w:eastAsia="Arial" w:cs="Arial" w:ascii="Arial" w:hAnsi="Arial"/>
-                  <w:b/>
-                  <w:color w:val="auto"/>
-                  <w:sz w:val="20"/>
-                  <w:szCs w:val="20"/>
-                  <w:lang w:val="ro-RO"/>
-                </w:rPr>
-              </w:r>
-            </w:hyperlink>
+            </w:r>
           </w:p>
         </w:tc>
         <w:tc>
@@ -2990,23 +2965,19 @@
               <w:spacing w:before="0" w:after="0"/>
               <w:rPr>
                 <w:rFonts w:ascii="Arial" w:hAnsi="Arial" w:cs="Arial"/>
+                <w:sz w:val="20"/>
+                <w:szCs w:val="20"/>
+              </w:rPr>
+            </w:pPr>
+            <w:r>
+              <w:rPr>
+                <w:rFonts w:eastAsia="Arial" w:cs="Arial" w:ascii="Arial" w:hAnsi="Arial"/>
                 <w:color w:val="auto"/>
                 <w:sz w:val="20"/>
                 <w:szCs w:val="20"/>
                 <w:lang w:val="ro-RO"/>
               </w:rPr>
-            </w:pPr>
-            <w:hyperlink r:id="rId72">
-              <w:r>
-                <w:rPr>
-                  <w:rFonts w:eastAsia="Arial" w:cs="Arial" w:ascii="Arial" w:hAnsi="Arial"/>
-                  <w:color w:val="auto"/>
-                  <w:sz w:val="20"/>
-                  <w:szCs w:val="20"/>
-                  <w:lang w:val="ro-RO"/>
-                </w:rPr>
-              </w:r>
-            </w:hyperlink>
+            </w:r>
           </w:p>
         </w:tc>
         <w:tc>
@@ -3029,23 +3000,19 @@
               <w:jc w:val="center"/>
               <w:rPr>
                 <w:rFonts w:ascii="Arial" w:hAnsi="Arial" w:cs="Arial"/>
+                <w:sz w:val="20"/>
+                <w:szCs w:val="20"/>
+              </w:rPr>
+            </w:pPr>
+            <w:r>
+              <w:rPr>
+                <w:rFonts w:eastAsia="Arial" w:cs="Arial" w:ascii="Arial" w:hAnsi="Arial"/>
                 <w:color w:val="auto"/>
                 <w:sz w:val="20"/>
                 <w:szCs w:val="20"/>
                 <w:lang w:val="ro-RO"/>
               </w:rPr>
-            </w:pPr>
-            <w:hyperlink r:id="rId73">
-              <w:r>
-                <w:rPr>
-                  <w:rFonts w:eastAsia="Arial" w:cs="Arial" w:ascii="Arial" w:hAnsi="Arial"/>
-                  <w:color w:val="auto"/>
-                  <w:sz w:val="20"/>
-                  <w:szCs w:val="20"/>
-                  <w:lang w:val="ro-RO"/>
-                </w:rPr>
-              </w:r>
-            </w:hyperlink>
+            </w:r>
           </w:p>
         </w:tc>
         <w:tc>
@@ -3068,23 +3035,19 @@
               <w:jc w:val="center"/>
               <w:rPr>
                 <w:rFonts w:ascii="Arial" w:hAnsi="Arial" w:cs="Arial"/>
+                <w:sz w:val="20"/>
+                <w:szCs w:val="20"/>
+              </w:rPr>
+            </w:pPr>
+            <w:r>
+              <w:rPr>
+                <w:rFonts w:eastAsia="Arial" w:cs="Arial" w:ascii="Arial" w:hAnsi="Arial"/>
                 <w:color w:val="auto"/>
                 <w:sz w:val="20"/>
                 <w:szCs w:val="20"/>
                 <w:lang w:val="ro-RO"/>
               </w:rPr>
-            </w:pPr>
-            <w:hyperlink r:id="rId74">
-              <w:r>
-                <w:rPr>
-                  <w:rFonts w:eastAsia="Arial" w:cs="Arial" w:ascii="Arial" w:hAnsi="Arial"/>
-                  <w:color w:val="auto"/>
-                  <w:sz w:val="20"/>
-                  <w:szCs w:val="20"/>
-                  <w:lang w:val="ro-RO"/>
-                </w:rPr>
-              </w:r>
-            </w:hyperlink>
+            </w:r>
           </w:p>
         </w:tc>
         <w:tc>
@@ -3105,23 +3068,20 @@
               <w:spacing w:before="0" w:after="0"/>
               <w:rPr>
                 <w:rFonts w:ascii="Arial" w:hAnsi="Arial" w:cs="Arial"/>
+                <w:sz w:val="20"/>
+                <w:szCs w:val="20"/>
+              </w:rPr>
+            </w:pPr>
+            <w:r>
+              <w:rPr>
+                <w:rFonts w:eastAsia="Arial" w:cs="Arial" w:ascii="Arial" w:hAnsi="Arial"/>
                 <w:color w:val="auto"/>
                 <w:sz w:val="20"/>
                 <w:szCs w:val="20"/>
+                <w:u w:val="none"/>
                 <w:lang w:val="ro-RO"/>
               </w:rPr>
-            </w:pPr>
-            <w:hyperlink r:id="rId75">
-              <w:r>
-                <w:rPr>
-                  <w:rFonts w:eastAsia="Arial" w:cs="Arial" w:ascii="Arial" w:hAnsi="Arial"/>
-                  <w:color w:val="auto"/>
-                  <w:sz w:val="20"/>
-                  <w:szCs w:val="20"/>
-                  <w:lang w:val="ro-RO"/>
-                </w:rPr>
-              </w:r>
-            </w:hyperlink>
+            </w:r>
           </w:p>
         </w:tc>
       </w:tr>
@@ -3132,28 +3092,26 @@
         <w:widowControl/>
         <w:spacing w:before="0" w:after="0"/>
         <w:ind w:hanging="0"/>
-        <w:rPr>
-          <w:rFonts w:ascii="Arial" w:hAnsi="Arial" w:cs="Arial"/>
-          <w:color w:val="auto"/>
+        <w:jc w:val="both"/>
+        <w:rPr>
+          <w:rFonts w:ascii="Arial" w:hAnsi="Arial" w:cs="Arial"/>
           <w:sz w:val="2"/>
           <w:szCs w:val="20"/>
-          <w:lang w:val="ro-RO"/>
-        </w:rPr>
-      </w:pPr>
-      <w:hyperlink r:id="rId76">
-        <w:r>
-          <w:rPr>
-            <w:rFonts w:eastAsia="Arial" w:cs="Arial" w:ascii="Arial" w:hAnsi="Arial"/>
-            <w:color w:val="auto"/>
-            <w:sz w:val="20"/>
-            <w:szCs w:val="20"/>
-            <w:lang w:val="ro-RO"/>
-          </w:rPr>
-        </w:r>
-      </w:hyperlink>
+          <w:lang w:val="it-CH"/>
+        </w:rPr>
+      </w:pPr>
+      <w:r>
+        <w:rPr>
+          <w:rFonts w:eastAsia="Arial" w:cs="Arial" w:ascii="Arial" w:hAnsi="Arial"/>
+          <w:color w:val="auto"/>
+          <w:sz w:val="2"/>
+          <w:szCs w:val="20"/>
+          <w:lang w:val="ro-RO"/>
+        </w:rPr>
+      </w:r>
     </w:p>
     <w:sectPr>
-      <w:footerReference w:type="even" r:id="rId77"/>
+      <w:footerReference w:type="even" r:id="rId2"/>
       <w:type w:val="nextPage"/>
       <w:pgSz w:w="11906" w:h="16838"/>
       <w:pgMar w:left="1417" w:right="1134" w:gutter="0" w:header="0" w:top="1134" w:footer="0" w:bottom="1134"/>
@@ -5336,13 +5294,6 @@
     <w:name w:val="s_lit_bdy"/>
     <w:basedOn w:val="DefaultParagraphFont"/>
     <w:rPr/>
-  </w:style>
-  <w:style w:type="character" w:styleId="Hyperlink">
-    <w:name w:val="Hyperlink"/>
-    <w:rPr>
-      <w:color w:val="000080"/>
-      <w:u w:val="single"/>
-    </w:rPr>
   </w:style>
   <w:style w:type="paragraph" w:styleId="Heading">
     <w:name w:val="Heading"/>

</xml_diff>

<commit_message>
feat(document-engine): left-aligned running text is the house style
Justified text without hyphenation opens uneven gaps between words. The four
decisions are re-imported left-aligned, the import no longer offers the
choice, and a test refuses a justified paragraph.

Claude-Session: https://claude.ai/code/session_019fFLd3rEWZKkUNU1RuQAwk
</commit_message>
<xml_diff>
--- a/packages/document-engine/templates/1.1_decision_training.docx
+++ b/packages/document-engine/templates/1.1_decision_training.docx
@@ -71,7 +71,7 @@
         </w:numPr>
         <w:spacing w:before="0" w:after="120"/>
         <w:ind w:hanging="0" w:left="0"/>
-        <w:jc w:val="both"/>
+        <w:jc w:val="left"/>
         <w:rPr>
           <w:rFonts w:ascii="Arial" w:hAnsi="Arial" w:cs="Arial"/>
           <w:sz w:val="20"/>
@@ -176,7 +176,7 @@
           <w:numId w:val="4"/>
         </w:numPr>
         <w:spacing w:before="120" w:after="60"/>
-        <w:jc w:val="both"/>
+        <w:jc w:val="left"/>
         <w:rPr>
           <w:rFonts w:ascii="Arial" w:hAnsi="Arial" w:cs="Arial"/>
           <w:sz w:val="20"/>
@@ -224,7 +224,7 @@
           <w:numId w:val="9"/>
         </w:numPr>
         <w:spacing w:before="0" w:after="40"/>
-        <w:jc w:val="both"/>
+        <w:jc w:val="left"/>
         <w:rPr>
           <w:rFonts w:ascii="Arial" w:hAnsi="Arial" w:cs="Arial"/>
           <w:b/>
@@ -263,7 +263,7 @@
           <w:numId w:val="9"/>
         </w:numPr>
         <w:spacing w:before="0" w:after="40"/>
-        <w:jc w:val="both"/>
+        <w:jc w:val="left"/>
         <w:rPr>
           <w:rFonts w:ascii="Arial" w:hAnsi="Arial" w:cs="Arial"/>
           <w:b/>
@@ -352,7 +352,7 @@
           <w:numId w:val="9"/>
         </w:numPr>
         <w:spacing w:before="0" w:after="40"/>
-        <w:jc w:val="both"/>
+        <w:jc w:val="left"/>
         <w:rPr>
           <w:rFonts w:ascii="Arial" w:hAnsi="Arial" w:cs="Arial"/>
           <w:b/>
@@ -380,7 +380,7 @@
           <w:numId w:val="9"/>
         </w:numPr>
         <w:spacing w:before="0" w:after="40"/>
-        <w:jc w:val="both"/>
+        <w:jc w:val="left"/>
         <w:rPr>
           <w:rFonts w:ascii="Arial" w:hAnsi="Arial" w:cs="Arial"/>
           <w:b/>
@@ -419,7 +419,7 @@
           <w:numId w:val="9"/>
         </w:numPr>
         <w:spacing w:before="0" w:after="40"/>
-        <w:jc w:val="both"/>
+        <w:jc w:val="left"/>
         <w:rPr>
           <w:rFonts w:ascii="Arial" w:hAnsi="Arial" w:cs="Arial"/>
           <w:b/>
@@ -449,7 +449,7 @@
           <w:numId w:val="4"/>
         </w:numPr>
         <w:spacing w:before="120" w:after="60"/>
-        <w:jc w:val="both"/>
+        <w:jc w:val="left"/>
         <w:rPr>
           <w:rFonts w:ascii="Arial" w:hAnsi="Arial" w:cs="Arial"/>
           <w:sz w:val="20"/>
@@ -497,7 +497,7 @@
           <w:numId w:val="10"/>
         </w:numPr>
         <w:spacing w:before="0" w:after="40"/>
-        <w:jc w:val="both"/>
+        <w:jc w:val="left"/>
         <w:rPr>
           <w:rStyle w:val="tpa1"/>
           <w:rFonts w:ascii="Arial" w:hAnsi="Arial" w:cs="Arial"/>
@@ -549,7 +549,7 @@
           <w:numId w:val="3"/>
         </w:numPr>
         <w:spacing w:before="0" w:after="40"/>
-        <w:jc w:val="both"/>
+        <w:jc w:val="left"/>
         <w:rPr>
           <w:rFonts w:ascii="Arial" w:hAnsi="Arial" w:cs="Arial"/>
           <w:sz w:val="20"/>
@@ -576,7 +576,7 @@
           <w:numId w:val="3"/>
         </w:numPr>
         <w:spacing w:before="0" w:after="40"/>
-        <w:jc w:val="both"/>
+        <w:jc w:val="left"/>
         <w:rPr>
           <w:rFonts w:ascii="Arial" w:hAnsi="Arial" w:cs="Arial"/>
           <w:sz w:val="20"/>
@@ -603,7 +603,7 @@
           <w:numId w:val="8"/>
         </w:numPr>
         <w:spacing w:before="0" w:after="40"/>
-        <w:jc w:val="both"/>
+        <w:jc w:val="left"/>
         <w:rPr>
           <w:rFonts w:ascii="Arial" w:hAnsi="Arial" w:cs="Arial"/>
           <w:sz w:val="20"/>
@@ -633,7 +633,7 @@
           <w:numId w:val="8"/>
         </w:numPr>
         <w:spacing w:before="0" w:after="40"/>
-        <w:jc w:val="both"/>
+        <w:jc w:val="left"/>
         <w:rPr>
           <w:rFonts w:ascii="Arial" w:hAnsi="Arial" w:cs="Arial"/>
           <w:sz w:val="20"/>
@@ -664,7 +664,7 @@
           <w:numId w:val="8"/>
         </w:numPr>
         <w:spacing w:before="0" w:after="40"/>
-        <w:jc w:val="both"/>
+        <w:jc w:val="left"/>
         <w:rPr>
           <w:rFonts w:ascii="Arial" w:hAnsi="Arial" w:cs="Arial"/>
           <w:sz w:val="20"/>
@@ -695,7 +695,7 @@
           <w:numId w:val="6"/>
         </w:numPr>
         <w:spacing w:before="0" w:after="40"/>
-        <w:jc w:val="both"/>
+        <w:jc w:val="left"/>
         <w:rPr>
           <w:rStyle w:val="tpa1"/>
           <w:rFonts w:ascii="Arial" w:hAnsi="Arial" w:cs="Arial"/>
@@ -726,7 +726,7 @@
           <w:numId w:val="10"/>
         </w:numPr>
         <w:spacing w:before="0" w:after="40"/>
-        <w:jc w:val="both"/>
+        <w:jc w:val="left"/>
         <w:rPr>
           <w:rStyle w:val="tpa1"/>
           <w:rFonts w:ascii="Arial" w:hAnsi="Arial" w:cs="Arial"/>
@@ -778,7 +778,7 @@
           <w:numId w:val="11"/>
         </w:numPr>
         <w:spacing w:before="0" w:after="40"/>
-        <w:jc w:val="both"/>
+        <w:jc w:val="left"/>
         <w:rPr>
           <w:rFonts w:ascii="Arial" w:hAnsi="Arial" w:cs="Arial"/>
           <w:sz w:val="20"/>
@@ -805,7 +805,7 @@
           <w:numId w:val="11"/>
         </w:numPr>
         <w:spacing w:before="0" w:after="40"/>
-        <w:jc w:val="both"/>
+        <w:jc w:val="left"/>
         <w:rPr>
           <w:rFonts w:ascii="Arial" w:hAnsi="Arial" w:cs="Arial"/>
           <w:sz w:val="20"/>
@@ -832,7 +832,7 @@
           <w:numId w:val="8"/>
         </w:numPr>
         <w:spacing w:before="0" w:after="40"/>
-        <w:jc w:val="both"/>
+        <w:jc w:val="left"/>
         <w:rPr>
           <w:rFonts w:ascii="Arial" w:hAnsi="Arial" w:cs="Arial"/>
           <w:sz w:val="20"/>
@@ -860,7 +860,7 @@
           <w:numId w:val="8"/>
         </w:numPr>
         <w:spacing w:before="0" w:after="40"/>
-        <w:jc w:val="both"/>
+        <w:jc w:val="left"/>
         <w:rPr>
           <w:rFonts w:ascii="Arial" w:hAnsi="Arial" w:cs="Arial"/>
           <w:sz w:val="20"/>
@@ -889,7 +889,7 @@
           <w:numId w:val="8"/>
         </w:numPr>
         <w:spacing w:before="0" w:after="40"/>
-        <w:jc w:val="both"/>
+        <w:jc w:val="left"/>
         <w:rPr>
           <w:rFonts w:ascii="Arial" w:hAnsi="Arial" w:cs="Arial"/>
           <w:sz w:val="20"/>
@@ -918,7 +918,7 @@
           <w:numId w:val="6"/>
         </w:numPr>
         <w:spacing w:before="0" w:after="40"/>
-        <w:jc w:val="both"/>
+        <w:jc w:val="left"/>
         <w:rPr>
           <w:rStyle w:val="tli1"/>
           <w:rFonts w:ascii="Arial" w:hAnsi="Arial" w:cs="Arial"/>
@@ -947,7 +947,7 @@
           <w:numId w:val="11"/>
         </w:numPr>
         <w:spacing w:before="0" w:after="40"/>
-        <w:jc w:val="both"/>
+        <w:jc w:val="left"/>
         <w:rPr>
           <w:rStyle w:val="tpa1"/>
           <w:rFonts w:ascii="Arial" w:hAnsi="Arial" w:cs="Arial"/>
@@ -1000,7 +1000,7 @@
           <w:numId w:val="10"/>
         </w:numPr>
         <w:spacing w:before="0" w:after="40"/>
-        <w:jc w:val="both"/>
+        <w:jc w:val="left"/>
         <w:rPr>
           <w:rFonts w:ascii="Arial" w:hAnsi="Arial" w:cs="Arial"/>
           <w:sz w:val="20"/>
@@ -1051,7 +1051,7 @@
           <w:numId w:val="13"/>
         </w:numPr>
         <w:spacing w:before="0" w:after="40"/>
-        <w:jc w:val="both"/>
+        <w:jc w:val="left"/>
         <w:rPr>
           <w:rStyle w:val="tpa1"/>
           <w:rFonts w:ascii="Arial" w:hAnsi="Arial" w:cs="Arial"/>
@@ -1102,7 +1102,7 @@
           <w:numId w:val="13"/>
         </w:numPr>
         <w:spacing w:before="0" w:after="40"/>
-        <w:jc w:val="both"/>
+        <w:jc w:val="left"/>
         <w:rPr>
           <w:rFonts w:ascii="Arial" w:hAnsi="Arial" w:cs="Arial"/>
           <w:sz w:val="20"/>
@@ -1172,7 +1172,7 @@
           <w:numId w:val="13"/>
         </w:numPr>
         <w:spacing w:before="0" w:after="40"/>
-        <w:jc w:val="both"/>
+        <w:jc w:val="left"/>
         <w:rPr>
           <w:rFonts w:ascii="Arial" w:hAnsi="Arial" w:cs="Arial"/>
           <w:sz w:val="20"/>
@@ -1241,7 +1241,7 @@
           <w:numId w:val="6"/>
         </w:numPr>
         <w:spacing w:before="0" w:after="40"/>
-        <w:jc w:val="both"/>
+        <w:jc w:val="left"/>
         <w:rPr>
           <w:rFonts w:ascii="Arial" w:hAnsi="Arial" w:cs="Arial"/>
           <w:sz w:val="20"/>
@@ -1356,7 +1356,7 @@
           <w:numId w:val="6"/>
         </w:numPr>
         <w:spacing w:before="0" w:after="40"/>
-        <w:jc w:val="both"/>
+        <w:jc w:val="left"/>
         <w:rPr>
           <w:rFonts w:ascii="Arial" w:hAnsi="Arial" w:cs="Arial"/>
           <w:sz w:val="20"/>
@@ -1471,7 +1471,7 @@
           <w:numId w:val="10"/>
         </w:numPr>
         <w:spacing w:before="0" w:after="40"/>
-        <w:jc w:val="both"/>
+        <w:jc w:val="left"/>
         <w:rPr>
           <w:rStyle w:val="tpa1"/>
           <w:rFonts w:ascii="Arial" w:hAnsi="Arial" w:cs="Arial"/>
@@ -1530,7 +1530,7 @@
         <w:widowControl/>
         <w:spacing w:before="0" w:after="40"/>
         <w:ind w:left="720" w:right="0"/>
-        <w:jc w:val="both"/>
+        <w:jc w:val="left"/>
         <w:rPr>
           <w:rFonts w:ascii="Arial" w:hAnsi="Arial" w:cs="Arial"/>
           <w:sz w:val="20"/>
@@ -1558,7 +1558,7 @@
           <w:numId w:val="7"/>
         </w:numPr>
         <w:spacing w:before="0" w:after="40"/>
-        <w:jc w:val="both"/>
+        <w:jc w:val="left"/>
         <w:rPr>
           <w:rFonts w:ascii="Arial" w:hAnsi="Arial" w:cs="Arial"/>
           <w:sz w:val="20"/>
@@ -1586,7 +1586,7 @@
           <w:numId w:val="7"/>
         </w:numPr>
         <w:spacing w:before="0" w:after="40"/>
-        <w:jc w:val="both"/>
+        <w:jc w:val="left"/>
         <w:rPr>
           <w:rFonts w:ascii="Arial" w:hAnsi="Arial" w:cs="Arial"/>
           <w:sz w:val="20"/>
@@ -1614,7 +1614,7 @@
           <w:numId w:val="7"/>
         </w:numPr>
         <w:spacing w:before="0" w:after="40"/>
-        <w:jc w:val="both"/>
+        <w:jc w:val="left"/>
         <w:rPr>
           <w:rStyle w:val="tli1"/>
           <w:rFonts w:ascii="Arial" w:hAnsi="Arial" w:cs="Arial"/>
@@ -1643,7 +1643,7 @@
           <w:numId w:val="7"/>
         </w:numPr>
         <w:spacing w:before="0" w:after="40"/>
-        <w:jc w:val="both"/>
+        <w:jc w:val="left"/>
         <w:rPr>
           <w:rFonts w:ascii="Arial" w:hAnsi="Arial" w:cs="Arial"/>
           <w:sz w:val="20"/>
@@ -1671,7 +1671,7 @@
           <w:numId w:val="7"/>
         </w:numPr>
         <w:spacing w:before="0" w:after="40"/>
-        <w:jc w:val="both"/>
+        <w:jc w:val="left"/>
         <w:rPr>
           <w:rFonts w:ascii="Arial" w:hAnsi="Arial" w:cs="Arial"/>
           <w:sz w:val="20"/>
@@ -1699,7 +1699,7 @@
           <w:numId w:val="7"/>
         </w:numPr>
         <w:spacing w:before="0" w:after="40"/>
-        <w:jc w:val="both"/>
+        <w:jc w:val="left"/>
         <w:rPr>
           <w:rFonts w:ascii="Arial" w:hAnsi="Arial" w:cs="Arial"/>
           <w:sz w:val="20"/>
@@ -1727,7 +1727,7 @@
           <w:numId w:val="7"/>
         </w:numPr>
         <w:spacing w:before="0" w:after="40"/>
-        <w:jc w:val="both"/>
+        <w:jc w:val="left"/>
         <w:rPr>
           <w:rFonts w:ascii="Arial" w:hAnsi="Arial" w:cs="Arial"/>
           <w:sz w:val="20"/>
@@ -1756,7 +1756,7 @@
         </w:numPr>
         <w:spacing w:before="0" w:after="40"/>
         <w:ind w:right="0"/>
-        <w:jc w:val="both"/>
+        <w:jc w:val="left"/>
         <w:rPr>
           <w:rStyle w:val="spar"/>
           <w:rFonts w:ascii="Arial" w:hAnsi="Arial" w:cs="Arial"/>
@@ -1809,7 +1809,7 @@
         </w:numPr>
         <w:spacing w:before="0" w:after="40"/>
         <w:ind w:right="0"/>
-        <w:jc w:val="both"/>
+        <w:jc w:val="left"/>
         <w:rPr>
           <w:rStyle w:val="slitbdy"/>
           <w:rFonts w:ascii="Arial" w:hAnsi="Arial" w:cs="Arial"/>
@@ -1841,7 +1841,7 @@
         </w:numPr>
         <w:spacing w:before="0" w:after="40"/>
         <w:ind w:right="0"/>
-        <w:jc w:val="both"/>
+        <w:jc w:val="left"/>
         <w:rPr>
           <w:rStyle w:val="slitbdy"/>
           <w:rFonts w:ascii="Arial" w:hAnsi="Arial" w:cs="Arial"/>
@@ -1873,7 +1873,7 @@
         </w:numPr>
         <w:spacing w:before="0" w:after="40"/>
         <w:ind w:right="0"/>
-        <w:jc w:val="both"/>
+        <w:jc w:val="left"/>
         <w:rPr>
           <w:rStyle w:val="slitbdy"/>
           <w:rFonts w:ascii="Arial" w:hAnsi="Arial" w:cs="Arial"/>
@@ -1905,7 +1905,7 @@
         </w:numPr>
         <w:spacing w:before="0" w:after="40"/>
         <w:ind w:right="0"/>
-        <w:jc w:val="both"/>
+        <w:jc w:val="left"/>
         <w:rPr>
           <w:rStyle w:val="slitbdy"/>
           <w:rFonts w:ascii="Arial" w:hAnsi="Arial" w:cs="Arial"/>
@@ -1937,7 +1937,7 @@
         </w:numPr>
         <w:spacing w:before="0" w:after="40"/>
         <w:ind w:right="0"/>
-        <w:jc w:val="both"/>
+        <w:jc w:val="left"/>
         <w:rPr>
           <w:rStyle w:val="tpa1"/>
           <w:rFonts w:ascii="Arial" w:hAnsi="Arial" w:cs="Arial"/>
@@ -1988,7 +1988,7 @@
         </w:numPr>
         <w:spacing w:before="0" w:after="40"/>
         <w:ind w:right="0"/>
-        <w:jc w:val="both"/>
+        <w:jc w:val="left"/>
         <w:rPr>
           <w:rFonts w:ascii="Arial" w:hAnsi="Arial" w:cs="Arial"/>
           <w:i/>
@@ -2060,7 +2060,7 @@
           <w:numId w:val="4"/>
         </w:numPr>
         <w:spacing w:before="120" w:after="60"/>
-        <w:jc w:val="both"/>
+        <w:jc w:val="left"/>
         <w:rPr>
           <w:rFonts w:ascii="Arial" w:hAnsi="Arial" w:cs="Arial"/>
           <w:sz w:val="20"/>
@@ -2119,7 +2119,7 @@
           <w:numId w:val="4"/>
         </w:numPr>
         <w:spacing w:before="120" w:after="60"/>
-        <w:jc w:val="both"/>
+        <w:jc w:val="left"/>
         <w:rPr>
           <w:rStyle w:val="PageNumber"/>
           <w:rFonts w:ascii="Arial" w:hAnsi="Arial" w:cs="Arial"/>
@@ -2179,7 +2179,7 @@
           <w:numId w:val="4"/>
         </w:numPr>
         <w:spacing w:before="120" w:after="60"/>
-        <w:jc w:val="both"/>
+        <w:jc w:val="left"/>
         <w:rPr>
           <w:rFonts w:ascii="Arial" w:hAnsi="Arial" w:cs="Arial"/>
           <w:sz w:val="20"/>
@@ -2227,7 +2227,7 @@
           <w:numId w:val="4"/>
         </w:numPr>
         <w:spacing w:before="120" w:after="60"/>
-        <w:jc w:val="both"/>
+        <w:jc w:val="left"/>
         <w:rPr>
           <w:rFonts w:ascii="Arial" w:hAnsi="Arial" w:cs="Arial"/>
           <w:sz w:val="20"/>
@@ -2254,7 +2254,7 @@
           <w:numId w:val="4"/>
         </w:numPr>
         <w:spacing w:before="120" w:after="60"/>
-        <w:jc w:val="both"/>
+        <w:jc w:val="left"/>
         <w:rPr>
           <w:rFonts w:ascii="Arial" w:hAnsi="Arial" w:cs="Arial"/>
           <w:sz w:val="20"/>
@@ -2281,7 +2281,7 @@
           <w:numId w:val="4"/>
         </w:numPr>
         <w:spacing w:before="120" w:after="60"/>
-        <w:jc w:val="both"/>
+        <w:jc w:val="left"/>
         <w:rPr>
           <w:rFonts w:ascii="Arial" w:hAnsi="Arial" w:cs="Arial"/>
           <w:sz w:val="20"/>
@@ -2446,7 +2446,7 @@
         <w:widowControl/>
         <w:spacing w:before="0" w:after="120"/>
         <w:ind w:hanging="0" w:right="0"/>
-        <w:jc w:val="both"/>
+        <w:jc w:val="left"/>
         <w:rPr>
           <w:rStyle w:val="tpa1"/>
           <w:rFonts w:ascii="Arial" w:hAnsi="Arial" w:cs="Arial"/>
@@ -3092,7 +3092,7 @@
         <w:widowControl/>
         <w:spacing w:before="0" w:after="0"/>
         <w:ind w:hanging="0"/>
-        <w:jc w:val="both"/>
+        <w:jc w:val="left"/>
         <w:rPr>
           <w:rFonts w:ascii="Arial" w:hAnsi="Arial" w:cs="Arial"/>
           <w:sz w:val="2"/>

</xml_diff>

<commit_message>
feat(document-engine): a branding line at the end of every footer
Text only, switched by the merge data, and part of the house style the import
applies. No PDF stamp: the decision and its reasons are in the branding doc.

Claude-Session: https://claude.ai/code/session_019fFLd3rEWZKkUNU1RuQAwk
</commit_message>
<xml_diff>
--- a/packages/document-engine/templates/1.1_decision_training.docx
+++ b/packages/document-engine/templates/1.1_decision_training.docx
@@ -3112,9 +3112,11 @@
     </w:p>
     <w:sectPr>
       <w:footerReference w:type="even" r:id="rId2"/>
+      <w:footerReference w:type="default" r:id="rId3"/>
+      <w:footerReference w:type="first" r:id="rId4"/>
       <w:type w:val="nextPage"/>
       <w:pgSz w:w="11906" w:h="16838"/>
-      <w:pgMar w:left="1417" w:right="1134" w:gutter="0" w:header="0" w:top="1134" w:footer="0" w:bottom="1134"/>
+      <w:pgMar w:left="1417" w:right="1134" w:gutter="0" w:header="0" w:top="1134" w:footer="680" w:bottom="1324"/>
       <w:pgNumType w:fmt="decimal"/>
       <w:formProt w:val="false"/>
       <w:textDirection w:val="lrTb"/>
@@ -3129,7 +3131,9 @@
   <w:p>
     <w:pPr>
       <w:pStyle w:val="Footer"/>
-      <w:ind w:right="360"/>
+      <w:spacing w:before="60" w:after="0"/>
+      <w:ind w:hanging="0" w:left="0" w:right="360"/>
+      <w:jc w:val="center"/>
       <w:rPr>
         <w:b/>
         <w:sz w:val="16"/>
@@ -3137,31 +3141,70 @@
     </w:pPr>
     <w:r>
       <w:rPr>
+        <w:rStyle w:val="PageNumber"/>
+        <w:rFonts w:ascii="Arial" w:hAnsi="Arial"/>
+        <w:b w:val="false"/>
+        <w:color w:val="7A7A7A"/>
+        <w:sz w:val="15"/>
+        <w:lang w:val="ro-RO"/>
+      </w:rPr>
+      <w:t>{{#branding}}Document generat cu SSM Ușor · ssmusor.ro{{/branding}}</w:t>
+    </w:r>
+  </w:p>
+</w:ftr>
+</file>
+
+<file path=word/footer2.xml><?xml version="1.0" encoding="utf-8"?>
+<w:ftr xmlns:o="urn:schemas-microsoft-com:office:office" xmlns:r="http://schemas.openxmlformats.org/officeDocument/2006/relationships" xmlns:v="urn:schemas-microsoft-com:vml" xmlns:w="http://schemas.openxmlformats.org/wordprocessingml/2006/main" xmlns:w10="urn:schemas-microsoft-com:office:word" xmlns:wp="http://schemas.openxmlformats.org/drawingml/2006/wordprocessingDrawing" xmlns:pic="http://schemas.openxmlformats.org/drawingml/2006/picture" xmlns:wps="http://schemas.microsoft.com/office/word/2010/wordprocessingShape" xmlns:wpg="http://schemas.microsoft.com/office/word/2010/wordprocessingGroup" xmlns:mc="http://schemas.openxmlformats.org/markup-compatibility/2006" xmlns:wp14="http://schemas.microsoft.com/office/word/2010/wordprocessingDrawing" xmlns:w14="http://schemas.microsoft.com/office/word/2010/wordml" xmlns:w15="http://schemas.microsoft.com/office/word/2012/wordml" mc:Ignorable="w14 wp14 w15">
+  <w:p>
+    <w:pPr>
+      <w:pStyle w:val="Footer"/>
+      <w:spacing w:before="60" w:after="0"/>
+      <w:ind w:hanging="0" w:left="0" w:right="360"/>
+      <w:jc w:val="center"/>
+      <w:rPr>
         <w:b/>
         <w:sz w:val="16"/>
       </w:rPr>
+    </w:pPr>
+    <w:r>
+      <w:rPr>
+        <w:rStyle w:val="PageNumber"/>
+        <w:rFonts w:ascii="Arial" w:hAnsi="Arial"/>
+        <w:b w:val="false"/>
+        <w:color w:val="7A7A7A"/>
+        <w:sz w:val="15"/>
+        <w:lang w:val="ro-RO"/>
+      </w:rPr>
+      <w:t>{{#branding}}Document generat cu SSM Ușor · ssmusor.ro{{/branding}}</w:t>
     </w:r>
   </w:p>
+</w:ftr>
+</file>
+
+<file path=word/footer3.xml><?xml version="1.0" encoding="utf-8"?>
+<w:ftr xmlns:o="urn:schemas-microsoft-com:office:office" xmlns:r="http://schemas.openxmlformats.org/officeDocument/2006/relationships" xmlns:v="urn:schemas-microsoft-com:vml" xmlns:w="http://schemas.openxmlformats.org/wordprocessingml/2006/main" xmlns:w10="urn:schemas-microsoft-com:office:word" xmlns:wp="http://schemas.openxmlformats.org/drawingml/2006/wordprocessingDrawing" xmlns:pic="http://schemas.openxmlformats.org/drawingml/2006/picture" xmlns:wps="http://schemas.microsoft.com/office/word/2010/wordprocessingShape" xmlns:wpg="http://schemas.microsoft.com/office/word/2010/wordprocessingGroup" xmlns:mc="http://schemas.openxmlformats.org/markup-compatibility/2006" xmlns:wp14="http://schemas.microsoft.com/office/word/2010/wordprocessingDrawing" xmlns:w14="http://schemas.microsoft.com/office/word/2010/wordml" xmlns:w15="http://schemas.microsoft.com/office/word/2012/wordml" mc:Ignorable="w14 wp14 w15">
   <w:p>
     <w:pPr>
       <w:pStyle w:val="Footer"/>
-      <w:rPr/>
-    </w:pPr>
-    <w:r>
-      <w:rPr/>
-    </w:r>
-  </w:p>
-  <w:p>
-    <w:pPr>
-      <w:pStyle w:val="Footer"/>
+      <w:spacing w:before="60" w:after="0"/>
+      <w:ind w:hanging="0" w:left="0" w:right="360"/>
+      <w:jc w:val="center"/>
       <w:rPr>
-        <w:rStyle w:val="PageNumber"/>
+        <w:b/>
         <w:sz w:val="16"/>
-        <w:lang w:val="de-DE"/>
       </w:rPr>
     </w:pPr>
     <w:r>
-      <w:rPr/>
+      <w:rPr>
+        <w:rStyle w:val="PageNumber"/>
+        <w:rFonts w:ascii="Arial" w:hAnsi="Arial"/>
+        <w:b w:val="false"/>
+        <w:color w:val="7A7A7A"/>
+        <w:sz w:val="15"/>
+        <w:lang w:val="ro-RO"/>
+      </w:rPr>
+      <w:t>{{#branding}}Document generat cu SSM Ușor · ssmusor.ro{{/branding}}</w:t>
     </w:r>
   </w:p>
 </w:ftr>

</xml_diff>

<commit_message>
feat(document-engine): the control regulation, and an import that scales
The internal regulation on the employer's own checks is the first of the
longer originals. Importing it needed three repairs the decisions did not:
the box of document details in the header rebuilt with real page fields,
the tab-aligned hand-over lines replaced with the two-column block of the
covers, and the schedule table redrawn from a definition.

The wording dictionary grows from a hand-typed list to 2,500 entries
derived from both packs with LibreOffice's Romanian spelling dictionary,
plus context rules for words that are right both ways. Only the words a
document contains are applied to it.

Claude-Session: https://claude.ai/code/session_019fFLd3rEWZKkUNU1RuQAwk
</commit_message>
<xml_diff>
--- a/packages/document-engine/templates/1.1_decision_training.docx
+++ b/packages/document-engine/templates/1.1_decision_training.docx
@@ -3078,7 +3078,6 @@
                 <w:color w:val="auto"/>
                 <w:sz w:val="20"/>
                 <w:szCs w:val="20"/>
-                <w:u w:val="none"/>
                 <w:lang w:val="ro-RO"/>
               </w:rPr>
             </w:r>
@@ -3142,10 +3141,11 @@
     <w:r>
       <w:rPr>
         <w:rStyle w:val="PageNumber"/>
-        <w:rFonts w:ascii="Arial" w:hAnsi="Arial"/>
+        <w:rFonts w:eastAsia="Arial" w:cs="Arial" w:ascii="Arial" w:hAnsi="Arial"/>
         <w:b w:val="false"/>
-        <w:color w:val="7A7A7A"/>
-        <w:sz w:val="15"/>
+        <w:color w:val="auto"/>
+        <w:sz w:val="16"/>
+        <w:szCs w:val="16"/>
         <w:lang w:val="ro-RO"/>
       </w:rPr>
       <w:t>{{#branding}}Document generat cu SSM Ușor · ssmusor.ro{{/branding}}</w:t>
@@ -3170,10 +3170,11 @@
     <w:r>
       <w:rPr>
         <w:rStyle w:val="PageNumber"/>
-        <w:rFonts w:ascii="Arial" w:hAnsi="Arial"/>
+        <w:rFonts w:eastAsia="Arial" w:cs="Arial" w:ascii="Arial" w:hAnsi="Arial"/>
         <w:b w:val="false"/>
-        <w:color w:val="7A7A7A"/>
-        <w:sz w:val="15"/>
+        <w:color w:val="auto"/>
+        <w:sz w:val="16"/>
+        <w:szCs w:val="16"/>
         <w:lang w:val="ro-RO"/>
       </w:rPr>
       <w:t>{{#branding}}Document generat cu SSM Ușor · ssmusor.ro{{/branding}}</w:t>
@@ -3198,10 +3199,11 @@
     <w:r>
       <w:rPr>
         <w:rStyle w:val="PageNumber"/>
-        <w:rFonts w:ascii="Arial" w:hAnsi="Arial"/>
+        <w:rFonts w:eastAsia="Arial" w:cs="Arial" w:ascii="Arial" w:hAnsi="Arial"/>
         <w:b w:val="false"/>
-        <w:color w:val="7A7A7A"/>
-        <w:sz w:val="15"/>
+        <w:color w:val="auto"/>
+        <w:sz w:val="16"/>
+        <w:szCs w:val="16"/>
         <w:lang w:val="ro-RO"/>
       </w:rPr>
       <w:t>{{#branding}}Document generat cu SSM Ușor · ssmusor.ro{{/branding}}</w:t>
@@ -3821,7 +3823,6 @@
         <w:rFonts w:ascii="Times New Roman" w:hAnsi="Times New Roman" w:cs="Times New Roman" w:hint="default"/>
         <w:b/>
         <w:i w:val="false"/>
-        <w:color w:val="000000"/>
         <w:sz w:val="18"/>
         <w:szCs w:val="18"/>
       </w:rPr>
@@ -4056,7 +4057,6 @@
         <w:rFonts w:ascii="Arial" w:hAnsi="Arial" w:cs="Arial"/>
         <w:b/>
         <w:i w:val="false"/>
-        <w:color w:val="92D050"/>
         <w:sz w:val="18"/>
         <w:szCs w:val="18"/>
         <w:lang w:val="it-CH"/>
@@ -4077,7 +4077,6 @@
         <w:rFonts w:ascii="Arial" w:hAnsi="Arial" w:cs="Arial"/>
         <w:b/>
         <w:i w:val="false"/>
-        <w:color w:val="FF0000"/>
         <w:sz w:val="20"/>
         <w:szCs w:val="20"/>
         <w:lang w:val="es-ES_tradnl"/>
@@ -4098,7 +4097,6 @@
         <w:rFonts w:ascii="Times New Roman" w:hAnsi="Times New Roman" w:cs="Times New Roman" w:hint="default"/>
         <w:b/>
         <w:i w:val="false"/>
-        <w:color w:val="000000"/>
         <w:sz w:val="18"/>
         <w:szCs w:val="18"/>
         <w:lang w:val="it-CH"/>
@@ -4118,7 +4116,6 @@
       <w:rPr>
         <w:b/>
         <w:i w:val="false"/>
-        <w:color w:val="000000"/>
         <w:sz w:val="18"/>
         <w:szCs w:val="18"/>
         <w:lang w:val="it-CH"/>
@@ -4152,7 +4149,6 @@
       </w:pPr>
       <w:rPr>
         <w:b/>
-        <w:color w:val="8F0000"/>
       </w:rPr>
     </w:lvl>
     <w:lvl w:ilvl="6">
@@ -5102,7 +5098,6 @@
       <w:rFonts w:ascii="Times New Roman" w:hAnsi="Times New Roman" w:cs="Times New Roman"/>
       <w:b/>
       <w:i w:val="false"/>
-      <w:color w:val="000000"/>
       <w:sz w:val="18"/>
       <w:szCs w:val="18"/>
     </w:rPr>
@@ -5141,7 +5136,6 @@
       <w:rFonts w:ascii="Arial" w:hAnsi="Arial" w:cs="Arial"/>
       <w:b/>
       <w:i w:val="false"/>
-      <w:color w:val="92D050"/>
       <w:sz w:val="18"/>
       <w:szCs w:val="18"/>
       <w:lang w:val="it-CH"/>
@@ -5153,7 +5147,6 @@
       <w:rFonts w:ascii="Arial" w:hAnsi="Arial" w:cs="Arial"/>
       <w:b/>
       <w:i w:val="false"/>
-      <w:color w:val="FF0000"/>
       <w:sz w:val="20"/>
       <w:szCs w:val="20"/>
       <w:lang w:val="es-ES_tradnl"/>
@@ -5165,7 +5158,6 @@
       <w:rFonts w:ascii="Times New Roman" w:hAnsi="Times New Roman" w:cs="Times New Roman"/>
       <w:b/>
       <w:i w:val="false"/>
-      <w:color w:val="000000"/>
       <w:sz w:val="18"/>
       <w:szCs w:val="18"/>
       <w:lang w:val="it-CH"/>
@@ -5176,7 +5168,6 @@
     <w:rPr>
       <w:b/>
       <w:i w:val="false"/>
-      <w:color w:val="000000"/>
       <w:sz w:val="18"/>
       <w:szCs w:val="18"/>
       <w:lang w:val="it-CH"/>
@@ -5192,7 +5183,6 @@
     <w:name w:val="WW8Num11z5"/>
     <w:rPr>
       <w:b/>
-      <w:color w:val="8F0000"/>
     </w:rPr>
   </w:style>
   <w:style w:type="character" w:styleId="WW8Num12z0">
@@ -5325,7 +5315,6 @@
     <w:rPr>
       <w:b/>
       <w:bCs/>
-      <w:color w:val="008F00"/>
     </w:rPr>
   </w:style>
   <w:style w:type="character" w:styleId="spar">
@@ -5337,6 +5326,149 @@
     <w:name w:val="s_lit_bdy"/>
     <w:basedOn w:val="DefaultParagraphFont"/>
     <w:rPr/>
+  </w:style>
+  <w:style w:type="character" w:styleId="FootnoteCharacters">
+    <w:name w:val="Footnote Characters"/>
+    <w:rPr/>
+  </w:style>
+  <w:style w:type="character" w:styleId="CaptionCharacters">
+    <w:name w:val="Caption Characters"/>
+    <w:rPr/>
+  </w:style>
+  <w:style w:type="character" w:styleId="DropCaps">
+    <w:name w:val="Drop Caps"/>
+    <w:rPr/>
+  </w:style>
+  <w:style w:type="character" w:styleId="NumberingSymbols">
+    <w:name w:val="Numbering Symbols"/>
+    <w:rPr/>
+  </w:style>
+  <w:style w:type="character" w:styleId="Bullets">
+    <w:name w:val="Bullets"/>
+    <w:rPr>
+      <w:rFonts w:ascii="OpenSymbol" w:hAnsi="OpenSymbol" w:eastAsia="OpenSymbol" w:cs="OpenSymbol"/>
+    </w:rPr>
+  </w:style>
+  <w:style w:type="character" w:styleId="Hyperlink">
+    <w:name w:val="Hyperlink"/>
+    <w:rPr>
+      <w:u w:val="single"/>
+    </w:rPr>
+  </w:style>
+  <w:style w:type="character" w:styleId="FollowedHyperlink">
+    <w:name w:val="FollowedHyperlink"/>
+    <w:rPr>
+      <w:u w:val="single"/>
+    </w:rPr>
+  </w:style>
+  <w:style w:type="character" w:styleId="Placeholder">
+    <w:name w:val="Placeholder"/>
+    <w:rPr>
+      <w:smallCaps/>
+      <w:u w:val="dotted"/>
+    </w:rPr>
+  </w:style>
+  <w:style w:type="character" w:styleId="IndexLink">
+    <w:name w:val="Index Link"/>
+    <w:rPr/>
+  </w:style>
+  <w:style w:type="character" w:styleId="EndnoteCharacters">
+    <w:name w:val="Endnote Characters"/>
+    <w:rPr/>
+  </w:style>
+  <w:style w:type="character" w:styleId="LineNumber">
+    <w:name w:val="line number"/>
+    <w:rPr/>
+  </w:style>
+  <w:style w:type="character" w:styleId="MainIndexEntry">
+    <w:name w:val="Main Index Entry"/>
+    <w:rPr>
+      <w:b/>
+      <w:bCs/>
+    </w:rPr>
+  </w:style>
+  <w:style w:type="character" w:styleId="FootnoteReference">
+    <w:name w:val="footnote reference"/>
+    <w:rPr>
+      <w:vertAlign w:val="superscript"/>
+    </w:rPr>
+  </w:style>
+  <w:style w:type="character" w:styleId="EndnoteReference">
+    <w:name w:val="endnote reference"/>
+    <w:rPr>
+      <w:vertAlign w:val="superscript"/>
+    </w:rPr>
+  </w:style>
+  <w:style w:type="character" w:styleId="Rubies">
+    <w:name w:val="Rubies"/>
+    <w:rPr>
+      <w:sz w:val="12"/>
+      <w:szCs w:val="12"/>
+      <w:u w:val="none"/>
+      <w:em w:val="none"/>
+    </w:rPr>
+  </w:style>
+  <w:style w:type="character" w:styleId="VerticalNumberingSymbols">
+    <w:name w:val="Vertical Numbering Symbols"/>
+    <w:rPr>
+      <w:eastAsianLayout w:vert="true"/>
+    </w:rPr>
+  </w:style>
+  <w:style w:type="character" w:styleId="Emphasis">
+    <w:name w:val="Emphasis"/>
+    <w:rPr>
+      <w:i/>
+      <w:iCs/>
+    </w:rPr>
+  </w:style>
+  <w:style w:type="character" w:styleId="Quotation">
+    <w:name w:val="Quotation"/>
+    <w:rPr>
+      <w:i/>
+      <w:iCs/>
+    </w:rPr>
+  </w:style>
+  <w:style w:type="character" w:styleId="Strong">
+    <w:name w:val="Strong"/>
+    <w:rPr>
+      <w:b/>
+      <w:bCs/>
+    </w:rPr>
+  </w:style>
+  <w:style w:type="character" w:styleId="SourceText">
+    <w:name w:val="Source Text"/>
+    <w:rPr>
+      <w:rFonts w:ascii="Liberation Mono" w:hAnsi="Liberation Mono" w:eastAsia="Noto Sans Mono CJK SC" w:cs="Liberation Mono"/>
+    </w:rPr>
+  </w:style>
+  <w:style w:type="character" w:styleId="Example">
+    <w:name w:val="Example"/>
+    <w:rPr>
+      <w:rFonts w:ascii="Liberation Mono" w:hAnsi="Liberation Mono" w:eastAsia="Noto Sans Mono CJK SC" w:cs="Liberation Mono"/>
+    </w:rPr>
+  </w:style>
+  <w:style w:type="character" w:styleId="UserEntry">
+    <w:name w:val="User Entry"/>
+    <w:rPr>
+      <w:rFonts w:ascii="Liberation Mono" w:hAnsi="Liberation Mono" w:eastAsia="Noto Sans Mono CJK SC" w:cs="Liberation Mono"/>
+    </w:rPr>
+  </w:style>
+  <w:style w:type="character" w:styleId="Variable">
+    <w:name w:val="Variable"/>
+    <w:rPr>
+      <w:i/>
+      <w:iCs/>
+    </w:rPr>
+  </w:style>
+  <w:style w:type="character" w:styleId="Definition">
+    <w:name w:val="Definition"/>
+    <w:rPr/>
+  </w:style>
+  <w:style w:type="character" w:styleId="Teletype">
+    <w:name w:val="Teletype"/>
+    <w:rPr>
+      <w:rFonts w:ascii="Liberation Mono" w:hAnsi="Liberation Mono" w:eastAsia="Noto Sans Mono CJK SC" w:cs="Liberation Mono"/>
+    </w:rPr>
   </w:style>
   <w:style w:type="paragraph" w:styleId="Heading">
     <w:name w:val="Heading"/>

</xml_diff>

<commit_message>
feat(document-engine): the two tests, with their specimens
The hiring test and the yearly test. The import learns what a test is: a
question typed with its number, answers that start again from a) under
each question (the originals run one list through the whole file, so the
specimen's answers read d, e, f), answers typed by hand with their lines
broken by the Enter key, and a specimen that opens on a new page. The form
and the answer grids are drawn from a definition, with room to write.

Also: letter spacing reset, space around a table given by the paragraphs
beside it because a Word file has no table spacing, and the old code-page
letters (ã, º, þ) read as the Romanian ones they stood for.

Claude-Session: https://claude.ai/code/session_019fFLd3rEWZKkUNU1RuQAwk
</commit_message>
<xml_diff>
--- a/packages/document-engine/templates/1.1_decision_training.docx
+++ b/packages/document-engine/templates/1.1_decision_training.docx
@@ -26,6 +26,8 @@
           <w:rFonts w:eastAsia="Arial" w:cs="Arial" w:ascii="Arial" w:hAnsi="Arial"/>
           <w:b/>
           <w:color w:val="auto"/>
+          <w:spacing w:val="0"/>
+          <w:w w:val="100"/>
           <w:sz w:val="24"/>
           <w:szCs w:val="20"/>
           <w:lang w:val="ro-RO"/>
@@ -54,6 +56,8 @@
         <w:rPr>
           <w:rFonts w:eastAsia="Arial" w:cs="Arial" w:ascii="Arial" w:hAnsi="Arial"/>
           <w:color w:val="auto"/>
+          <w:spacing w:val="0"/>
+          <w:w w:val="100"/>
           <w:sz w:val="20"/>
           <w:szCs w:val="20"/>
           <w:lang w:val="ro-RO"/>
@@ -82,6 +86,8 @@
         <w:rPr>
           <w:rFonts w:eastAsia="Arial" w:cs="Arial" w:ascii="Arial" w:hAnsi="Arial"/>
           <w:color w:val="auto"/>
+          <w:spacing w:val="0"/>
+          <w:w w:val="100"/>
           <w:sz w:val="20"/>
           <w:szCs w:val="20"/>
           <w:lang w:val="ro-RO"/>
@@ -92,6 +98,8 @@
         <w:rPr>
           <w:rFonts w:eastAsia="Arial" w:cs="Arial" w:ascii="Arial" w:hAnsi="Arial"/>
           <w:color w:val="auto"/>
+          <w:spacing w:val="0"/>
+          <w:w w:val="100"/>
           <w:sz w:val="20"/>
           <w:szCs w:val="20"/>
           <w:lang w:val="ro-RO"/>
@@ -102,6 +110,8 @@
         <w:rPr>
           <w:rFonts w:eastAsia="Arial" w:cs="Arial" w:ascii="Arial" w:hAnsi="Arial"/>
           <w:color w:val="auto"/>
+          <w:spacing w:val="0"/>
+          <w:w w:val="100"/>
           <w:sz w:val="20"/>
           <w:szCs w:val="20"/>
           <w:lang w:val="ro-RO"/>
@@ -112,6 +122,8 @@
         <w:rPr>
           <w:rFonts w:eastAsia="Arial" w:cs="Arial" w:ascii="Arial" w:hAnsi="Arial"/>
           <w:color w:val="auto"/>
+          <w:spacing w:val="0"/>
+          <w:w w:val="100"/>
           <w:sz w:val="20"/>
           <w:szCs w:val="20"/>
           <w:lang w:val="ro-RO"/>
@@ -123,6 +135,8 @@
           <w:rStyle w:val="PageNumber"/>
           <w:rFonts w:eastAsia="Arial" w:cs="Arial" w:ascii="Arial" w:hAnsi="Arial"/>
           <w:color w:val="auto"/>
+          <w:spacing w:val="0"/>
+          <w:w w:val="100"/>
           <w:sz w:val="20"/>
           <w:szCs w:val="20"/>
           <w:lang w:val="ro-RO"/>
@@ -133,6 +147,8 @@
         <w:rPr>
           <w:rFonts w:eastAsia="Arial" w:cs="Arial" w:ascii="Arial" w:hAnsi="Arial"/>
           <w:color w:val="auto"/>
+          <w:spacing w:val="0"/>
+          <w:w w:val="100"/>
           <w:sz w:val="20"/>
           <w:szCs w:val="20"/>
           <w:lang w:val="ro-RO"/>
@@ -160,6 +176,8 @@
           <w:rFonts w:eastAsia="Arial" w:cs="Arial" w:ascii="Arial" w:hAnsi="Arial"/>
           <w:b/>
           <w:color w:val="auto"/>
+          <w:spacing w:val="0"/>
+          <w:w w:val="100"/>
           <w:sz w:val="20"/>
           <w:szCs w:val="20"/>
           <w:lang w:val="ro-RO"/>
@@ -187,6 +205,8 @@
         <w:rPr>
           <w:rFonts w:eastAsia="Arial" w:cs="Arial" w:ascii="Arial" w:hAnsi="Arial"/>
           <w:color w:val="auto"/>
+          <w:spacing w:val="0"/>
+          <w:w w:val="100"/>
           <w:sz w:val="20"/>
           <w:szCs w:val="20"/>
           <w:lang w:val="ro-RO"/>
@@ -198,6 +218,8 @@
           <w:rStyle w:val="PageNumber"/>
           <w:rFonts w:eastAsia="Arial" w:cs="Arial" w:ascii="Arial" w:hAnsi="Arial"/>
           <w:color w:val="auto"/>
+          <w:spacing w:val="0"/>
+          <w:w w:val="100"/>
           <w:sz w:val="20"/>
           <w:szCs w:val="20"/>
           <w:lang w:val="ro-RO"/>
@@ -208,6 +230,8 @@
         <w:rPr>
           <w:rFonts w:eastAsia="Arial" w:cs="Arial" w:ascii="Arial" w:hAnsi="Arial"/>
           <w:color w:val="auto"/>
+          <w:spacing w:val="0"/>
+          <w:w w:val="100"/>
           <w:sz w:val="20"/>
           <w:szCs w:val="20"/>
           <w:lang w:val="ro-RO"/>
@@ -236,6 +260,8 @@
         <w:rPr>
           <w:rFonts w:eastAsia="Arial" w:cs="Arial" w:ascii="Arial" w:hAnsi="Arial"/>
           <w:color w:val="auto"/>
+          <w:spacing w:val="0"/>
+          <w:w w:val="100"/>
           <w:sz w:val="20"/>
           <w:szCs w:val="20"/>
           <w:lang w:val="ro-RO"/>
@@ -247,6 +273,8 @@
           <w:rStyle w:val="PageNumber"/>
           <w:rFonts w:eastAsia="Arial" w:cs="Arial" w:ascii="Arial" w:hAnsi="Arial"/>
           <w:color w:val="auto"/>
+          <w:spacing w:val="0"/>
+          <w:w w:val="100"/>
           <w:sz w:val="20"/>
           <w:szCs w:val="20"/>
           <w:lang w:val="ro-RO"/>
@@ -275,6 +303,8 @@
         <w:rPr>
           <w:rFonts w:eastAsia="Arial" w:cs="Arial" w:ascii="Arial" w:hAnsi="Arial"/>
           <w:color w:val="auto"/>
+          <w:spacing w:val="0"/>
+          <w:w w:val="100"/>
           <w:sz w:val="20"/>
           <w:szCs w:val="20"/>
           <w:lang w:val="ro-RO"/>
@@ -286,6 +316,8 @@
           <w:rStyle w:val="PageNumber"/>
           <w:rFonts w:eastAsia="Arial" w:cs="Arial" w:ascii="Arial" w:hAnsi="Arial"/>
           <w:color w:val="auto"/>
+          <w:spacing w:val="0"/>
+          <w:w w:val="100"/>
           <w:sz w:val="20"/>
           <w:szCs w:val="20"/>
           <w:lang w:val="ro-RO"/>
@@ -296,6 +328,8 @@
         <w:rPr>
           <w:rFonts w:eastAsia="Arial" w:cs="Arial" w:ascii="Arial" w:hAnsi="Arial"/>
           <w:color w:val="auto"/>
+          <w:spacing w:val="0"/>
+          <w:w w:val="100"/>
           <w:sz w:val="20"/>
           <w:szCs w:val="20"/>
           <w:lang w:val="ro-RO"/>
@@ -306,6 +340,8 @@
         <w:rPr>
           <w:rFonts w:eastAsia="Arial" w:cs="Arial" w:ascii="Arial" w:hAnsi="Arial"/>
           <w:color w:val="auto"/>
+          <w:spacing w:val="0"/>
+          <w:w w:val="100"/>
           <w:sz w:val="20"/>
           <w:szCs w:val="20"/>
           <w:lang w:val="ro-RO"/>
@@ -316,6 +352,8 @@
         <w:rPr>
           <w:rFonts w:eastAsia="Arial" w:cs="Arial" w:ascii="Arial" w:hAnsi="Arial"/>
           <w:color w:val="auto"/>
+          <w:spacing w:val="0"/>
+          <w:w w:val="100"/>
           <w:sz w:val="20"/>
           <w:szCs w:val="20"/>
           <w:lang w:val="ro-RO"/>
@@ -326,6 +364,8 @@
         <w:rPr>
           <w:rFonts w:eastAsia="Arial" w:cs="Arial" w:ascii="Arial" w:hAnsi="Arial"/>
           <w:color w:val="auto"/>
+          <w:spacing w:val="0"/>
+          <w:w w:val="100"/>
           <w:sz w:val="20"/>
           <w:szCs w:val="20"/>
           <w:lang w:val="ro-RO"/>
@@ -336,6 +376,8 @@
         <w:rPr>
           <w:rFonts w:eastAsia="Arial" w:cs="Arial" w:ascii="Arial" w:hAnsi="Arial"/>
           <w:color w:val="auto"/>
+          <w:spacing w:val="0"/>
+          <w:w w:val="100"/>
           <w:sz w:val="20"/>
           <w:szCs w:val="20"/>
           <w:lang w:val="ro-RO"/>
@@ -364,6 +406,8 @@
         <w:rPr>
           <w:rFonts w:eastAsia="Arial" w:cs="Arial" w:ascii="Arial" w:hAnsi="Arial"/>
           <w:color w:val="auto"/>
+          <w:spacing w:val="0"/>
+          <w:w w:val="100"/>
           <w:sz w:val="20"/>
           <w:szCs w:val="20"/>
           <w:lang w:val="ro-RO"/>
@@ -392,6 +436,8 @@
         <w:rPr>
           <w:rFonts w:eastAsia="Arial" w:cs="Arial" w:ascii="Arial" w:hAnsi="Arial"/>
           <w:color w:val="auto"/>
+          <w:spacing w:val="0"/>
+          <w:w w:val="100"/>
           <w:sz w:val="20"/>
           <w:szCs w:val="20"/>
           <w:lang w:val="ro-RO"/>
@@ -403,6 +449,8 @@
           <w:rStyle w:val="PageNumber"/>
           <w:rFonts w:eastAsia="Arial" w:cs="Arial" w:ascii="Arial" w:hAnsi="Arial"/>
           <w:color w:val="auto"/>
+          <w:spacing w:val="0"/>
+          <w:w w:val="100"/>
           <w:sz w:val="20"/>
           <w:szCs w:val="20"/>
           <w:lang w:val="ro-RO"/>
@@ -433,6 +481,8 @@
           <w:b/>
           <w:bCs/>
           <w:color w:val="auto"/>
+          <w:spacing w:val="0"/>
+          <w:w w:val="100"/>
           <w:sz w:val="20"/>
           <w:szCs w:val="20"/>
           <w:lang w:val="ro-RO"/>
@@ -460,6 +510,8 @@
         <w:rPr>
           <w:rFonts w:eastAsia="Arial" w:cs="Arial" w:ascii="Arial" w:hAnsi="Arial"/>
           <w:color w:val="auto"/>
+          <w:spacing w:val="0"/>
+          <w:w w:val="100"/>
           <w:sz w:val="20"/>
           <w:szCs w:val="20"/>
           <w:lang w:val="ro-RO"/>
@@ -471,6 +523,8 @@
           <w:rStyle w:val="PageNumber"/>
           <w:rFonts w:eastAsia="Arial" w:cs="Arial" w:ascii="Arial" w:hAnsi="Arial"/>
           <w:color w:val="auto"/>
+          <w:spacing w:val="0"/>
+          <w:w w:val="100"/>
           <w:sz w:val="20"/>
           <w:szCs w:val="20"/>
           <w:lang w:val="ro-RO"/>
@@ -481,6 +535,8 @@
         <w:rPr>
           <w:rFonts w:eastAsia="Arial" w:cs="Arial" w:ascii="Arial" w:hAnsi="Arial"/>
           <w:color w:val="auto"/>
+          <w:spacing w:val="0"/>
+          <w:w w:val="100"/>
           <w:sz w:val="20"/>
           <w:szCs w:val="20"/>
           <w:lang w:val="ro-RO"/>
@@ -510,6 +566,8 @@
           <w:rStyle w:val="tpa1"/>
           <w:rFonts w:eastAsia="Arial" w:cs="Arial" w:ascii="Arial" w:hAnsi="Arial"/>
           <w:color w:val="auto"/>
+          <w:spacing w:val="0"/>
+          <w:w w:val="100"/>
           <w:sz w:val="20"/>
           <w:szCs w:val="20"/>
           <w:lang w:val="ro-RO"/>
@@ -522,6 +580,8 @@
           <w:rFonts w:eastAsia="Arial" w:cs="Arial" w:ascii="Arial" w:hAnsi="Arial"/>
           <w:b/>
           <w:color w:val="auto"/>
+          <w:spacing w:val="0"/>
+          <w:w w:val="100"/>
           <w:sz w:val="20"/>
           <w:szCs w:val="20"/>
           <w:lang w:val="ro-RO"/>
@@ -533,6 +593,8 @@
           <w:rStyle w:val="tpa1"/>
           <w:rFonts w:eastAsia="Arial" w:cs="Arial" w:ascii="Arial" w:hAnsi="Arial"/>
           <w:color w:val="auto"/>
+          <w:spacing w:val="0"/>
+          <w:w w:val="100"/>
           <w:sz w:val="20"/>
           <w:szCs w:val="20"/>
           <w:lang w:val="ro-RO"/>
@@ -560,6 +622,8 @@
         <w:rPr>
           <w:rFonts w:eastAsia="Arial" w:cs="Arial" w:ascii="Arial" w:hAnsi="Arial"/>
           <w:color w:val="auto"/>
+          <w:spacing w:val="0"/>
+          <w:w w:val="100"/>
           <w:sz w:val="20"/>
           <w:szCs w:val="20"/>
           <w:lang w:val="ro-RO"/>
@@ -587,6 +651,8 @@
         <w:rPr>
           <w:rFonts w:eastAsia="Arial" w:cs="Arial" w:ascii="Arial" w:hAnsi="Arial"/>
           <w:color w:val="auto"/>
+          <w:spacing w:val="0"/>
+          <w:w w:val="100"/>
           <w:sz w:val="20"/>
           <w:szCs w:val="20"/>
           <w:lang w:val="ro-RO"/>
@@ -617,6 +683,8 @@
           <w:rStyle w:val="tli1"/>
           <w:rFonts w:eastAsia="Arial" w:cs="Arial" w:ascii="Arial" w:hAnsi="Arial"/>
           <w:color w:val="auto"/>
+          <w:spacing w:val="0"/>
+          <w:w w:val="100"/>
           <w:sz w:val="20"/>
           <w:szCs w:val="20"/>
           <w:lang w:val="ro-RO"/>
@@ -648,6 +716,8 @@
           <w:rStyle w:val="tli1"/>
           <w:rFonts w:eastAsia="Arial" w:cs="Arial" w:ascii="Arial" w:hAnsi="Arial"/>
           <w:color w:val="auto"/>
+          <w:spacing w:val="0"/>
+          <w:w w:val="100"/>
           <w:sz w:val="20"/>
           <w:szCs w:val="20"/>
           <w:lang w:val="ro-RO"/>
@@ -679,6 +749,8 @@
           <w:rStyle w:val="tli1"/>
           <w:rFonts w:eastAsia="Arial" w:cs="Arial" w:ascii="Arial" w:hAnsi="Arial"/>
           <w:color w:val="auto"/>
+          <w:spacing w:val="0"/>
+          <w:w w:val="100"/>
           <w:sz w:val="20"/>
           <w:szCs w:val="20"/>
           <w:lang w:val="ro-RO"/>
@@ -710,6 +782,8 @@
           <w:rStyle w:val="tli1"/>
           <w:rFonts w:eastAsia="Arial" w:cs="Arial" w:ascii="Arial" w:hAnsi="Arial"/>
           <w:color w:val="auto"/>
+          <w:spacing w:val="0"/>
+          <w:w w:val="100"/>
           <w:sz w:val="20"/>
           <w:szCs w:val="20"/>
           <w:lang w:val="ro-RO"/>
@@ -739,6 +813,8 @@
           <w:rStyle w:val="tpa1"/>
           <w:rFonts w:eastAsia="Arial" w:cs="Arial" w:ascii="Arial" w:hAnsi="Arial"/>
           <w:color w:val="auto"/>
+          <w:spacing w:val="0"/>
+          <w:w w:val="100"/>
           <w:sz w:val="20"/>
           <w:szCs w:val="20"/>
           <w:lang w:val="ro-RO"/>
@@ -751,6 +827,8 @@
           <w:rFonts w:eastAsia="Arial" w:cs="Arial" w:ascii="Arial" w:hAnsi="Arial"/>
           <w:b/>
           <w:color w:val="auto"/>
+          <w:spacing w:val="0"/>
+          <w:w w:val="100"/>
           <w:sz w:val="20"/>
           <w:szCs w:val="20"/>
           <w:lang w:val="ro-RO"/>
@@ -762,6 +840,8 @@
           <w:rStyle w:val="tpa1"/>
           <w:rFonts w:eastAsia="Arial" w:cs="Arial" w:ascii="Arial" w:hAnsi="Arial"/>
           <w:color w:val="auto"/>
+          <w:spacing w:val="0"/>
+          <w:w w:val="100"/>
           <w:sz w:val="20"/>
           <w:szCs w:val="20"/>
           <w:lang w:val="ro-RO"/>
@@ -789,6 +869,8 @@
         <w:rPr>
           <w:rFonts w:eastAsia="Arial" w:cs="Arial" w:ascii="Arial" w:hAnsi="Arial"/>
           <w:color w:val="auto"/>
+          <w:spacing w:val="0"/>
+          <w:w w:val="100"/>
           <w:sz w:val="20"/>
           <w:szCs w:val="20"/>
           <w:lang w:val="ro-RO"/>
@@ -816,6 +898,8 @@
         <w:rPr>
           <w:rFonts w:eastAsia="Arial" w:cs="Arial" w:ascii="Arial" w:hAnsi="Arial"/>
           <w:color w:val="auto"/>
+          <w:spacing w:val="0"/>
+          <w:w w:val="100"/>
           <w:sz w:val="20"/>
           <w:szCs w:val="20"/>
           <w:lang w:val="ro-RO"/>
@@ -844,6 +928,8 @@
           <w:rStyle w:val="tli1"/>
           <w:rFonts w:eastAsia="Arial" w:cs="Arial" w:ascii="Arial" w:hAnsi="Arial"/>
           <w:color w:val="auto"/>
+          <w:spacing w:val="0"/>
+          <w:w w:val="100"/>
           <w:sz w:val="20"/>
           <w:szCs w:val="20"/>
           <w:lang w:val="ro-RO"/>
@@ -873,6 +959,8 @@
           <w:rStyle w:val="tli1"/>
           <w:rFonts w:eastAsia="Arial" w:cs="Arial" w:ascii="Arial" w:hAnsi="Arial"/>
           <w:color w:val="auto"/>
+          <w:spacing w:val="0"/>
+          <w:w w:val="100"/>
           <w:sz w:val="20"/>
           <w:szCs w:val="20"/>
           <w:lang w:val="ro-RO"/>
@@ -902,6 +990,8 @@
           <w:rStyle w:val="tli1"/>
           <w:rFonts w:eastAsia="Arial" w:cs="Arial" w:ascii="Arial" w:hAnsi="Arial"/>
           <w:color w:val="auto"/>
+          <w:spacing w:val="0"/>
+          <w:w w:val="100"/>
           <w:sz w:val="20"/>
           <w:szCs w:val="20"/>
           <w:lang w:val="ro-RO"/>
@@ -931,6 +1021,8 @@
           <w:rStyle w:val="tli1"/>
           <w:rFonts w:eastAsia="Arial" w:cs="Arial" w:ascii="Arial" w:hAnsi="Arial"/>
           <w:color w:val="auto"/>
+          <w:spacing w:val="0"/>
+          <w:w w:val="100"/>
           <w:sz w:val="20"/>
           <w:szCs w:val="20"/>
           <w:lang w:val="ro-RO"/>
@@ -962,6 +1054,8 @@
           <w:rStyle w:val="tal1"/>
           <w:rFonts w:eastAsia="Arial" w:cs="Arial" w:ascii="Arial" w:hAnsi="Arial"/>
           <w:color w:val="auto"/>
+          <w:spacing w:val="0"/>
+          <w:w w:val="100"/>
           <w:sz w:val="20"/>
           <w:szCs w:val="20"/>
           <w:lang w:val="ro-RO"/>
@@ -973,6 +1067,8 @@
           <w:rFonts w:eastAsia="Arial" w:cs="Arial" w:ascii="Arial" w:hAnsi="Arial"/>
           <w:i/>
           <w:color w:val="auto"/>
+          <w:spacing w:val="0"/>
+          <w:w w:val="100"/>
           <w:sz w:val="20"/>
           <w:szCs w:val="20"/>
           <w:lang w:val="ro-RO"/>
@@ -984,6 +1080,8 @@
           <w:rStyle w:val="tal1"/>
           <w:rFonts w:eastAsia="Arial" w:cs="Arial" w:ascii="Arial" w:hAnsi="Arial"/>
           <w:color w:val="auto"/>
+          <w:spacing w:val="0"/>
+          <w:w w:val="100"/>
           <w:sz w:val="20"/>
           <w:szCs w:val="20"/>
           <w:lang w:val="ro-RO"/>
@@ -1012,6 +1110,8 @@
           <w:rStyle w:val="tpa1"/>
           <w:rFonts w:eastAsia="Arial" w:cs="Arial" w:ascii="Arial" w:hAnsi="Arial"/>
           <w:color w:val="auto"/>
+          <w:spacing w:val="0"/>
+          <w:w w:val="100"/>
           <w:sz w:val="20"/>
           <w:szCs w:val="20"/>
           <w:lang w:val="ro-RO"/>
@@ -1024,6 +1124,8 @@
           <w:rFonts w:eastAsia="Arial" w:cs="Arial" w:ascii="Arial" w:hAnsi="Arial"/>
           <w:b/>
           <w:color w:val="auto"/>
+          <w:spacing w:val="0"/>
+          <w:w w:val="100"/>
           <w:sz w:val="20"/>
           <w:szCs w:val="20"/>
           <w:lang w:val="ro-RO"/>
@@ -1035,6 +1137,8 @@
           <w:rStyle w:val="tpa1"/>
           <w:rFonts w:eastAsia="Arial" w:cs="Arial" w:ascii="Arial" w:hAnsi="Arial"/>
           <w:color w:val="auto"/>
+          <w:spacing w:val="0"/>
+          <w:w w:val="100"/>
           <w:sz w:val="20"/>
           <w:szCs w:val="20"/>
           <w:lang w:val="ro-RO"/>
@@ -1064,6 +1168,8 @@
           <w:rStyle w:val="tpa1"/>
           <w:rFonts w:eastAsia="Arial" w:cs="Arial" w:ascii="Arial" w:hAnsi="Arial"/>
           <w:color w:val="auto"/>
+          <w:spacing w:val="0"/>
+          <w:w w:val="100"/>
           <w:sz w:val="20"/>
           <w:szCs w:val="20"/>
           <w:lang w:val="ro-RO"/>
@@ -1075,6 +1181,8 @@
           <w:rFonts w:eastAsia="Arial" w:cs="Arial" w:ascii="Arial" w:hAnsi="Arial"/>
           <w:i/>
           <w:color w:val="auto"/>
+          <w:spacing w:val="0"/>
+          <w:w w:val="100"/>
           <w:sz w:val="20"/>
           <w:szCs w:val="20"/>
           <w:lang w:val="ro-RO"/>
@@ -1086,6 +1194,8 @@
           <w:rStyle w:val="tpa1"/>
           <w:rFonts w:eastAsia="Arial" w:cs="Arial" w:ascii="Arial" w:hAnsi="Arial"/>
           <w:color w:val="auto"/>
+          <w:spacing w:val="0"/>
+          <w:w w:val="100"/>
           <w:sz w:val="20"/>
           <w:szCs w:val="20"/>
           <w:lang w:val="ro-RO"/>
@@ -1113,6 +1223,8 @@
         <w:rPr>
           <w:rFonts w:eastAsia="Arial" w:cs="Arial" w:ascii="Arial" w:hAnsi="Arial"/>
           <w:color w:val="auto"/>
+          <w:spacing w:val="0"/>
+          <w:w w:val="100"/>
           <w:sz w:val="20"/>
           <w:szCs w:val="20"/>
           <w:lang w:val="ro-RO"/>
@@ -1124,6 +1236,8 @@
           <w:rStyle w:val="spar"/>
           <w:rFonts w:eastAsia="Arial" w:cs="Arial" w:ascii="Arial" w:hAnsi="Arial"/>
           <w:color w:val="auto"/>
+          <w:spacing w:val="0"/>
+          <w:w w:val="100"/>
           <w:sz w:val="20"/>
           <w:szCs w:val="20"/>
           <w:shd w:fill="FFFFFF" w:val="clear"/>
@@ -1135,6 +1249,8 @@
         <w:rPr>
           <w:rFonts w:eastAsia="Arial" w:cs="Arial" w:ascii="Arial" w:hAnsi="Arial"/>
           <w:color w:val="auto"/>
+          <w:spacing w:val="0"/>
+          <w:w w:val="100"/>
           <w:sz w:val="20"/>
           <w:szCs w:val="20"/>
           <w:lang w:val="ro-RO"/>
@@ -1146,6 +1262,8 @@
           <w:rFonts w:eastAsia="Arial" w:cs="Arial" w:ascii="Arial" w:hAnsi="Arial"/>
           <w:b/>
           <w:color w:val="auto"/>
+          <w:spacing w:val="0"/>
+          <w:w w:val="100"/>
           <w:sz w:val="20"/>
           <w:szCs w:val="20"/>
           <w:lang w:val="ro-RO"/>
@@ -1156,6 +1274,8 @@
         <w:rPr>
           <w:rFonts w:eastAsia="Arial" w:cs="Arial" w:ascii="Arial" w:hAnsi="Arial"/>
           <w:color w:val="auto"/>
+          <w:spacing w:val="0"/>
+          <w:w w:val="100"/>
           <w:sz w:val="20"/>
           <w:szCs w:val="20"/>
           <w:lang w:val="ro-RO"/>
@@ -1183,6 +1303,8 @@
         <w:rPr>
           <w:rFonts w:eastAsia="Arial" w:cs="Arial" w:ascii="Arial" w:hAnsi="Arial"/>
           <w:color w:val="auto"/>
+          <w:spacing w:val="0"/>
+          <w:w w:val="100"/>
           <w:sz w:val="20"/>
           <w:szCs w:val="20"/>
           <w:lang w:val="ro-RO"/>
@@ -1194,6 +1316,8 @@
           <w:rStyle w:val="PageNumber"/>
           <w:rFonts w:eastAsia="Arial" w:cs="Arial" w:ascii="Arial" w:hAnsi="Arial"/>
           <w:color w:val="auto"/>
+          <w:spacing w:val="0"/>
+          <w:w w:val="100"/>
           <w:sz w:val="20"/>
           <w:szCs w:val="20"/>
           <w:lang w:val="ro-RO"/>
@@ -1204,6 +1328,8 @@
         <w:rPr>
           <w:rFonts w:eastAsia="Arial" w:cs="Arial" w:ascii="Arial" w:hAnsi="Arial"/>
           <w:color w:val="auto"/>
+          <w:spacing w:val="0"/>
+          <w:w w:val="100"/>
           <w:sz w:val="20"/>
           <w:szCs w:val="20"/>
           <w:lang w:val="ro-RO"/>
@@ -1215,6 +1341,8 @@
           <w:rFonts w:eastAsia="Arial" w:cs="Arial" w:ascii="Arial" w:hAnsi="Arial"/>
           <w:i/>
           <w:color w:val="auto"/>
+          <w:spacing w:val="0"/>
+          <w:w w:val="100"/>
           <w:sz w:val="20"/>
           <w:szCs w:val="20"/>
           <w:lang w:val="ro-RO"/>
@@ -1225,6 +1353,8 @@
         <w:rPr>
           <w:rFonts w:eastAsia="Arial" w:cs="Arial" w:ascii="Arial" w:hAnsi="Arial"/>
           <w:color w:val="auto"/>
+          <w:spacing w:val="0"/>
+          <w:w w:val="100"/>
           <w:sz w:val="20"/>
           <w:szCs w:val="20"/>
           <w:lang w:val="ro-RO"/>
@@ -1252,6 +1382,8 @@
         <w:rPr>
           <w:rFonts w:eastAsia="Arial" w:cs="Arial" w:ascii="Arial" w:hAnsi="Arial"/>
           <w:color w:val="auto"/>
+          <w:spacing w:val="0"/>
+          <w:w w:val="100"/>
           <w:sz w:val="20"/>
           <w:szCs w:val="20"/>
           <w:u w:val="single"/>
@@ -1263,6 +1395,8 @@
         <w:rPr>
           <w:rFonts w:eastAsia="Arial" w:cs="Arial" w:ascii="Arial" w:hAnsi="Arial"/>
           <w:color w:val="auto"/>
+          <w:spacing w:val="0"/>
+          <w:w w:val="100"/>
           <w:sz w:val="20"/>
           <w:szCs w:val="20"/>
           <w:lang w:val="ro-RO"/>
@@ -1275,6 +1409,8 @@
           <w:b/>
           <w:bCs/>
           <w:color w:val="auto"/>
+          <w:spacing w:val="0"/>
+          <w:w w:val="100"/>
           <w:sz w:val="20"/>
           <w:szCs w:val="20"/>
           <w:lang w:val="ro-RO"/>
@@ -1286,6 +1422,8 @@
           <w:rFonts w:eastAsia="Arial" w:cs="Arial" w:ascii="Arial" w:hAnsi="Arial"/>
           <w:b/>
           <w:color w:val="auto"/>
+          <w:spacing w:val="0"/>
+          <w:w w:val="100"/>
           <w:sz w:val="20"/>
           <w:szCs w:val="20"/>
           <w:lang w:val="ro-RO"/>
@@ -1296,6 +1434,8 @@
         <w:rPr>
           <w:rFonts w:eastAsia="Arial" w:cs="Arial" w:ascii="Arial" w:hAnsi="Arial"/>
           <w:color w:val="auto"/>
+          <w:spacing w:val="0"/>
+          <w:w w:val="100"/>
           <w:sz w:val="20"/>
           <w:szCs w:val="20"/>
           <w:lang w:val="ro-RO"/>
@@ -1307,6 +1447,8 @@
           <w:rFonts w:eastAsia="Arial" w:cs="Arial" w:ascii="Arial" w:hAnsi="Arial"/>
           <w:b/>
           <w:color w:val="auto"/>
+          <w:spacing w:val="0"/>
+          <w:w w:val="100"/>
           <w:sz w:val="20"/>
           <w:szCs w:val="20"/>
           <w:lang w:val="ro-RO"/>
@@ -1319,6 +1461,8 @@
           <w:b/>
           <w:bCs/>
           <w:color w:val="auto"/>
+          <w:spacing w:val="0"/>
+          <w:w w:val="100"/>
           <w:sz w:val="20"/>
           <w:szCs w:val="20"/>
           <w:lang w:val="ro-RO"/>
@@ -1330,6 +1474,8 @@
           <w:rFonts w:eastAsia="Arial" w:cs="Arial" w:ascii="Arial" w:hAnsi="Arial"/>
           <w:b/>
           <w:color w:val="auto"/>
+          <w:spacing w:val="0"/>
+          <w:w w:val="100"/>
           <w:sz w:val="20"/>
           <w:szCs w:val="20"/>
           <w:lang w:val="ro-RO"/>
@@ -1340,6 +1486,8 @@
         <w:rPr>
           <w:rFonts w:eastAsia="Arial" w:cs="Arial" w:ascii="Arial" w:hAnsi="Arial"/>
           <w:color w:val="auto"/>
+          <w:spacing w:val="0"/>
+          <w:w w:val="100"/>
           <w:sz w:val="20"/>
           <w:szCs w:val="20"/>
           <w:lang w:val="ro-RO"/>
@@ -1367,6 +1515,8 @@
         <w:rPr>
           <w:rFonts w:eastAsia="Arial" w:cs="Arial" w:ascii="Arial" w:hAnsi="Arial"/>
           <w:color w:val="auto"/>
+          <w:spacing w:val="0"/>
+          <w:w w:val="100"/>
           <w:sz w:val="20"/>
           <w:szCs w:val="20"/>
           <w:u w:val="single"/>
@@ -1378,6 +1528,8 @@
         <w:rPr>
           <w:rFonts w:eastAsia="Arial" w:cs="Arial" w:ascii="Arial" w:hAnsi="Arial"/>
           <w:color w:val="auto"/>
+          <w:spacing w:val="0"/>
+          <w:w w:val="100"/>
           <w:sz w:val="20"/>
           <w:szCs w:val="20"/>
           <w:lang w:val="ro-RO"/>
@@ -1390,6 +1542,8 @@
           <w:b/>
           <w:bCs/>
           <w:color w:val="auto"/>
+          <w:spacing w:val="0"/>
+          <w:w w:val="100"/>
           <w:sz w:val="20"/>
           <w:szCs w:val="20"/>
           <w:lang w:val="ro-RO"/>
@@ -1401,6 +1555,8 @@
           <w:rFonts w:eastAsia="Arial" w:cs="Arial" w:ascii="Arial" w:hAnsi="Arial"/>
           <w:b/>
           <w:color w:val="auto"/>
+          <w:spacing w:val="0"/>
+          <w:w w:val="100"/>
           <w:sz w:val="20"/>
           <w:szCs w:val="20"/>
           <w:lang w:val="ro-RO"/>
@@ -1411,6 +1567,8 @@
         <w:rPr>
           <w:rFonts w:eastAsia="Arial" w:cs="Arial" w:ascii="Arial" w:hAnsi="Arial"/>
           <w:color w:val="auto"/>
+          <w:spacing w:val="0"/>
+          <w:w w:val="100"/>
           <w:sz w:val="20"/>
           <w:szCs w:val="20"/>
           <w:lang w:val="ro-RO"/>
@@ -1422,6 +1580,8 @@
           <w:rFonts w:eastAsia="Arial" w:cs="Arial" w:ascii="Arial" w:hAnsi="Arial"/>
           <w:b/>
           <w:color w:val="auto"/>
+          <w:spacing w:val="0"/>
+          <w:w w:val="100"/>
           <w:sz w:val="20"/>
           <w:szCs w:val="20"/>
           <w:lang w:val="ro-RO"/>
@@ -1434,6 +1594,8 @@
           <w:b/>
           <w:bCs/>
           <w:color w:val="auto"/>
+          <w:spacing w:val="0"/>
+          <w:w w:val="100"/>
           <w:sz w:val="20"/>
           <w:szCs w:val="20"/>
           <w:lang w:val="ro-RO"/>
@@ -1445,6 +1607,8 @@
           <w:rFonts w:eastAsia="Arial" w:cs="Arial" w:ascii="Arial" w:hAnsi="Arial"/>
           <w:b/>
           <w:color w:val="auto"/>
+          <w:spacing w:val="0"/>
+          <w:w w:val="100"/>
           <w:sz w:val="20"/>
           <w:szCs w:val="20"/>
           <w:lang w:val="ro-RO"/>
@@ -1455,6 +1619,8 @@
         <w:rPr>
           <w:rFonts w:eastAsia="Arial" w:cs="Arial" w:ascii="Arial" w:hAnsi="Arial"/>
           <w:color w:val="auto"/>
+          <w:spacing w:val="0"/>
+          <w:w w:val="100"/>
           <w:sz w:val="20"/>
           <w:szCs w:val="20"/>
           <w:lang w:val="ro-RO"/>
@@ -1483,6 +1649,8 @@
         <w:rPr>
           <w:rFonts w:eastAsia="Arial" w:cs="Arial" w:ascii="Arial" w:hAnsi="Arial"/>
           <w:color w:val="auto"/>
+          <w:spacing w:val="0"/>
+          <w:w w:val="100"/>
           <w:sz w:val="20"/>
           <w:szCs w:val="20"/>
           <w:lang w:val="ro-RO"/>
@@ -1494,6 +1662,8 @@
           <w:rStyle w:val="tpa1"/>
           <w:rFonts w:eastAsia="Arial" w:cs="Arial" w:ascii="Arial" w:hAnsi="Arial"/>
           <w:color w:val="auto"/>
+          <w:spacing w:val="0"/>
+          <w:w w:val="100"/>
           <w:sz w:val="20"/>
           <w:szCs w:val="20"/>
           <w:lang w:val="ro-RO"/>
@@ -1506,6 +1676,8 @@
           <w:rFonts w:eastAsia="Arial" w:cs="Arial" w:ascii="Arial" w:hAnsi="Arial"/>
           <w:b/>
           <w:color w:val="auto"/>
+          <w:spacing w:val="0"/>
+          <w:w w:val="100"/>
           <w:sz w:val="20"/>
           <w:szCs w:val="20"/>
           <w:lang w:val="ro-RO"/>
@@ -1517,6 +1689,8 @@
           <w:rStyle w:val="tpa1"/>
           <w:rFonts w:eastAsia="Arial" w:cs="Arial" w:ascii="Arial" w:hAnsi="Arial"/>
           <w:color w:val="auto"/>
+          <w:spacing w:val="0"/>
+          <w:w w:val="100"/>
           <w:sz w:val="20"/>
           <w:szCs w:val="20"/>
           <w:lang w:val="ro-RO"/>
@@ -1542,6 +1716,8 @@
           <w:rFonts w:eastAsia="Arial" w:cs="Arial" w:ascii="Arial" w:hAnsi="Arial"/>
           <w:i/>
           <w:color w:val="auto"/>
+          <w:spacing w:val="0"/>
+          <w:w w:val="100"/>
           <w:sz w:val="20"/>
           <w:szCs w:val="20"/>
           <w:lang w:val="ro-RO"/>
@@ -1570,6 +1746,8 @@
           <w:rStyle w:val="tli1"/>
           <w:rFonts w:eastAsia="Arial" w:cs="Arial" w:ascii="Arial" w:hAnsi="Arial"/>
           <w:color w:val="auto"/>
+          <w:spacing w:val="0"/>
+          <w:w w:val="100"/>
           <w:sz w:val="20"/>
           <w:szCs w:val="20"/>
           <w:lang w:val="ro-RO"/>
@@ -1598,6 +1776,8 @@
           <w:rStyle w:val="tli1"/>
           <w:rFonts w:eastAsia="Arial" w:cs="Arial" w:ascii="Arial" w:hAnsi="Arial"/>
           <w:color w:val="auto"/>
+          <w:spacing w:val="0"/>
+          <w:w w:val="100"/>
           <w:sz w:val="20"/>
           <w:szCs w:val="20"/>
           <w:lang w:val="ro-RO"/>
@@ -1627,6 +1807,8 @@
           <w:rStyle w:val="tli1"/>
           <w:rFonts w:eastAsia="Arial" w:cs="Arial" w:ascii="Arial" w:hAnsi="Arial"/>
           <w:color w:val="auto"/>
+          <w:spacing w:val="0"/>
+          <w:w w:val="100"/>
           <w:sz w:val="20"/>
           <w:szCs w:val="20"/>
           <w:lang w:val="ro-RO"/>
@@ -1655,6 +1837,8 @@
           <w:rStyle w:val="tli1"/>
           <w:rFonts w:eastAsia="Arial" w:cs="Arial" w:ascii="Arial" w:hAnsi="Arial"/>
           <w:color w:val="auto"/>
+          <w:spacing w:val="0"/>
+          <w:w w:val="100"/>
           <w:sz w:val="20"/>
           <w:szCs w:val="20"/>
           <w:lang w:val="ro-RO"/>
@@ -1683,6 +1867,8 @@
           <w:rStyle w:val="tli1"/>
           <w:rFonts w:eastAsia="Arial" w:cs="Arial" w:ascii="Arial" w:hAnsi="Arial"/>
           <w:color w:val="auto"/>
+          <w:spacing w:val="0"/>
+          <w:w w:val="100"/>
           <w:sz w:val="20"/>
           <w:szCs w:val="20"/>
           <w:lang w:val="ro-RO"/>
@@ -1711,6 +1897,8 @@
           <w:rStyle w:val="tli1"/>
           <w:rFonts w:eastAsia="Arial" w:cs="Arial" w:ascii="Arial" w:hAnsi="Arial"/>
           <w:color w:val="auto"/>
+          <w:spacing w:val="0"/>
+          <w:w w:val="100"/>
           <w:sz w:val="20"/>
           <w:szCs w:val="20"/>
           <w:lang w:val="ro-RO"/>
@@ -1739,6 +1927,8 @@
           <w:rStyle w:val="tli1"/>
           <w:rFonts w:eastAsia="Arial" w:cs="Arial" w:ascii="Arial" w:hAnsi="Arial"/>
           <w:color w:val="auto"/>
+          <w:spacing w:val="0"/>
+          <w:w w:val="100"/>
           <w:sz w:val="20"/>
           <w:szCs w:val="20"/>
           <w:lang w:val="ro-RO"/>
@@ -1770,6 +1960,8 @@
           <w:rFonts w:eastAsia="Arial" w:cs="Arial" w:ascii="Arial" w:hAnsi="Arial"/>
           <w:i/>
           <w:color w:val="auto"/>
+          <w:spacing w:val="0"/>
+          <w:w w:val="100"/>
           <w:sz w:val="20"/>
           <w:szCs w:val="20"/>
           <w:lang w:val="ro-RO"/>
@@ -1780,6 +1972,8 @@
         <w:rPr>
           <w:rFonts w:eastAsia="Arial" w:cs="Arial" w:ascii="Arial" w:hAnsi="Arial"/>
           <w:color w:val="auto"/>
+          <w:spacing w:val="0"/>
+          <w:w w:val="100"/>
           <w:sz w:val="20"/>
           <w:szCs w:val="20"/>
           <w:lang w:val="ro-RO"/>
@@ -1791,6 +1985,8 @@
           <w:rStyle w:val="spar"/>
           <w:rFonts w:eastAsia="Arial" w:cs="Arial" w:ascii="Arial" w:hAnsi="Arial"/>
           <w:color w:val="auto"/>
+          <w:spacing w:val="0"/>
+          <w:w w:val="100"/>
           <w:sz w:val="20"/>
           <w:szCs w:val="20"/>
           <w:shd w:fill="FFFFFF" w:val="clear"/>
@@ -1823,6 +2019,8 @@
           <w:rStyle w:val="slitbdy"/>
           <w:rFonts w:eastAsia="Arial" w:cs="Arial" w:ascii="Arial" w:hAnsi="Arial"/>
           <w:color w:val="auto"/>
+          <w:spacing w:val="0"/>
+          <w:w w:val="100"/>
           <w:sz w:val="20"/>
           <w:szCs w:val="20"/>
           <w:shd w:fill="FFFFFF" w:val="clear"/>
@@ -1855,6 +2053,8 @@
           <w:rStyle w:val="slitbdy"/>
           <w:rFonts w:eastAsia="Arial" w:cs="Arial" w:ascii="Arial" w:hAnsi="Arial"/>
           <w:color w:val="auto"/>
+          <w:spacing w:val="0"/>
+          <w:w w:val="100"/>
           <w:sz w:val="20"/>
           <w:szCs w:val="20"/>
           <w:shd w:fill="FFFFFF" w:val="clear"/>
@@ -1887,6 +2087,8 @@
           <w:rStyle w:val="slitbdy"/>
           <w:rFonts w:eastAsia="Arial" w:cs="Arial" w:ascii="Arial" w:hAnsi="Arial"/>
           <w:color w:val="auto"/>
+          <w:spacing w:val="0"/>
+          <w:w w:val="100"/>
           <w:sz w:val="20"/>
           <w:szCs w:val="20"/>
           <w:shd w:fill="FFFFFF" w:val="clear"/>
@@ -1919,6 +2121,8 @@
           <w:rStyle w:val="slitbdy"/>
           <w:rFonts w:eastAsia="Arial" w:cs="Arial" w:ascii="Arial" w:hAnsi="Arial"/>
           <w:color w:val="auto"/>
+          <w:spacing w:val="0"/>
+          <w:w w:val="100"/>
           <w:sz w:val="20"/>
           <w:szCs w:val="20"/>
           <w:shd w:fill="FFFFFF" w:val="clear"/>
@@ -1950,6 +2154,8 @@
         <w:rPr>
           <w:rFonts w:eastAsia="Arial" w:cs="Arial" w:ascii="Arial" w:hAnsi="Arial"/>
           <w:color w:val="auto"/>
+          <w:spacing w:val="0"/>
+          <w:w w:val="100"/>
           <w:sz w:val="20"/>
           <w:szCs w:val="20"/>
           <w:lang w:val="ro-RO"/>
@@ -1961,6 +2167,8 @@
           <w:rFonts w:eastAsia="Arial" w:cs="Arial" w:ascii="Arial" w:hAnsi="Arial"/>
           <w:b/>
           <w:color w:val="auto"/>
+          <w:spacing w:val="0"/>
+          <w:w w:val="100"/>
           <w:sz w:val="20"/>
           <w:szCs w:val="20"/>
           <w:lang w:val="ro-RO"/>
@@ -1971,6 +2179,8 @@
         <w:rPr>
           <w:rFonts w:eastAsia="Arial" w:cs="Arial" w:ascii="Arial" w:hAnsi="Arial"/>
           <w:color w:val="auto"/>
+          <w:spacing w:val="0"/>
+          <w:w w:val="100"/>
           <w:sz w:val="20"/>
           <w:szCs w:val="20"/>
           <w:lang w:val="ro-RO"/>
@@ -2001,6 +2211,8 @@
           <w:rFonts w:eastAsia="Arial" w:cs="Arial" w:ascii="Arial" w:hAnsi="Arial"/>
           <w:i/>
           <w:color w:val="auto"/>
+          <w:spacing w:val="0"/>
+          <w:w w:val="100"/>
           <w:sz w:val="20"/>
           <w:szCs w:val="20"/>
           <w:lang w:val="ro-RO"/>
@@ -2011,6 +2223,8 @@
         <w:rPr>
           <w:rFonts w:eastAsia="Arial" w:cs="Arial" w:ascii="Arial" w:hAnsi="Arial"/>
           <w:color w:val="auto"/>
+          <w:spacing w:val="0"/>
+          <w:w w:val="100"/>
           <w:sz w:val="20"/>
           <w:szCs w:val="20"/>
           <w:lang w:val="ro-RO"/>
@@ -2022,6 +2236,8 @@
           <w:rStyle w:val="tpa1"/>
           <w:rFonts w:eastAsia="Arial" w:cs="Arial" w:ascii="Arial" w:hAnsi="Arial"/>
           <w:color w:val="auto"/>
+          <w:spacing w:val="0"/>
+          <w:w w:val="100"/>
           <w:sz w:val="20"/>
           <w:szCs w:val="20"/>
           <w:lang w:val="ro-RO"/>
@@ -2033,6 +2249,8 @@
           <w:rStyle w:val="tal1"/>
           <w:rFonts w:eastAsia="Arial" w:cs="Arial" w:ascii="Arial" w:hAnsi="Arial"/>
           <w:color w:val="auto"/>
+          <w:spacing w:val="0"/>
+          <w:w w:val="100"/>
           <w:sz w:val="20"/>
           <w:szCs w:val="20"/>
           <w:lang w:val="ro-RO"/>
@@ -2044,6 +2262,8 @@
           <w:rStyle w:val="tpa1"/>
           <w:rFonts w:eastAsia="Arial" w:cs="Arial" w:ascii="Arial" w:hAnsi="Arial"/>
           <w:color w:val="auto"/>
+          <w:spacing w:val="0"/>
+          <w:w w:val="100"/>
           <w:sz w:val="20"/>
           <w:szCs w:val="20"/>
           <w:lang w:val="ro-RO"/>
@@ -2071,6 +2291,8 @@
         <w:rPr>
           <w:rFonts w:eastAsia="Arial" w:cs="Arial" w:ascii="Arial" w:hAnsi="Arial"/>
           <w:color w:val="auto"/>
+          <w:spacing w:val="0"/>
+          <w:w w:val="100"/>
           <w:sz w:val="20"/>
           <w:szCs w:val="20"/>
           <w:lang w:val="ro-RO"/>
@@ -2082,6 +2304,8 @@
           <w:rStyle w:val="PageNumber"/>
           <w:rFonts w:eastAsia="Arial" w:cs="Arial" w:ascii="Arial" w:hAnsi="Arial"/>
           <w:color w:val="auto"/>
+          <w:spacing w:val="0"/>
+          <w:w w:val="100"/>
           <w:sz w:val="20"/>
           <w:szCs w:val="20"/>
           <w:lang w:val="ro-RO"/>
@@ -2092,6 +2316,8 @@
         <w:rPr>
           <w:rFonts w:eastAsia="Arial" w:cs="Arial" w:ascii="Arial" w:hAnsi="Arial"/>
           <w:color w:val="auto"/>
+          <w:spacing w:val="0"/>
+          <w:w w:val="100"/>
           <w:sz w:val="20"/>
           <w:szCs w:val="20"/>
           <w:lang w:val="ro-RO"/>
@@ -2103,6 +2329,8 @@
           <w:rStyle w:val="PageNumber"/>
           <w:rFonts w:eastAsia="Arial" w:cs="Arial" w:ascii="Arial" w:hAnsi="Arial"/>
           <w:color w:val="auto"/>
+          <w:spacing w:val="0"/>
+          <w:w w:val="100"/>
           <w:sz w:val="20"/>
           <w:szCs w:val="20"/>
           <w:lang w:val="ro-RO"/>
@@ -2131,6 +2359,8 @@
         <w:rPr>
           <w:rFonts w:eastAsia="Arial" w:cs="Arial" w:ascii="Arial" w:hAnsi="Arial"/>
           <w:color w:val="auto"/>
+          <w:spacing w:val="0"/>
+          <w:w w:val="100"/>
           <w:sz w:val="20"/>
           <w:szCs w:val="20"/>
           <w:lang w:val="ro-RO"/>
@@ -2142,6 +2372,8 @@
           <w:rStyle w:val="PageNumber"/>
           <w:rFonts w:eastAsia="Arial" w:cs="Arial" w:ascii="Arial" w:hAnsi="Arial"/>
           <w:color w:val="auto"/>
+          <w:spacing w:val="0"/>
+          <w:w w:val="100"/>
           <w:sz w:val="20"/>
           <w:szCs w:val="20"/>
           <w:lang w:val="ro-RO"/>
@@ -2152,6 +2384,8 @@
         <w:rPr>
           <w:rFonts w:eastAsia="Arial" w:cs="Arial" w:ascii="Arial" w:hAnsi="Arial"/>
           <w:color w:val="auto"/>
+          <w:spacing w:val="0"/>
+          <w:w w:val="100"/>
           <w:sz w:val="20"/>
           <w:szCs w:val="20"/>
           <w:lang w:val="ro-RO"/>
@@ -2163,6 +2397,8 @@
           <w:rStyle w:val="PageNumber"/>
           <w:rFonts w:eastAsia="Arial" w:cs="Arial" w:ascii="Arial" w:hAnsi="Arial"/>
           <w:color w:val="auto"/>
+          <w:spacing w:val="0"/>
+          <w:w w:val="100"/>
           <w:sz w:val="20"/>
           <w:szCs w:val="20"/>
           <w:lang w:val="ro-RO"/>
@@ -2190,6 +2426,8 @@
         <w:rPr>
           <w:rFonts w:eastAsia="Arial" w:cs="Arial" w:ascii="Arial" w:hAnsi="Arial"/>
           <w:color w:val="auto"/>
+          <w:spacing w:val="0"/>
+          <w:w w:val="100"/>
           <w:sz w:val="20"/>
           <w:szCs w:val="20"/>
           <w:lang w:val="ro-RO"/>
@@ -2201,6 +2439,8 @@
           <w:rFonts w:eastAsia="Arial" w:cs="Arial" w:ascii="Arial" w:hAnsi="Arial"/>
           <w:b/>
           <w:color w:val="auto"/>
+          <w:spacing w:val="0"/>
+          <w:w w:val="100"/>
           <w:sz w:val="20"/>
           <w:szCs w:val="20"/>
           <w:lang w:val="ro-RO"/>
@@ -2211,6 +2451,8 @@
         <w:rPr>
           <w:rFonts w:eastAsia="Arial" w:cs="Arial" w:ascii="Arial" w:hAnsi="Arial"/>
           <w:color w:val="auto"/>
+          <w:spacing w:val="0"/>
+          <w:w w:val="100"/>
           <w:sz w:val="20"/>
           <w:szCs w:val="20"/>
           <w:lang w:val="ro-RO"/>
@@ -2238,6 +2480,8 @@
         <w:rPr>
           <w:rFonts w:eastAsia="Arial" w:cs="Arial" w:ascii="Arial" w:hAnsi="Arial"/>
           <w:color w:val="auto"/>
+          <w:spacing w:val="0"/>
+          <w:w w:val="100"/>
           <w:sz w:val="20"/>
           <w:szCs w:val="20"/>
           <w:lang w:val="ro-RO"/>
@@ -2265,6 +2509,8 @@
         <w:rPr>
           <w:rFonts w:eastAsia="Arial" w:cs="Arial" w:ascii="Arial" w:hAnsi="Arial"/>
           <w:color w:val="auto"/>
+          <w:spacing w:val="0"/>
+          <w:w w:val="100"/>
           <w:sz w:val="20"/>
           <w:szCs w:val="20"/>
           <w:lang w:val="ro-RO"/>
@@ -2292,6 +2538,8 @@
         <w:rPr>
           <w:rFonts w:eastAsia="Arial" w:cs="Arial" w:ascii="Arial" w:hAnsi="Arial"/>
           <w:color w:val="auto"/>
+          <w:spacing w:val="0"/>
+          <w:w w:val="100"/>
           <w:sz w:val="20"/>
           <w:szCs w:val="20"/>
           <w:lang w:val="ro-RO"/>
@@ -2303,6 +2551,8 @@
           <w:rStyle w:val="PageNumber"/>
           <w:rFonts w:eastAsia="Arial" w:cs="Arial" w:ascii="Arial" w:hAnsi="Arial"/>
           <w:color w:val="auto"/>
+          <w:spacing w:val="0"/>
+          <w:w w:val="100"/>
           <w:sz w:val="20"/>
           <w:szCs w:val="20"/>
           <w:lang w:val="ro-RO"/>
@@ -2313,6 +2563,8 @@
         <w:rPr>
           <w:rFonts w:eastAsia="Arial" w:cs="Arial" w:ascii="Arial" w:hAnsi="Arial"/>
           <w:color w:val="auto"/>
+          <w:spacing w:val="0"/>
+          <w:w w:val="100"/>
           <w:sz w:val="20"/>
           <w:szCs w:val="20"/>
           <w:lang w:val="ro-RO"/>
@@ -2340,6 +2592,8 @@
           <w:rFonts w:eastAsia="Arial" w:cs="Arial" w:ascii="Arial" w:hAnsi="Arial"/>
           <w:b/>
           <w:color w:val="auto"/>
+          <w:spacing w:val="0"/>
+          <w:w w:val="100"/>
           <w:sz w:val="20"/>
           <w:szCs w:val="20"/>
           <w:lang w:val="ro-RO"/>
@@ -2352,6 +2606,8 @@
           <w:rFonts w:eastAsia="Arial" w:cs="Arial" w:ascii="Arial" w:hAnsi="Arial"/>
           <w:b/>
           <w:color w:val="auto"/>
+          <w:spacing w:val="0"/>
+          <w:w w:val="100"/>
           <w:sz w:val="20"/>
           <w:szCs w:val="20"/>
           <w:lang w:val="ro-RO"/>
@@ -2377,6 +2633,8 @@
         <w:rPr>
           <w:rFonts w:eastAsia="Arial" w:cs="Arial" w:ascii="Arial" w:hAnsi="Arial"/>
           <w:color w:val="auto"/>
+          <w:spacing w:val="0"/>
+          <w:w w:val="100"/>
           <w:sz w:val="20"/>
           <w:szCs w:val="20"/>
           <w:lang w:val="ro-RO"/>
@@ -2404,6 +2662,8 @@
           <w:rFonts w:eastAsia="Arial" w:cs="Arial" w:ascii="Arial" w:hAnsi="Arial"/>
           <w:b/>
           <w:color w:val="auto"/>
+          <w:spacing w:val="0"/>
+          <w:w w:val="100"/>
           <w:sz w:val="20"/>
           <w:szCs w:val="20"/>
           <w:lang w:val="ro-RO"/>
@@ -2432,6 +2692,8 @@
           <w:rFonts w:eastAsia="Arial" w:cs="Arial" w:ascii="Arial" w:hAnsi="Arial"/>
           <w:b/>
           <w:color w:val="auto"/>
+          <w:spacing w:val="0"/>
+          <w:w w:val="100"/>
           <w:sz w:val="20"/>
           <w:szCs w:val="20"/>
           <w:lang w:val="ro-RO"/>
@@ -2460,6 +2722,8 @@
           <w:rStyle w:val="tpa1"/>
           <w:rFonts w:eastAsia="Arial" w:cs="Arial" w:ascii="Arial" w:hAnsi="Arial"/>
           <w:color w:val="auto"/>
+          <w:spacing w:val="0"/>
+          <w:w w:val="100"/>
           <w:sz w:val="20"/>
           <w:szCs w:val="20"/>
           <w:lang w:val="ro-RO"/>
@@ -2470,6 +2734,8 @@
         <w:rPr>
           <w:rFonts w:eastAsia="Arial" w:cs="Arial" w:ascii="Arial" w:hAnsi="Arial"/>
           <w:color w:val="auto"/>
+          <w:spacing w:val="0"/>
+          <w:w w:val="100"/>
           <w:sz w:val="20"/>
           <w:szCs w:val="20"/>
           <w:lang w:val="ro-RO"/>
@@ -2481,6 +2747,8 @@
           <w:rStyle w:val="tpa1"/>
           <w:rFonts w:eastAsia="Arial" w:cs="Arial" w:ascii="Arial" w:hAnsi="Arial"/>
           <w:color w:val="auto"/>
+          <w:spacing w:val="0"/>
+          <w:w w:val="100"/>
           <w:sz w:val="20"/>
           <w:szCs w:val="20"/>
           <w:lang w:val="ro-RO"/>
@@ -2491,6 +2759,8 @@
         <w:rPr>
           <w:rFonts w:eastAsia="Arial" w:cs="Arial" w:ascii="Arial" w:hAnsi="Arial"/>
           <w:color w:val="auto"/>
+          <w:spacing w:val="0"/>
+          <w:w w:val="100"/>
           <w:sz w:val="20"/>
           <w:szCs w:val="20"/>
           <w:lang w:val="ro-RO"/>
@@ -2554,6 +2824,8 @@
                 <w:rFonts w:eastAsia="Arial" w:cs="Arial" w:ascii="Arial" w:hAnsi="Arial"/>
                 <w:b/>
                 <w:color w:val="auto"/>
+                <w:spacing w:val="0"/>
+                <w:w w:val="100"/>
                 <w:sz w:val="20"/>
                 <w:szCs w:val="20"/>
                 <w:lang w:val="ro-RO"/>
@@ -2592,6 +2864,8 @@
                 <w:rFonts w:eastAsia="Arial" w:cs="Arial" w:ascii="Arial" w:hAnsi="Arial"/>
                 <w:b/>
                 <w:color w:val="auto"/>
+                <w:spacing w:val="0"/>
+                <w:w w:val="100"/>
                 <w:sz w:val="20"/>
                 <w:szCs w:val="20"/>
                 <w:lang w:val="ro-RO"/>
@@ -2630,6 +2904,8 @@
                 <w:rFonts w:eastAsia="Arial" w:cs="Arial" w:ascii="Arial" w:hAnsi="Arial"/>
                 <w:b/>
                 <w:color w:val="auto"/>
+                <w:spacing w:val="0"/>
+                <w:w w:val="100"/>
                 <w:sz w:val="20"/>
                 <w:szCs w:val="20"/>
                 <w:lang w:val="ro-RO"/>
@@ -2668,6 +2944,8 @@
                 <w:rFonts w:eastAsia="Arial" w:cs="Arial" w:ascii="Arial" w:hAnsi="Arial"/>
                 <w:b/>
                 <w:color w:val="auto"/>
+                <w:spacing w:val="0"/>
+                <w:w w:val="100"/>
                 <w:sz w:val="20"/>
                 <w:szCs w:val="20"/>
                 <w:lang w:val="ro-RO"/>
@@ -2706,6 +2984,8 @@
                 <w:rFonts w:eastAsia="Arial" w:cs="Arial" w:ascii="Arial" w:hAnsi="Arial"/>
                 <w:b/>
                 <w:color w:val="auto"/>
+                <w:spacing w:val="0"/>
+                <w:w w:val="100"/>
                 <w:sz w:val="20"/>
                 <w:szCs w:val="20"/>
                 <w:lang w:val="ro-RO"/>
@@ -2755,6 +3035,8 @@
                 <w:rFonts w:eastAsia="Arial" w:cs="Arial" w:ascii="Arial" w:hAnsi="Arial"/>
                 <w:b/>
                 <w:color w:val="auto"/>
+                <w:spacing w:val="0"/>
+                <w:w w:val="100"/>
                 <w:sz w:val="20"/>
                 <w:szCs w:val="20"/>
                 <w:lang w:val="ro-RO"/>
@@ -2788,6 +3070,8 @@
               <w:rPr>
                 <w:rFonts w:eastAsia="Arial" w:cs="Arial" w:ascii="Arial" w:hAnsi="Arial"/>
                 <w:color w:val="auto"/>
+                <w:spacing w:val="0"/>
+                <w:w w:val="100"/>
                 <w:sz w:val="20"/>
                 <w:szCs w:val="20"/>
                 <w:lang w:val="ro-RO"/>
@@ -2823,6 +3107,8 @@
               <w:rPr>
                 <w:rFonts w:eastAsia="Arial" w:cs="Arial" w:ascii="Arial" w:hAnsi="Arial"/>
                 <w:color w:val="auto"/>
+                <w:spacing w:val="0"/>
+                <w:w w:val="100"/>
                 <w:sz w:val="20"/>
                 <w:szCs w:val="20"/>
                 <w:lang w:val="ro-RO"/>
@@ -2858,6 +3144,8 @@
               <w:rPr>
                 <w:rFonts w:eastAsia="Arial" w:cs="Arial" w:ascii="Arial" w:hAnsi="Arial"/>
                 <w:color w:val="auto"/>
+                <w:spacing w:val="0"/>
+                <w:w w:val="100"/>
                 <w:sz w:val="20"/>
                 <w:szCs w:val="20"/>
                 <w:lang w:val="ro-RO"/>
@@ -2892,6 +3180,8 @@
               <w:rPr>
                 <w:rFonts w:eastAsia="Arial" w:cs="Arial" w:ascii="Arial" w:hAnsi="Arial"/>
                 <w:color w:val="auto"/>
+                <w:spacing w:val="0"/>
+                <w:w w:val="100"/>
                 <w:sz w:val="20"/>
                 <w:szCs w:val="20"/>
                 <w:lang w:val="ro-RO"/>
@@ -2939,6 +3229,8 @@
                 <w:rFonts w:eastAsia="Arial" w:cs="Arial" w:ascii="Arial" w:hAnsi="Arial"/>
                 <w:b/>
                 <w:color w:val="auto"/>
+                <w:spacing w:val="0"/>
+                <w:w w:val="100"/>
                 <w:sz w:val="20"/>
                 <w:szCs w:val="20"/>
                 <w:lang w:val="ro-RO"/>
@@ -2973,6 +3265,8 @@
               <w:rPr>
                 <w:rFonts w:eastAsia="Arial" w:cs="Arial" w:ascii="Arial" w:hAnsi="Arial"/>
                 <w:color w:val="auto"/>
+                <w:spacing w:val="0"/>
+                <w:w w:val="100"/>
                 <w:sz w:val="20"/>
                 <w:szCs w:val="20"/>
                 <w:lang w:val="ro-RO"/>
@@ -3008,6 +3302,8 @@
               <w:rPr>
                 <w:rFonts w:eastAsia="Arial" w:cs="Arial" w:ascii="Arial" w:hAnsi="Arial"/>
                 <w:color w:val="auto"/>
+                <w:spacing w:val="0"/>
+                <w:w w:val="100"/>
                 <w:sz w:val="20"/>
                 <w:szCs w:val="20"/>
                 <w:lang w:val="ro-RO"/>
@@ -3043,6 +3339,8 @@
               <w:rPr>
                 <w:rFonts w:eastAsia="Arial" w:cs="Arial" w:ascii="Arial" w:hAnsi="Arial"/>
                 <w:color w:val="auto"/>
+                <w:spacing w:val="0"/>
+                <w:w w:val="100"/>
                 <w:sz w:val="20"/>
                 <w:szCs w:val="20"/>
                 <w:lang w:val="ro-RO"/>
@@ -3076,6 +3374,8 @@
               <w:rPr>
                 <w:rFonts w:eastAsia="Arial" w:cs="Arial" w:ascii="Arial" w:hAnsi="Arial"/>
                 <w:color w:val="auto"/>
+                <w:spacing w:val="0"/>
+                <w:w w:val="100"/>
                 <w:sz w:val="20"/>
                 <w:szCs w:val="20"/>
                 <w:lang w:val="ro-RO"/>
@@ -3103,6 +3403,8 @@
         <w:rPr>
           <w:rFonts w:eastAsia="Arial" w:cs="Arial" w:ascii="Arial" w:hAnsi="Arial"/>
           <w:color w:val="auto"/>
+          <w:spacing w:val="0"/>
+          <w:w w:val="100"/>
           <w:sz w:val="2"/>
           <w:szCs w:val="20"/>
           <w:lang w:val="ro-RO"/>
@@ -3144,6 +3446,8 @@
         <w:rFonts w:eastAsia="Arial" w:cs="Arial" w:ascii="Arial" w:hAnsi="Arial"/>
         <w:b w:val="false"/>
         <w:color w:val="auto"/>
+        <w:spacing w:val="0"/>
+        <w:w w:val="100"/>
         <w:sz w:val="16"/>
         <w:szCs w:val="16"/>
         <w:lang w:val="ro-RO"/>
@@ -3173,6 +3477,8 @@
         <w:rFonts w:eastAsia="Arial" w:cs="Arial" w:ascii="Arial" w:hAnsi="Arial"/>
         <w:b w:val="false"/>
         <w:color w:val="auto"/>
+        <w:spacing w:val="0"/>
+        <w:w w:val="100"/>
         <w:sz w:val="16"/>
         <w:szCs w:val="16"/>
         <w:lang w:val="ro-RO"/>
@@ -3202,6 +3508,8 @@
         <w:rFonts w:eastAsia="Arial" w:cs="Arial" w:ascii="Arial" w:hAnsi="Arial"/>
         <w:b w:val="false"/>
         <w:color w:val="auto"/>
+        <w:spacing w:val="0"/>
+        <w:w w:val="100"/>
         <w:sz w:val="16"/>
         <w:szCs w:val="16"/>
         <w:lang w:val="ro-RO"/>

</xml_diff>

<commit_message>
feat(document-engine): the last five originals, as templates with content pending
The own instructions, the training themes, the protective equipment list,
the risk assessment and the prevention plan: all 23 originals are now
templates in the house style. These five are marked `contentPending` in
the manifest. They have the typesetting, the wording pass and placeholders
for names and dates; their content is still the first client's job titles,
equipment and risks, which stages 2 and 3 of ADR 005 will supply.

What the long files needed: tables that Word floats arrive inside text
frames, which the import now walks; the risk assessment cannot be saved
once all its empty paragraphs are removed, so they stay at 1 pt; an empty
paragraph that switches the page style hands the switch on before it goes;
imported cells get a least padding; the hand-over block keeps a line
between itself and a table that follows.

Claude-Session: https://claude.ai/code/session_019fFLd3rEWZKkUNU1RuQAwk
</commit_message>
<xml_diff>
--- a/packages/document-engine/templates/1.1_decision_training.docx
+++ b/packages/document-engine/templates/1.1_decision_training.docx
@@ -2782,9 +2782,9 @@
         <w:tblInd w:w="0" w:type="dxa"/>
         <w:tblLayout w:type="fixed"/>
         <w:tblCellMar>
-          <w:top w:w="0" w:type="dxa"/>
+          <w:top w:w="17" w:type="dxa"/>
           <w:left w:w="108" w:type="dxa"/>
-          <w:bottom w:w="0" w:type="dxa"/>
+          <w:bottom w:w="17" w:type="dxa"/>
           <w:right w:w="108" w:type="dxa"/>
         </w:tblCellMar>
       </w:tblPr>

</xml_diff>

<commit_message>
fix: generate training decisions for applicable categories
</commit_message>
<xml_diff>
--- a/packages/document-engine/templates/1.1_decision_training.docx
+++ b/packages/document-engine/templates/1.1_decision_training.docx
@@ -1366,7 +1366,12 @@
           <w:szCs w:val="20"/>
           <w:lang w:val="ro-RO"/>
         </w:rPr>
-        <w:t xml:space="preserve"> stabilesc următoarele intervale de timp pentru efectuarea instructajelor periodice:</w:t>
+        <w:t xml:space="preserve"> stabilesc {{training.intervalPhrase}} pentru efectuarea instructajelor periodice:</w:t>
+      </w:r>
+    </w:p>
+    <w:p>
+      <w:r>
+        <w:t>{{#training.administrative}}</w:t>
       </w:r>
     </w:p>
     <w:p>
@@ -1503,6 +1508,16 @@
       </w:r>
     </w:p>
     <w:p>
+      <w:r>
+        <w:t>{{/training.administrative}}</w:t>
+      </w:r>
+    </w:p>
+    <w:p>
+      <w:r>
+        <w:t>{{#training.worker}}</w:t>
+      </w:r>
+    </w:p>
+    <w:p>
       <w:pPr>
         <w:pStyle w:val="Normal"/>
         <w:widowControl/>
@@ -1633,6 +1648,11 @@
           <w:lang w:val="ro-RO"/>
         </w:rPr>
         <w:t>;</w:t>
+      </w:r>
+    </w:p>
+    <w:p>
+      <w:r>
+        <w:t>{{/training.worker}}</w:t>
       </w:r>
     </w:p>
     <w:p>

</xml_diff>

<commit_message>
fix(document-engine): the sweep caps keep-with-next runs at three and sets the branding line in 7.5 pt grey
The import kept every paragraph from a heading to its table with the next one, so a long run
moved to the next page whole and left pages up to two thirds empty (2.2, 3.2, 9). The sweep
now keeps keepNext only on the last three paragraphs of a body-level run. The import's pass
over every footer character set the branding line back to 8 pt black; the sweep restores
7.5 pt grey in every footer, and add_branding also writes the complex-script size.

Claude-Session: https://claude.ai/code/session_01A9qjCHVH6kcDAEKFiJoShR
</commit_message>
<xml_diff>
--- a/packages/document-engine/templates/1.1_decision_training.docx
+++ b/packages/document-engine/templates/1.1_decision_training.docx
@@ -3462,18 +3462,22 @@
       <w:spacing w:before="60" w:after="0"/>
       <w:ind w:hanging="0" w:left="0"/>
       <w:jc w:val="center"/>
-      <w:rPr/>
+      <w:rPr>
+        <w:color w:val="7A7A7A"/>
+        <w:sz w:val="15"/>
+        <w:szCs w:val="15"/>
+      </w:rPr>
     </w:pPr>
     <w:r>
       <w:rPr>
         <w:rStyle w:val="PageNumber"/>
         <w:rFonts w:eastAsia="Arial" w:cs="Arial" w:ascii="Arial" w:hAnsi="Arial"/>
         <w:b w:val="false"/>
-        <w:color w:val="auto"/>
+        <w:color w:val="7A7A7A"/>
         <w:spacing w:val="0"/>
         <w:w w:val="100"/>
-        <w:sz w:val="16"/>
-        <w:szCs w:val="16"/>
+        <w:sz w:val="15"/>
+        <w:szCs w:val="15"/>
         <w:lang w:val="ro-RO"/>
       </w:rPr>
       <w:t>{{#branding}}Document generat cu SSM Ușor · ssmusor.ro{{/branding}}</w:t>
@@ -3490,18 +3494,22 @@
       <w:spacing w:before="60" w:after="0"/>
       <w:ind w:hanging="0" w:left="0"/>
       <w:jc w:val="center"/>
-      <w:rPr/>
+      <w:rPr>
+        <w:color w:val="7A7A7A"/>
+        <w:sz w:val="15"/>
+        <w:szCs w:val="15"/>
+      </w:rPr>
     </w:pPr>
     <w:r>
       <w:rPr>
         <w:rStyle w:val="PageNumber"/>
         <w:rFonts w:eastAsia="Arial" w:cs="Arial" w:ascii="Arial" w:hAnsi="Arial"/>
         <w:b w:val="false"/>
-        <w:color w:val="auto"/>
+        <w:color w:val="7A7A7A"/>
         <w:spacing w:val="0"/>
         <w:w w:val="100"/>
-        <w:sz w:val="16"/>
-        <w:szCs w:val="16"/>
+        <w:sz w:val="15"/>
+        <w:szCs w:val="15"/>
         <w:lang w:val="ro-RO"/>
       </w:rPr>
       <w:t>{{#branding}}Document generat cu SSM Ușor · ssmusor.ro{{/branding}}</w:t>
@@ -3518,18 +3526,22 @@
       <w:spacing w:before="60" w:after="0"/>
       <w:ind w:hanging="0" w:left="0"/>
       <w:jc w:val="center"/>
-      <w:rPr/>
+      <w:rPr>
+        <w:color w:val="7A7A7A"/>
+        <w:sz w:val="15"/>
+        <w:szCs w:val="15"/>
+      </w:rPr>
     </w:pPr>
     <w:r>
       <w:rPr>
         <w:rStyle w:val="PageNumber"/>
         <w:rFonts w:eastAsia="Arial" w:cs="Arial" w:ascii="Arial" w:hAnsi="Arial"/>
         <w:b w:val="false"/>
-        <w:color w:val="auto"/>
+        <w:color w:val="7A7A7A"/>
         <w:spacing w:val="0"/>
         <w:w w:val="100"/>
-        <w:sz w:val="16"/>
-        <w:szCs w:val="16"/>
+        <w:sz w:val="15"/>
+        <w:szCs w:val="15"/>
         <w:lang w:val="ro-RO"/>
       </w:rPr>
       <w:t>{{#branding}}Document generat cu SSM Ușor · ssmusor.ro{{/branding}}</w:t>

</xml_diff>

<commit_message>
fix(document-engine): the keep-chain cap counts keep-with-next a paragraph takes from its style
The Heading styles of 2.2, 3.2 and 11 keep every article with the next one, so the cap on the
explicit element left their long runs in place. The sweep now resolves each body paragraph's
style through basedOn and turns the earlier paragraphs of a longer run off with an explicit
keepNext false, which beats the style. A chapter heading and a line that ends in a colon
keep theirs, so neither is left alone at the foot of a page.

Claude-Session: https://claude.ai/code/session_01A9qjCHVH6kcDAEKFiJoShR
</commit_message>
<xml_diff>
--- a/packages/document-engine/templates/1.1_decision_training.docx
+++ b/packages/document-engine/templates/1.1_decision_training.docx
@@ -5,7 +5,7 @@
     <w:p>
       <w:pPr>
         <w:pStyle w:val="Heading7"/>
-        <w:keepNext w:val="true"/>
+        <w:keepNext w:val="false"/>
         <w:widowControl/>
         <w:numPr>
           <w:ilvl w:val="6"/>
@@ -2025,6 +2025,7 @@
     <w:p>
       <w:pPr>
         <w:pStyle w:val="Heading1"/>
+        <w:keepNext w:val="false"/>
         <w:widowControl/>
         <w:numPr>
           <w:ilvl w:val="2"/>
@@ -2059,6 +2060,7 @@
     <w:p>
       <w:pPr>
         <w:pStyle w:val="Heading1"/>
+        <w:keepNext w:val="false"/>
         <w:widowControl/>
         <w:numPr>
           <w:ilvl w:val="2"/>
@@ -2093,6 +2095,7 @@
     <w:p>
       <w:pPr>
         <w:pStyle w:val="Heading1"/>
+        <w:keepNext w:val="false"/>
         <w:widowControl/>
         <w:numPr>
           <w:ilvl w:val="2"/>

</xml_diff>

<commit_message>
fix(document-engine): one look for the decisions and the control regulation, worded for one person or several
"Art. N." is one numbering at 10 pt bold with a 720 tab in 1.1-1.5 and 12, and 1.2's
typed labels became that numbering. The heading reads "Nr. N SSM din …"; punctuation
and typos fixed; the sentences that named designated people in the plural read right
for one; every acknowledgement table has two blank rows; 1.1's training duration is a
paragraph after the list; 12's hand-over has the client on the left, as on the covers.

Claude-Session: https://claude.ai/code/session_01A9qjCHVH6kcDAEKFiJoShR
</commit_message>
<xml_diff>
--- a/packages/document-engine/templates/1.1_decision_training.docx
+++ b/packages/document-engine/templates/1.1_decision_training.docx
@@ -62,7 +62,7 @@
           <w:szCs w:val="20"/>
           <w:lang w:val="ro-RO"/>
         </w:rPr>
-        <w:t>Nr.: {{decisionNumber}} SSM Din: {{issueDate}}</w:t>
+        <w:t>Nr. {{decisionNumber}} SSM din {{issueDate}}</w:t>
       </w:r>
     </w:p>
     <w:p>
@@ -279,7 +279,7 @@
           <w:szCs w:val="20"/>
           <w:lang w:val="ro-RO"/>
         </w:rPr>
-        <w:t>ent.legalName}}</w:t>
+        <w:t>ent.legalName}};</w:t>
       </w:r>
     </w:p>
     <w:p>
@@ -309,7 +309,7 @@
           <w:szCs w:val="20"/>
           <w:lang w:val="ro-RO"/>
         </w:rPr>
-        <w:t>Personalul din cadrul serviciului extern de prevenire și protecție {{provider.legalName}} va efectua instruirea la locul de muncă și instruirea periodică pentru șefii locului de muncă din cadrul {{cli</w:t>
+        <w:t>Personalul din cadrul serviciului extern de prevenire și protecție {{provider.legalName}} va efectua instruirea la locul de muncă și instruirea periodică pentru personalul de conducere al locurilor de muncă din cadrul {{cli</w:t>
       </w:r>
       <w:r>
         <w:rPr>
@@ -455,7 +455,7 @@
           <w:szCs w:val="20"/>
           <w:lang w:val="ro-RO"/>
         </w:rPr>
-        <w:t>ent.legalName}}</w:t>
+        <w:t>ent.legalName}}.</w:t>
       </w:r>
     </w:p>
     <w:p>
@@ -691,7 +691,7 @@
           <w:szCs w:val="20"/>
           <w:lang w:val="ro-RO"/>
         </w:rPr>
-        <w:t>la angajarea lucrătorilor definiți conform art. 5 lit. a) din legea 319/ 2006;</w:t>
+        <w:t>la angajarea lucrătorilor definiți conform art. 5 lit. a) din Legea 319/ 2006;</w:t>
       </w:r>
     </w:p>
     <w:p>
@@ -938,7 +938,7 @@
           <w:szCs w:val="20"/>
           <w:lang w:val="ro-RO"/>
         </w:rPr>
-        <w:t>la angajarea lucrătorilor definiți conform art. 5 lit. a) din legea 319/ 2006;</w:t>
+        <w:t>la angajarea lucrătorilor definiți conform art. 5 lit. a) din Legea 319/ 2006;</w:t>
       </w:r>
     </w:p>
     <w:p>
@@ -1401,19 +1401,19 @@
           <w:u w:val="single"/>
           <w:lang w:val="ro-RO"/>
         </w:rPr>
-        <w:t xml:space="preserve">personalul tehnic-administrativ </w:t>
-      </w:r>
-      <w:r>
-        <w:rPr>
-          <w:rFonts w:eastAsia="Arial" w:cs="Arial" w:ascii="Arial" w:hAnsi="Arial"/>
-          <w:color w:val="auto"/>
-          <w:spacing w:val="0"/>
-          <w:w w:val="100"/>
-          <w:sz w:val="20"/>
-          <w:szCs w:val="20"/>
-          <w:lang w:val="ro-RO"/>
-        </w:rPr>
-        <w:t xml:space="preserve">și șefii de locuri de muncă, va fi instruit </w:t>
+        <w:t xml:space="preserve">personalul tehnic-administrativ</w:t>
+      </w:r>
+      <w:r>
+        <w:rPr>
+          <w:rFonts w:eastAsia="Arial" w:cs="Arial" w:ascii="Arial" w:hAnsi="Arial"/>
+          <w:color w:val="auto"/>
+          <w:spacing w:val="0"/>
+          <w:w w:val="100"/>
+          <w:sz w:val="20"/>
+          <w:szCs w:val="20"/>
+          <w:lang w:val="ro-RO"/>
+        </w:rPr>
+        <w:t xml:space="preserve"> și șefii de locuri de muncă vor fi instruiți </w:t>
       </w:r>
       <w:r>
         <w:rPr>
@@ -1544,7 +1544,7 @@
           <w:u w:val="single"/>
           <w:lang w:val="ro-RO"/>
         </w:rPr>
-        <w:t>personalul de execuție,</w:t>
+        <w:t>personalul de execuție</w:t>
       </w:r>
       <w:r>
         <w:rPr>
@@ -2165,12 +2165,8 @@
       <w:pPr>
         <w:pStyle w:val="Heading1"/>
         <w:widowControl/>
-        <w:numPr>
-          <w:ilvl w:val="2"/>
-          <w:numId w:val="2"/>
-        </w:numPr>
-        <w:spacing w:before="0" w:after="40"/>
-        <w:ind w:right="0"/>
+        <w:spacing w:before="80" w:after="120"/>
+        <w:ind w:left="1080" w:right="0" w:hanging="0"/>
         <w:jc w:val="left"/>
         <w:rPr>
           <w:rStyle w:val="tpa1"/>
@@ -2215,7 +2211,7 @@
           <w:szCs w:val="20"/>
           <w:lang w:val="ro-RO"/>
         </w:rPr>
-        <w:t>;</w:t>
+        <w:t>.</w:t>
       </w:r>
     </w:p>
     <w:p>
@@ -2365,7 +2361,7 @@
           <w:szCs w:val="20"/>
           <w:lang w:val="ro-RO"/>
         </w:rPr>
-        <w:t>vider.legalName}}</w:t>
+        <w:t>vider.legalName}}.</w:t>
       </w:r>
     </w:p>
     <w:p>
@@ -2433,7 +2429,7 @@
           <w:szCs w:val="20"/>
           <w:lang w:val="ro-RO"/>
         </w:rPr>
-        <w:t>vider.legalName}}</w:t>
+        <w:t>vider.legalName}}.</w:t>
       </w:r>
     </w:p>
     <w:p>
@@ -2462,7 +2458,7 @@
           <w:szCs w:val="20"/>
           <w:lang w:val="ro-RO"/>
         </w:rPr>
-        <w:t>În cazul în care persoanele numite pe funcții cu atribuții în domeniul securității și sănătății în muncă (șefi de loc de muncă menționați mai sus), se schimbă, noii angajați vor lua la cunoștința despre prezenta decizie prin semnarea</w:t>
+        <w:t>În cazul în care persoanele numite pe funcții cu atribuții în domeniul securității și sănătății în muncă (șefi de loc de muncă menționați mai sus), se schimbă, noii angajați vor lua la cunoștință despre prezenta decizie prin semnarea</w:t>
       </w:r>
       <w:r>
         <w:rPr>
@@ -3238,6 +3234,201 @@
           <w:p>
             <w:pPr>
               <w:pStyle w:val="Normal"/>
+              <w:keepNext w:val="true"/>
+              <w:widowControl/>
+              <w:numPr>
+                <w:ilvl w:val="0"/>
+                <w:numId w:val="5"/>
+              </w:numPr>
+              <w:snapToGrid w:val="false"/>
+              <w:spacing w:before="0" w:after="0"/>
+              <w:ind w:hanging="360" w:left="360" w:right="-108"/>
+              <w:jc w:val="center"/>
+              <w:rPr>
+                <w:rFonts w:ascii="Arial" w:hAnsi="Arial" w:cs="Arial"/>
+                <w:b/>
+                <w:sz w:val="20"/>
+                <w:szCs w:val="20"/>
+              </w:rPr>
+            </w:pPr>
+            <w:r>
+              <w:rPr>
+                <w:rFonts w:eastAsia="Arial" w:cs="Arial" w:ascii="Arial" w:hAnsi="Arial"/>
+                <w:b/>
+                <w:color w:val="auto"/>
+                <w:spacing w:val="0"/>
+                <w:w w:val="100"/>
+                <w:sz w:val="20"/>
+                <w:szCs w:val="20"/>
+                <w:lang w:val="ro-RO"/>
+              </w:rPr>
+            </w:r>
+          </w:p>
+        </w:tc>
+        <w:tc>
+          <w:tcPr>
+            <w:tcW w:w="3458" w:type="dxa"/>
+            <w:tcBorders>
+              <w:top w:val="single" w:sz="4" w:space="0" w:color="000000"/>
+              <w:left w:val="single" w:sz="4" w:space="0" w:color="000000"/>
+              <w:bottom w:val="single" w:sz="4" w:space="0" w:color="000000"/>
+              <w:right w:val="single" w:sz="4" w:space="0" w:color="000000"/>
+            </w:tcBorders>
+            <w:vAlign w:val="center"/>
+          </w:tcPr>
+          <w:p>
+            <w:pPr>
+              <w:pStyle w:val="Normal"/>
+              <w:widowControl/>
+              <w:snapToGrid w:val="false"/>
+              <w:spacing w:before="0" w:after="0"/>
+              <w:rPr>
+                <w:rFonts w:ascii="Arial" w:hAnsi="Arial" w:cs="Arial"/>
+                <w:sz w:val="20"/>
+                <w:szCs w:val="20"/>
+              </w:rPr>
+            </w:pPr>
+            <w:r>
+              <w:rPr>
+                <w:rFonts w:eastAsia="Arial" w:cs="Arial" w:ascii="Arial" w:hAnsi="Arial"/>
+                <w:color w:val="auto"/>
+                <w:spacing w:val="0"/>
+                <w:w w:val="100"/>
+                <w:sz w:val="20"/>
+                <w:szCs w:val="20"/>
+                <w:lang w:val="ro-RO"/>
+              </w:rPr>
+            </w:r>
+          </w:p>
+        </w:tc>
+        <w:tc>
+          <w:tcPr>
+            <w:tcW w:w="2076" w:type="dxa"/>
+            <w:tcBorders>
+              <w:top w:val="single" w:sz="4" w:space="0" w:color="000000"/>
+              <w:left w:val="single" w:sz="4" w:space="0" w:color="000000"/>
+              <w:bottom w:val="single" w:sz="4" w:space="0" w:color="000000"/>
+              <w:right w:val="single" w:sz="4" w:space="0" w:color="000000"/>
+            </w:tcBorders>
+            <w:vAlign w:val="center"/>
+          </w:tcPr>
+          <w:p>
+            <w:pPr>
+              <w:pStyle w:val="Normal"/>
+              <w:widowControl/>
+              <w:snapToGrid w:val="false"/>
+              <w:spacing w:before="0" w:after="0"/>
+              <w:jc w:val="center"/>
+              <w:rPr>
+                <w:rFonts w:ascii="Arial" w:hAnsi="Arial" w:cs="Arial"/>
+                <w:sz w:val="20"/>
+                <w:szCs w:val="20"/>
+              </w:rPr>
+            </w:pPr>
+            <w:r>
+              <w:rPr>
+                <w:rFonts w:eastAsia="Arial" w:cs="Arial" w:ascii="Arial" w:hAnsi="Arial"/>
+                <w:color w:val="auto"/>
+                <w:spacing w:val="0"/>
+                <w:w w:val="100"/>
+                <w:sz w:val="20"/>
+                <w:szCs w:val="20"/>
+                <w:lang w:val="ro-RO"/>
+              </w:rPr>
+            </w:r>
+          </w:p>
+        </w:tc>
+        <w:tc>
+          <w:tcPr>
+            <w:tcW w:w="1297" w:type="dxa"/>
+            <w:tcBorders>
+              <w:top w:val="single" w:sz="4" w:space="0" w:color="000000"/>
+              <w:left w:val="single" w:sz="4" w:space="0" w:color="000000"/>
+              <w:bottom w:val="single" w:sz="4" w:space="0" w:color="000000"/>
+              <w:right w:val="single" w:sz="4" w:space="0" w:color="000000"/>
+            </w:tcBorders>
+            <w:vAlign w:val="center"/>
+          </w:tcPr>
+          <w:p>
+            <w:pPr>
+              <w:pStyle w:val="Normal"/>
+              <w:widowControl/>
+              <w:snapToGrid w:val="false"/>
+              <w:spacing w:before="0" w:after="0"/>
+              <w:jc w:val="center"/>
+              <w:rPr>
+                <w:rFonts w:ascii="Arial" w:hAnsi="Arial" w:cs="Arial"/>
+                <w:sz w:val="20"/>
+                <w:szCs w:val="20"/>
+              </w:rPr>
+            </w:pPr>
+            <w:r>
+              <w:rPr>
+                <w:rFonts w:eastAsia="Arial" w:cs="Arial" w:ascii="Arial" w:hAnsi="Arial"/>
+                <w:color w:val="auto"/>
+                <w:spacing w:val="0"/>
+                <w:w w:val="100"/>
+                <w:sz w:val="20"/>
+                <w:szCs w:val="20"/>
+                <w:lang w:val="ro-RO"/>
+              </w:rPr>
+            </w:r>
+          </w:p>
+        </w:tc>
+        <w:tc>
+          <w:tcPr>
+            <w:tcW w:w="1903" w:type="dxa"/>
+            <w:tcBorders>
+              <w:top w:val="single" w:sz="4" w:space="0" w:color="000000"/>
+              <w:left w:val="single" w:sz="4" w:space="0" w:color="000000"/>
+              <w:bottom w:val="single" w:sz="4" w:space="0" w:color="000000"/>
+              <w:right w:val="single" w:sz="4" w:space="0" w:color="000000"/>
+            </w:tcBorders>
+          </w:tcPr>
+          <w:p>
+            <w:pPr>
+              <w:pStyle w:val="Normal"/>
+              <w:widowControl/>
+              <w:snapToGrid w:val="false"/>
+              <w:spacing w:before="0" w:after="0"/>
+              <w:rPr>
+                <w:rFonts w:ascii="Arial" w:hAnsi="Arial" w:cs="Arial"/>
+                <w:sz w:val="20"/>
+                <w:szCs w:val="20"/>
+              </w:rPr>
+            </w:pPr>
+            <w:r>
+              <w:rPr>
+                <w:rFonts w:eastAsia="Arial" w:cs="Arial" w:ascii="Arial" w:hAnsi="Arial"/>
+                <w:color w:val="auto"/>
+                <w:spacing w:val="0"/>
+                <w:w w:val="100"/>
+                <w:sz w:val="20"/>
+                <w:szCs w:val="20"/>
+                <w:lang w:val="ro-RO"/>
+              </w:rPr>
+            </w:r>
+          </w:p>
+        </w:tc>
+      </w:tr>
+      <w:tr>
+        <w:trPr>
+          <w:trHeight w:val="360" w:hRule="atLeast"/>
+        </w:trPr>
+        <w:tc>
+          <w:tcPr>
+            <w:tcW w:w="621" w:type="dxa"/>
+            <w:tcBorders>
+              <w:top w:val="single" w:sz="4" w:space="0" w:color="000000"/>
+              <w:left w:val="single" w:sz="4" w:space="0" w:color="000000"/>
+              <w:bottom w:val="single" w:sz="4" w:space="0" w:color="000000"/>
+              <w:right w:val="single" w:sz="4" w:space="0" w:color="000000"/>
+            </w:tcBorders>
+            <w:vAlign w:val="center"/>
+          </w:tcPr>
+          <w:p>
+            <w:pPr>
+              <w:pStyle w:val="Normal"/>
               <w:widowControl/>
               <w:numPr>
                 <w:ilvl w:val="0"/>

</xml_diff>

<commit_message>
fix(document-engine): a capped keep chain keeps its head, and a line ending in ":" keeps with its list
The sweep's keep-chain cap kept only the last three paragraphs of a long run, so an article
that opens a list ("(1) Mijloacele de semnalizare rutieră sunt") could end a page with its
list on the next. A capped run now also keeps its first two. A line ending in ":" followed by
a list item (numbered, or a typed "a)", "1.", "–") keeps with it. The typesetting tests
assert the second rule; the first still passes the "at most three in a row" test.

The templates were re-swept after giving back keep-with-next to the paragraphs the first cap
(19b2e4a, 45b3714) had cut, matched through the history, so the new cap could choose again.

Claude-Session: https://claude.ai/code/session_01A9qjCHVH6kcDAEKFiJoShR
</commit_message>
<xml_diff>
--- a/packages/document-engine/templates/1.1_decision_training.docx
+++ b/packages/document-engine/templates/1.1_decision_training.docx
@@ -5,7 +5,7 @@
     <w:p>
       <w:pPr>
         <w:pStyle w:val="Heading7"/>
-        <w:keepNext w:val="false"/>
+        <w:keepNext/>
         <w:widowControl/>
         <w:numPr>
           <w:ilvl w:val="6"/>
@@ -38,6 +38,7 @@
     <w:p>
       <w:pPr>
         <w:pStyle w:val="Heading7"/>
+        <w:keepNext w:val="false"/>
         <w:widowControl/>
         <w:numPr>
           <w:ilvl w:val="6"/>
@@ -188,6 +189,7 @@
     <w:p>
       <w:pPr>
         <w:pStyle w:val="Normal"/>
+        <w:keepNext/>
         <w:widowControl/>
         <w:numPr>
           <w:ilvl w:val="0"/>
@@ -493,6 +495,7 @@
     <w:p>
       <w:pPr>
         <w:pStyle w:val="Normal"/>
+        <w:keepNext/>
         <w:widowControl/>
         <w:numPr>
           <w:ilvl w:val="0"/>
@@ -547,6 +550,7 @@
     <w:p>
       <w:pPr>
         <w:pStyle w:val="Normal"/>
+        <w:keepNext/>
         <w:widowControl/>
         <w:numPr>
           <w:ilvl w:val="0"/>
@@ -635,6 +639,7 @@
     <w:p>
       <w:pPr>
         <w:pStyle w:val="Normal"/>
+        <w:keepNext/>
         <w:widowControl/>
         <w:numPr>
           <w:ilvl w:val="0"/>
@@ -796,6 +801,7 @@
     <w:p>
       <w:pPr>
         <w:pStyle w:val="Normal"/>
+        <w:keepNext/>
         <w:widowControl/>
         <w:numPr>
           <w:ilvl w:val="0"/>
@@ -884,6 +890,7 @@
     <w:p>
       <w:pPr>
         <w:pStyle w:val="Normal"/>
+        <w:keepNext/>
         <w:widowControl/>
         <w:numPr>
           <w:ilvl w:val="0"/>
@@ -1096,6 +1103,7 @@
     <w:p>
       <w:pPr>
         <w:pStyle w:val="Normal"/>
+        <w:keepNext/>
         <w:widowControl/>
         <w:numPr>
           <w:ilvl w:val="0"/>
@@ -2025,7 +2033,7 @@
     <w:p>
       <w:pPr>
         <w:pStyle w:val="Heading1"/>
-        <w:keepNext w:val="false"/>
+        <w:keepNext/>
         <w:widowControl/>
         <w:numPr>
           <w:ilvl w:val="2"/>

</xml_diff>

<commit_message>
fix(templates): 1.1 names the workplace managers once, in one item
Art. 1 pt 3 repeated a paragraph per manager, each saying they train the whole staff. It is
now one item: "Personalul de conducere al locurilor de muncă – {{workplaceManagersText}} –
va efectua instruirea la locul de muncă și instruirea periodică pentru întreg personalul din
cadrul {{client.legalName}}."

Claude-Session: https://claude.ai/code/session_01A9qjCHVH6kcDAEKFiJoShR
</commit_message>
<xml_diff>
--- a/packages/document-engine/templates/1.1_decision_training.docx
+++ b/packages/document-engine/templates/1.1_decision_training.docx
@@ -395,7 +395,7 @@
           <w:ilvl w:val="1"/>
           <w:numId w:val="9"/>
         </w:numPr>
-        <w:spacing w:before="0" w:after="40"/>
+        <w:spacing w:before="0" w:after="120"/>
         <w:jc w:val="left"/>
         <w:rPr>
           <w:rFonts w:ascii="Arial" w:hAnsi="Arial" w:cs="Arial"/>
@@ -414,82 +414,7 @@
           <w:szCs w:val="20"/>
           <w:lang w:val="ro-RO"/>
         </w:rPr>
-        <w:t>{{#workplaceManagers}}</w:t>
-      </w:r>
-    </w:p>
-    <w:p>
-      <w:pPr>
-        <w:pStyle w:val="Normal"/>
-        <w:widowControl/>
-        <w:numPr>
-          <w:ilvl w:val="1"/>
-          <w:numId w:val="9"/>
-        </w:numPr>
-        <w:spacing w:before="0" w:after="40"/>
-        <w:jc w:val="left"/>
-        <w:rPr>
-          <w:rFonts w:ascii="Arial" w:hAnsi="Arial" w:cs="Arial"/>
-          <w:b/>
-          <w:sz w:val="20"/>
-          <w:szCs w:val="20"/>
-        </w:rPr>
-      </w:pPr>
-      <w:r>
-        <w:rPr>
-          <w:rFonts w:eastAsia="Arial" w:cs="Arial" w:ascii="Arial" w:hAnsi="Arial"/>
-          <w:color w:val="auto"/>
-          <w:spacing w:val="0"/>
-          <w:w w:val="100"/>
-          <w:sz w:val="20"/>
-          <w:szCs w:val="20"/>
-          <w:lang w:val="ro-RO"/>
-        </w:rPr>
-        <w:t>{{name}} având funcția de {{jobTitle}} va efectua instruirea la locul de muncă și instruirea periodică pentru întreg personalul din cadrul {{cli</w:t>
-      </w:r>
-      <w:r>
-        <w:rPr>
-          <w:rStyle w:val="PageNumber"/>
-          <w:rFonts w:eastAsia="Arial" w:cs="Arial" w:ascii="Arial" w:hAnsi="Arial"/>
-          <w:color w:val="auto"/>
-          <w:spacing w:val="0"/>
-          <w:w w:val="100"/>
-          <w:sz w:val="20"/>
-          <w:szCs w:val="20"/>
-          <w:lang w:val="ro-RO"/>
-        </w:rPr>
-        <w:t>ent.legalName}}.</w:t>
-      </w:r>
-    </w:p>
-    <w:p>
-      <w:pPr>
-        <w:pStyle w:val="Normal"/>
-        <w:widowControl/>
-        <w:numPr>
-          <w:ilvl w:val="1"/>
-          <w:numId w:val="9"/>
-        </w:numPr>
-        <w:spacing w:before="0" w:after="120"/>
-        <w:jc w:val="left"/>
-        <w:rPr>
-          <w:rFonts w:ascii="Arial" w:hAnsi="Arial" w:cs="Arial"/>
-          <w:b/>
-          <w:sz w:val="20"/>
-          <w:szCs w:val="20"/>
-        </w:rPr>
-      </w:pPr>
-      <w:r>
-        <w:rPr>
-          <w:rFonts w:eastAsia="Arial" w:cs="Arial" w:ascii="Arial" w:hAnsi="Arial"/>
-          <w:b/>
-          <w:bCs/>
-          <w:color w:val="auto"/>
-          <w:spacing w:val="0"/>
-          <w:w w:val="100"/>
-          <w:sz w:val="20"/>
-          <w:szCs w:val="20"/>
-          <w:lang w:val="ro-RO"/>
-        </w:rPr>
-        <w:t>{{/workplaceManagers}}</w:t>
+        <w:t>Personalul de conducere al locurilor de muncă – {{workplaceManagersText}} – va efectua instruirea la locul de muncă și instruirea periodică pentru întreg personalul din cadrul {{client.legalName}}.</w:t>
       </w:r>
     </w:p>
     <w:p>

</xml_diff>

<commit_message>
fix(templates): punctuation and "proces-verbal" in the decisions 1.1–1.5
1.1: "Art. 89, alin. (1)", "pct. 4 –", "(Conf. H.G. 767/ 2016, pct. 6)", "H.G. 1425/ 2006,
Art. 96, alin. (2)", "SEMESTRIAL, respectiv", "– Art. 100", "atât …, cât și", no comma
between the subject and "se va realiza/executa/face". 1.3: the same comma. 1.4: "Art. 11,
alin. (1), lit. b)" and no comma before "sau reprezentantul legal". 1.5: the apposition in
Art. 7 closes with a comma. Every decision hyphenates "PROCES-VERBAL".

Claude-Session: https://claude.ai/code/session_01A9qjCHVH6kcDAEKFiJoShR
</commit_message>
<xml_diff>
--- a/packages/document-engine/templates/1.1_decision_training.docx
+++ b/packages/document-engine/templates/1.1_decision_training.docx
@@ -93,7 +93,7 @@
           <w:szCs w:val="20"/>
           <w:lang w:val="ro-RO"/>
         </w:rPr>
-        <w:t>În baza prevederilor legale în domeniul securității și sănătății în muncă din Legea 319/ 2006 Art. 8, alin. (1), alin. (4), și din H.G. 1425/ 2006 Art. 14, Art. 15, alin. (1), punctul 4, Art. 20, alin. (1), Art. 85, Art. 89 alin. (1), Art. 91, alin. (1), Art. 94, Art. 96, alin. (1) și alin. (4), {{client.representativeName}} în calitate de</w:t>
+        <w:t xml:space="preserve">În baza prevederilor legale în domeniul securității și sănătății în muncă din Legea 319/ 2006 Art. 8, alin. (1), alin. (4), și din H.G. 1425/ 2006 Art. 14, Art. 15, alin. (1), punctul 4, Art. 20, alin. (1), Art. 85, Art. 89, alin. (1), Art. 91, alin. (1), Art. 94, Art. 96, alin. (1) și alin. (4), {{client.representativeName}} în calitate de</w:t>
       </w:r>
       <w:r>
         <w:rPr>
@@ -238,7 +238,7 @@
           <w:szCs w:val="20"/>
           <w:lang w:val="ro-RO"/>
         </w:rPr>
-        <w:t>, se va realiza astfel:</w:t>
+        <w:t xml:space="preserve"> se va realiza astfel:</w:t>
       </w:r>
     </w:p>
     <w:p>
@@ -469,7 +469,7 @@
           <w:szCs w:val="20"/>
           <w:lang w:val="ro-RO"/>
         </w:rPr>
-        <w:t>, se va executa astfel:</w:t>
+        <w:t xml:space="preserve"> se va executa astfel:</w:t>
       </w:r>
     </w:p>
     <w:p>
@@ -558,7 +558,7 @@
           <w:szCs w:val="20"/>
           <w:lang w:val="ro-RO"/>
         </w:rPr>
-        <w:t>Conf. H.G. 767/ 2016 - Durata instruirii introductiv-generale nu va fi mai mică de 4 ore;</w:t>
+        <w:t xml:space="preserve">Conf. H.G. 767/ 2016 – Durata instruirii introductiv-generale nu va fi mai mică de 4 ore;</w:t>
       </w:r>
     </w:p>
     <w:p>
@@ -809,7 +809,7 @@
           <w:szCs w:val="20"/>
           <w:lang w:val="ro-RO"/>
         </w:rPr>
-        <w:t>Conf. H.G. 767/ 2016 pct.4 - Durata instruirii la locul de muncă nu va fi mai mică de 4 ore;</w:t>
+        <w:t xml:space="preserve">Conf. H.G. 767/ 2016 pct. 4 – Durata instruirii la locul de muncă nu va fi mai mică de 4 ore;</w:t>
       </w:r>
     </w:p>
     <w:p>
@@ -1168,7 +1168,7 @@
           <w:szCs w:val="20"/>
           <w:lang w:val="ro-RO"/>
         </w:rPr>
-        <w:t xml:space="preserve">Conf. H.G. 767/ 2016, pct. 6) În cadrul {{client.legalName}}, </w:t>
+        <w:t xml:space="preserve">(Conf. H.G. 767/ 2016, pct. 6) În cadrul {{client.legalName}}, </w:t>
       </w:r>
       <w:r>
         <w:rPr>
@@ -1287,7 +1287,7 @@
           <w:szCs w:val="20"/>
           <w:lang w:val="ro-RO"/>
         </w:rPr>
-        <w:t>HG 1425/2006, Art. 96, alin (2)</w:t>
+        <w:t xml:space="preserve">H.G. 1425/ 2006, Art. 96, alin. (2)</w:t>
       </w:r>
       <w:r>
         <w:rPr>
@@ -1360,7 +1360,7 @@
           <w:szCs w:val="20"/>
           <w:lang w:val="ro-RO"/>
         </w:rPr>
-        <w:t>{{training.administrativeFrequency}}</w:t>
+        <w:t xml:space="preserve">{{training.administrativeFrequency}}, </w:t>
       </w:r>
       <w:r>
         <w:rPr>
@@ -1373,7 +1373,7 @@
           <w:szCs w:val="20"/>
           <w:lang w:val="ro-RO"/>
         </w:rPr>
-        <w:t xml:space="preserve"> </w:t>
+        <w:t xml:space="preserve"/>
       </w:r>
       <w:r>
         <w:rPr>
@@ -1503,7 +1503,7 @@
           <w:szCs w:val="20"/>
           <w:lang w:val="ro-RO"/>
         </w:rPr>
-        <w:t>{{training.workerFrequency}}</w:t>
+        <w:t xml:space="preserve">{{training.workerFrequency}}, </w:t>
       </w:r>
       <w:r>
         <w:rPr>
@@ -1516,7 +1516,7 @@
           <w:szCs w:val="20"/>
           <w:lang w:val="ro-RO"/>
         </w:rPr>
-        <w:t xml:space="preserve"> </w:t>
+        <w:t xml:space="preserve"/>
       </w:r>
       <w:r>
         <w:rPr>
@@ -2176,7 +2176,7 @@
           <w:szCs w:val="20"/>
           <w:lang w:val="ro-RO"/>
         </w:rPr>
-        <w:t>(Preluare din H.G. 1425/ 2006 –Art. 100)</w:t>
+        <w:t xml:space="preserve">(Preluare din H.G. 1425/ 2006 – Art. 100)</w:t>
       </w:r>
       <w:r>
         <w:rPr>
@@ -2227,7 +2227,7 @@
           <w:szCs w:val="20"/>
           <w:lang w:val="ro-RO"/>
         </w:rPr>
-        <w:t xml:space="preserve"> care vor fi păstrate la persoana care efectuează instruirea. Instruirea suplimentară va cuprinde atât tematica de la instruirea introductiv-generală cât și tematica de la instruirea de la locul de muncă.</w:t>
+        <w:t xml:space="preserve"> care vor fi păstrate la persoana care efectuează instruirea. Instruirea suplimentară va cuprinde atât tematica de la instruirea introductiv-generală, cât și tematica de la instruirea de la locul de muncă.</w:t>
       </w:r>
     </w:p>
     <w:p>
@@ -2281,7 +2281,7 @@
           <w:szCs w:val="20"/>
           <w:lang w:val="ro-RO"/>
         </w:rPr>
-        <w:t>, se va face pe bază de teste, de către serviciul extern de prevenire și protecție prin specialiștii în domeniul securității și sănătății în muncă din cadrul {{pro</w:t>
+        <w:t xml:space="preserve"> se va face pe bază de teste, de către serviciul extern de prevenire și protecție prin specialiștii în domeniul securității și sănătății în muncă din cadrul {{pro</w:t>
       </w:r>
       <w:r>
         <w:rPr>
@@ -2416,7 +2416,7 @@
           <w:szCs w:val="20"/>
           <w:lang w:val="ro-RO"/>
         </w:rPr>
-        <w:t>procesului verbal de luare la cunoștință și de primire a unui exemplar al prezentei decizii.</w:t>
+        <w:t xml:space="preserve">procesului-verbal de luare la cunoștință și de primire a unui exemplar al prezentei decizii.</w:t>
       </w:r>
     </w:p>
     <w:p>
@@ -2657,7 +2657,7 @@
           <w:szCs w:val="20"/>
           <w:lang w:val="ro-RO"/>
         </w:rPr>
-        <w:t>PROCES VERBAL DE LUARE LA CUNOȘTINȚĂ</w:t>
+        <w:t xml:space="preserve">PROCES-VERBAL DE LUARE LA CUNOȘTINȚĂ</w:t>
       </w:r>
     </w:p>
     <w:p>

</xml_diff>

<commit_message>
fix(templates): training and representatives' durations state the legal minimum of H.G. 1425/2006
Decision 1.1 and own instructions Art. 40 attributed 4-hour minimums to H.G. 767/2016, which sets none: H.G. 1425/2006 art. 80¹ (added by H.G. 767/2016) puts each training phase and the supplementary periodic training at no less than 1 hour, and art. 99 leaves the supplementary training's duration to the employer with the workplace manager, designated worker or prevention service. 1.1 now cites art. 80¹ for the introductory, workplace and supplementary minimums and for the client's periodic duration; 3.2 Art. 40 quotes art. 99 and adds art. 80¹'s minimum.

Employer briefing Art. 76 points 39 and 46 gave the committee representatives "15 ore pe lună"; they now quote art. 61 alin. (2)'s scale by headcount (2 to 20 hours a month).

Claude-Session: https://claude.ai/code/session_01A9qjCHVH6kcDAEKFiJoShR
</commit_message>
<xml_diff>
--- a/packages/document-engine/templates/1.1_decision_training.docx
+++ b/packages/document-engine/templates/1.1_decision_training.docx
@@ -558,7 +558,7 @@
           <w:szCs w:val="20"/>
           <w:lang w:val="ro-RO"/>
         </w:rPr>
-        <w:t xml:space="preserve">Conf. H.G. 767/ 2016 – Durata instruirii introductiv-generale nu va fi mai mică de 4 ore;</w:t>
+        <w:t xml:space="preserve">H.G. 1425/ 2006, Art. 80¹ – Durata instruirii introductiv-generale nu va fi mai mică de 1 oră;</w:t>
       </w:r>
     </w:p>
     <w:p>
@@ -809,7 +809,7 @@
           <w:szCs w:val="20"/>
           <w:lang w:val="ro-RO"/>
         </w:rPr>
-        <w:t xml:space="preserve">Conf. H.G. 767/ 2016 pct. 4 – Durata instruirii la locul de muncă nu va fi mai mică de 4 ore;</w:t>
+        <w:t xml:space="preserve">H.G. 1425/ 2006, Art. 80¹ – Durata instruirii la locul de muncă nu va fi mai mică de 1 oră;</w:t>
       </w:r>
     </w:p>
     <w:p>
@@ -1168,7 +1168,7 @@
           <w:szCs w:val="20"/>
           <w:lang w:val="ro-RO"/>
         </w:rPr>
-        <w:t xml:space="preserve">(Conf. H.G. 767/ 2016, pct. 6) În cadrul {{client.legalName}}, </w:t>
+        <w:t xml:space="preserve">(Conf. H.G. 1425/ 2006, Art. 80¹) În cadrul {{client.legalName}}, </w:t>
       </w:r>
       <w:r>
         <w:rPr>
@@ -2119,32 +2119,7 @@
           <w:szCs w:val="20"/>
           <w:lang w:val="ro-RO"/>
         </w:rPr>
-        <w:t xml:space="preserve">Durata instruirii suplimentare va fi de </w:t>
-      </w:r>
-      <w:r>
-        <w:rPr>
-          <w:rFonts w:eastAsia="Arial" w:cs="Arial" w:ascii="Arial" w:hAnsi="Arial"/>
-          <w:b/>
-          <w:color w:val="auto"/>
-          <w:spacing w:val="0"/>
-          <w:w w:val="100"/>
-          <w:sz w:val="20"/>
-          <w:szCs w:val="20"/>
-          <w:lang w:val="ro-RO"/>
-        </w:rPr>
-        <w:t>4 ore</w:t>
-      </w:r>
-      <w:r>
-        <w:rPr>
-          <w:rFonts w:eastAsia="Arial" w:cs="Arial" w:ascii="Arial" w:hAnsi="Arial"/>
-          <w:color w:val="auto"/>
-          <w:spacing w:val="0"/>
-          <w:w w:val="100"/>
-          <w:sz w:val="20"/>
-          <w:szCs w:val="20"/>
-          <w:lang w:val="ro-RO"/>
-        </w:rPr>
-        <w:t>.</w:t>
+        <w:t xml:space="preserve">H.G. 1425/ 2006, Art. 80¹ – Durata instruirii suplimentare nu va fi mai mică de 1 oră.</w:t>
       </w:r>
     </w:p>
     <w:p>

</xml_diff>

<commit_message>
fix(templates): the employer briefing and decision 1.1 name the trainers 4.2 names
The briefing's points on who trains name the workplace manager or the external service instead of a
worker with safety duties the client does not have. Decision 1.1 has the external service train the
technical-administrative staff and the workplace managers, and the managers train the execution
staff, as the training themes decide per staff category.

Claude-Session: https://claude.ai/code/session_01A9qjCHVH6kcDAEKFiJoShR
</commit_message>
<xml_diff>
--- a/packages/document-engine/templates/1.1_decision_training.docx
+++ b/packages/document-engine/templates/1.1_decision_training.docx
@@ -311,7 +311,7 @@
           <w:szCs w:val="20"/>
           <w:lang w:val="ro-RO"/>
         </w:rPr>
-        <w:t>Personalul din cadrul serviciului extern de prevenire și protecție {{provider.legalName}} va efectua instruirea la locul de muncă și instruirea periodică pentru personalul de conducere al locurilor de muncă din cadrul {{cli</w:t>
+        <w:t xml:space="preserve">Personalul din cadrul serviciului extern de prevenire și protecție {{provider.legalName}} va efectua instruirea la locul de muncă și instruirea periodică pentru {{#training.administrative}}personalul tehnico-administrativ și pentru {{/training.administrative}}personalul de conducere al locurilor de muncă din cadrul {{cli</w:t>
       </w:r>
       <w:r>
         <w:rPr>
@@ -414,7 +414,7 @@
           <w:szCs w:val="20"/>
           <w:lang w:val="ro-RO"/>
         </w:rPr>
-        <w:t>Personalul de conducere al locurilor de muncă – {{workplaceManagersText}} – va efectua instruirea la locul de muncă și instruirea periodică pentru întreg personalul din cadrul {{client.legalName}}.</w:t>
+        <w:t xml:space="preserve">Personalul de conducere al locurilor de muncă – {{workplaceManagersText}} – va efectua instruirea la locul de muncă și instruirea periodică pentru personalul de execuție din cadrul {{client.legalName}}.</w:t>
       </w:r>
     </w:p>
     <w:p>

</xml_diff>

<commit_message>
fix(documents): the documents spell the staff category tehnico-administrativ
H.G. 1425/2006 art. 96(3) says "personalul tehnico-administrativ". Decision 1.1 and the category
label in 6's table of posts follow it; the app's labels, the database and the API keep their own.

Claude-Session: https://claude.ai/code/session_01A9qjCHVH6kcDAEKFiJoShR
</commit_message>
<xml_diff>
--- a/packages/document-engine/templates/1.1_decision_training.docx
+++ b/packages/document-engine/templates/1.1_decision_training.docx
@@ -1334,19 +1334,19 @@
           <w:u w:val="single"/>
           <w:lang w:val="ro-RO"/>
         </w:rPr>
-        <w:t xml:space="preserve">personalul tehnic-administrativ</w:t>
-      </w:r>
-      <w:r>
-        <w:rPr>
-          <w:rFonts w:eastAsia="Arial" w:cs="Arial" w:ascii="Arial" w:hAnsi="Arial"/>
-          <w:color w:val="auto"/>
-          <w:spacing w:val="0"/>
-          <w:w w:val="100"/>
-          <w:sz w:val="20"/>
-          <w:szCs w:val="20"/>
-          <w:lang w:val="ro-RO"/>
-        </w:rPr>
-        <w:t xml:space="preserve"> și șefii de locuri de muncă vor fi instruiți </w:t>
+        <w:t xml:space="preserve">personalul tehnico-administrativ și șefii de locuri de muncă</w:t>
+      </w:r>
+      <w:r>
+        <w:rPr>
+          <w:rFonts w:eastAsia="Arial" w:cs="Arial" w:ascii="Arial" w:hAnsi="Arial"/>
+          <w:color w:val="auto"/>
+          <w:spacing w:val="0"/>
+          <w:w w:val="100"/>
+          <w:sz w:val="20"/>
+          <w:szCs w:val="20"/>
+          <w:lang w:val="ro-RO"/>
+        </w:rPr>
+        <w:t xml:space="preserve"> vor fi instruiți </w:t>
       </w:r>
       <w:r>
         <w:rPr>
@@ -1361,19 +1361,6 @@
           <w:lang w:val="ro-RO"/>
         </w:rPr>
         <w:t xml:space="preserve">{{training.administrativeFrequency}}, </w:t>
-      </w:r>
-      <w:r>
-        <w:rPr>
-          <w:rFonts w:eastAsia="Arial" w:cs="Arial" w:ascii="Arial" w:hAnsi="Arial"/>
-          <w:b/>
-          <w:color w:val="auto"/>
-          <w:spacing w:val="0"/>
-          <w:w w:val="100"/>
-          <w:sz w:val="20"/>
-          <w:szCs w:val="20"/>
-          <w:lang w:val="ro-RO"/>
-        </w:rPr>
-        <w:t xml:space="preserve"/>
       </w:r>
       <w:r>
         <w:rPr>

</xml_diff>

<commit_message>
fix(templates): the training decision reads "(zilele) … ale lunii"
Art. 2 pt 3 c) read "în perioada (ziua) 10 – 20 ale lunii" twice: now
"(zilele)", which "ale" agrees with. The preamble drops the comma in "alin.
(4), și din H.G." and sets the representative off with commas like 1.2–1.5;
Art. 2 pt 2 c) reads "și/ sau", and pt 4 b) "aprobate de către angajator,
care vor fi păstrate".

Claude-Session: https://claude.ai/code/session_01A9qjCHVH6kcDAEKFiJoShR
</commit_message>
<xml_diff>
--- a/packages/document-engine/templates/1.1_decision_training.docx
+++ b/packages/document-engine/templates/1.1_decision_training.docx
@@ -93,7 +93,7 @@
           <w:szCs w:val="20"/>
           <w:lang w:val="ro-RO"/>
         </w:rPr>
-        <w:t xml:space="preserve">În baza prevederilor legale în domeniul securității și sănătății în muncă din Legea 319/ 2006 Art. 8, alin. (1), alin. (4), și din H.G. 1425/ 2006 Art. 14, Art. 15, alin. (1), punctul 4, Art. 20, alin. (1), Art. 85, Art. 89, alin. (1), Art. 91, alin. (1), Art. 94, Art. 96, alin. (1) și alin. (4), {{client.representativeName}} în calitate de</w:t>
+        <w:t xml:space="preserve">În baza prevederilor legale în domeniul securității și sănătății în muncă din Legea 319/ 2006 Art. 8, alin. (1), alin. (4) și din H.G. 1425/ 2006 Art. 14, Art. 15, alin. (1), punctul 4, Art. 20, alin. (1), Art. 85, Art. 89, alin. (1), Art. 91, alin. (1), Art. 94, Art. 96, alin. (1) și alin. (4), {{client.representativeName}}, în calitate de</w:t>
       </w:r>
       <w:r>
         <w:rPr>
@@ -1022,7 +1022,7 @@
           <w:szCs w:val="20"/>
           <w:lang w:val="ro-RO"/>
         </w:rPr>
-        <w:t>, inclusiv la schimbarea locului de muncă în cadrul întreprinderii și/sau al unității.</w:t>
+        <w:t xml:space="preserve">, inclusiv la schimbarea locului de muncă în cadrul întreprinderii și/ sau al unității.</w:t>
       </w:r>
     </w:p>
     <w:p>
@@ -1412,7 +1412,7 @@
           <w:szCs w:val="20"/>
           <w:lang w:val="ro-RO"/>
         </w:rPr>
-        <w:t>în perioada (ziua) {{training.dayFrom}} – {{training.dayTo}} ale lunii</w:t>
+        <w:t xml:space="preserve">în perioada (zilele) {{training.dayFrom}} – {{training.dayTo}} ale lunii</w:t>
       </w:r>
       <w:r>
         <w:rPr>
@@ -1555,7 +1555,7 @@
           <w:szCs w:val="20"/>
           <w:lang w:val="ro-RO"/>
         </w:rPr>
-        <w:t>în perioada (ziua) {{training.dayFrom}} – {{training.dayTo}} ale lunii</w:t>
+        <w:t xml:space="preserve">în perioada (zilele) {{training.dayFrom}} – {{training.dayTo}} ale lunii</w:t>
       </w:r>
       <w:r>
         <w:rPr>
@@ -2176,7 +2176,7 @@
           <w:szCs w:val="20"/>
           <w:lang w:val="ro-RO"/>
         </w:rPr>
-        <w:t>întocmite de către serviciul extern de prevenire și protecție – {{provider.legalName}} și aprobate de către angajator</w:t>
+        <w:t xml:space="preserve">întocmite de către serviciul extern de prevenire și protecție – {{provider.legalName}} și aprobate de către angajator,</w:t>
       </w:r>
       <w:r>
         <w:rPr>

</xml_diff>

<commit_message>
fix(templates): the training decision has the person who gave the training test the employees
Art. 3: "… se va face pe bază de teste, de către serviciul extern de prevenire și protecție
prin specialiștii în domeniul securității și sănătății în muncă din cadrul
{{provider.legalName}}." becomes "… se va face pe bază de teste, de către persoana care a
efectuat instruirea.".

Claude-Session: https://claude.ai/code/session_01A9qjCHVH6kcDAEKFiJoShR
</commit_message>
<xml_diff>
--- a/packages/document-engine/templates/1.1_decision_training.docx
+++ b/packages/document-engine/templates/1.1_decision_training.docx
@@ -2243,7 +2243,7 @@
           <w:szCs w:val="20"/>
           <w:lang w:val="ro-RO"/>
         </w:rPr>
-        <w:t xml:space="preserve"> se va face pe bază de teste, de către serviciul extern de prevenire și protecție prin specialiștii în domeniul securității și sănătății în muncă din cadrul {{pro</w:t>
+        <w:t xml:space="preserve"> se va face pe bază de teste, de către persoana care a efectuat instruirea</w:t>
       </w:r>
       <w:r>
         <w:rPr>
@@ -2256,7 +2256,7 @@
           <w:szCs w:val="20"/>
           <w:lang w:val="ro-RO"/>
         </w:rPr>
-        <w:t>vider.legalName}}.</w:t>
+        <w:t xml:space="preserve">.</w:t>
       </w:r>
     </w:p>
     <w:p>

</xml_diff>

<commit_message>
fix(documents): the templates say "unității" where they meant the client as "societății"
A client that is not a company (a PFA, for one) was called "societatea".
Eleven places now say "unitatea", inflected as before:

- 1.1 Art. 1 pt 2 "în cadrul unității;", Art. 6 "conducerea unității"
- 1.3 Art. 1 "toate locurile de muncă ale unității"
- 9 introduction "din unitatea {{client.legalName}}", "în cadrul unității",
  "au avut loc în unitate"
- 11 "în cadrul unității", "cu unitatea", "la intrarea în unitate",
  "la nivelul unității", "instrucțiunile proprii ale unității"

Left as they are: 11's "detașare de la altă societate" (another employer)
and 9's "riscul acceptat de societate" (society at large).

Claude-Session: https://claude.ai/code/session_01A9qjCHVH6kcDAEKFiJoShR
</commit_message>
<xml_diff>
--- a/packages/document-engine/templates/1.1_decision_training.docx
+++ b/packages/document-engine/templates/1.1_decision_training.docx
@@ -384,7 +384,7 @@
           <w:szCs w:val="20"/>
           <w:lang w:val="ro-RO"/>
         </w:rPr>
-        <w:t>itle}} în cadrul societății; {{/workplaceManagers}}</w:t>
+        <w:t xml:space="preserve">itle}} în cadrul unității; {{/workplaceManagers}}</w:t>
       </w:r>
     </w:p>
     <w:p>
@@ -2407,7 +2407,7 @@
           <w:szCs w:val="20"/>
           <w:lang w:val="ro-RO"/>
         </w:rPr>
-        <w:t>Prezența salariaților la instructaj este obligatorie și va fi asigurată de conducerea societății și/ sau de șeful locului de muncă (după caz).</w:t>
+        <w:t xml:space="preserve">Prezența salariaților la instructaj este obligatorie și va fi asigurată de conducerea unității și/ sau de șeful locului de muncă (după caz).</w:t>
       </w:r>
     </w:p>
     <w:p>

</xml_diff>

<commit_message>
fix(templates): the broken and unclear sentences of #309, swept
108 sentences across 3.2, 2.2, 9, 11, 12, the decisions, the tests, the registers and the
training themes read as they were meant to (lost words, wrong cases, dangling references,
labels of chapter XII, the amending formula of H.G. 767/2016 replaced by art. 87 alin. (3),
paraphrases labelled as quotations re-quoted from Legea 319/2006 and H.G. 1425/2006, the
ministry of 1993 named right, "art. N, alin." without the comma). Decision 1.1 names the
workplace managers after the staff they are, and its interval sentence agrees in number;
the training themes call the trainer "conducătorul locului de muncă"; cover 5.0 is rebuilt.

The edited templates went through the typesetting sweep; the chapter starts, the typed ranges
of 4.2 and the tests follow the final counts (3.2: 290 articles, 2.2: 325).

Refs #309, #282

Claude-Session: https://claude.ai/code/session_011H3SB7vPMevXGQUkjGaBx5
</commit_message>
<xml_diff>
--- a/packages/document-engine/templates/1.1_decision_training.docx
+++ b/packages/document-engine/templates/1.1_decision_training.docx
@@ -93,7 +93,7 @@
           <w:szCs w:val="20"/>
           <w:lang w:val="ro-RO"/>
         </w:rPr>
-        <w:t xml:space="preserve">În baza prevederilor legale în domeniul securității și sănătății în muncă din Legea 319/ 2006 Art. 8, alin. (1), alin. (4) și din H.G. 1425/ 2006 Art. 14, Art. 15, alin. (1), punctul 4, Art. 20, alin. (1), Art. 85, Art. 89, alin. (1), Art. 91, alin. (1), Art. 94, Art. 96, alin. (1) și alin. (4), {{client.representativeName}}, în calitate de</w:t>
+        <w:t xml:space="preserve">În baza prevederilor legale în domeniul securității și sănătății în muncă din Legea 319/ 2006 Art. 8 alin. (1), alin. (4) și din H.G. 1425/ 2006 Art. 14, Art. 15 alin. (1), punctul 4, Art. 20 alin. (1), Art. 85, Art. 89 alin. (1), Art. 91 alin. (1), Art. 94, Art. 96 alin. (1) și alin. (4), {{client.representativeName}}, în calitate de</w:t>
       </w:r>
       <w:r>
         <w:rPr>
@@ -303,88 +303,13 @@
       </w:pPr>
       <w:r>
         <w:rPr>
-          <w:rFonts w:eastAsia="Arial" w:cs="Arial" w:ascii="Arial" w:hAnsi="Arial"/>
-          <w:color w:val="auto"/>
-          <w:spacing w:val="0"/>
-          <w:w w:val="100"/>
-          <w:sz w:val="20"/>
-          <w:szCs w:val="20"/>
-          <w:lang w:val="ro-RO"/>
-        </w:rPr>
-        <w:t xml:space="preserve">Personalul din cadrul serviciului extern de prevenire și protecție {{provider.legalName}} va efectua instruirea la locul de muncă și instruirea periodică pentru {{#training.administrative}}personalul tehnico-administrativ și pentru {{/training.administrative}}personalul de conducere al locurilor de muncă din cadrul {{cli</w:t>
-      </w:r>
-      <w:r>
-        <w:rPr>
-          <w:rStyle w:val="PageNumber"/>
-          <w:rFonts w:eastAsia="Arial" w:cs="Arial" w:ascii="Arial" w:hAnsi="Arial"/>
-          <w:color w:val="auto"/>
-          <w:spacing w:val="0"/>
-          <w:w w:val="100"/>
-          <w:sz w:val="20"/>
-          <w:szCs w:val="20"/>
-          <w:lang w:val="ro-RO"/>
-        </w:rPr>
-        <w:t>ent.legalName}}</w:t>
-      </w:r>
-      <w:r>
-        <w:rPr>
-          <w:rFonts w:eastAsia="Arial" w:cs="Arial" w:ascii="Arial" w:hAnsi="Arial"/>
-          <w:color w:val="auto"/>
-          <w:spacing w:val="0"/>
-          <w:w w:val="100"/>
-          <w:sz w:val="20"/>
-          <w:szCs w:val="20"/>
-          <w:lang w:val="ro-RO"/>
-        </w:rPr>
-        <w:t>: {{#workplaceManagers}</w:t>
-      </w:r>
-      <w:r>
-        <w:rPr>
-          <w:rFonts w:eastAsia="Arial" w:cs="Arial" w:ascii="Arial" w:hAnsi="Arial"/>
-          <w:color w:val="auto"/>
-          <w:spacing w:val="0"/>
-          <w:w w:val="100"/>
-          <w:sz w:val="20"/>
-          <w:szCs w:val="20"/>
-          <w:lang w:val="ro-RO"/>
-        </w:rPr>
-        <w:t>}</w:t>
-      </w:r>
-      <w:r>
-        <w:rPr>
-          <w:rFonts w:eastAsia="Arial" w:cs="Arial" w:ascii="Arial" w:hAnsi="Arial"/>
-          <w:color w:val="auto"/>
-          <w:spacing w:val="0"/>
-          <w:w w:val="100"/>
-          <w:sz w:val="20"/>
-          <w:szCs w:val="20"/>
-          <w:lang w:val="ro-RO"/>
-        </w:rPr>
-        <w:t xml:space="preserve">{{name}}, având </w:t>
-      </w:r>
-      <w:r>
-        <w:rPr>
-          <w:rFonts w:eastAsia="Arial" w:cs="Arial" w:ascii="Arial" w:hAnsi="Arial"/>
-          <w:color w:val="auto"/>
-          <w:spacing w:val="0"/>
-          <w:w w:val="100"/>
-          <w:sz w:val="20"/>
-          <w:szCs w:val="20"/>
-          <w:lang w:val="ro-RO"/>
-        </w:rPr>
-        <w:t>funcția de {{jobT</w:t>
-      </w:r>
-      <w:r>
-        <w:rPr>
-          <w:rFonts w:eastAsia="Arial" w:cs="Arial" w:ascii="Arial" w:hAnsi="Arial"/>
-          <w:color w:val="auto"/>
-          <w:spacing w:val="0"/>
-          <w:w w:val="100"/>
-          <w:sz w:val="20"/>
-          <w:szCs w:val="20"/>
-          <w:lang w:val="ro-RO"/>
-        </w:rPr>
-        <w:t xml:space="preserve">itle}} în cadrul unității; {{/workplaceManagers}}</w:t>
+          <w:rFonts w:ascii="Arial" w:hAnsi="Arial" w:cs="Arial" w:eastAsia="Arial"/>
+          <w:color w:val="auto"/>
+          <w:sz w:val="20"/>
+          <w:szCs w:val="20"/>
+          <w:lang w:val="ro-RO"/>
+        </w:rPr>
+        <w:t xml:space="preserve">Personalul din cadrul serviciului extern de prevenire și protecție {{provider.legalName}} va efectua instruirea la locul de muncă și instruirea periodică pentru personalul de conducere al locurilor de muncă din cadrul {{client.legalName}}{{#training.administrative}} și pentru personalul tehnico-administrativ{{/training.administrative}}. Personalul de conducere al locurilor de muncă: {{#workplaceManagers}}{{name}}, având funcția de {{jobTitle}} în cadrul unității; {{/workplaceManagers}}</w:t>
       </w:r>
     </w:p>
     <w:p>
@@ -589,7 +514,7 @@
           <w:szCs w:val="20"/>
           <w:lang w:val="ro-RO"/>
         </w:rPr>
-        <w:t>Categorii de personal care participă la efectuarea instruirilor:</w:t>
+        <w:t>Instruirea se face:</w:t>
       </w:r>
     </w:p>
     <w:p>
@@ -840,7 +765,7 @@
           <w:szCs w:val="20"/>
           <w:lang w:val="ro-RO"/>
         </w:rPr>
-        <w:t>Categorii de personal care participă la efectuarea instruirilor:</w:t>
+        <w:t>Instruirea se face:</w:t>
       </w:r>
     </w:p>
     <w:p>
@@ -1247,7 +1172,7 @@
           <w:szCs w:val="20"/>
           <w:lang w:val="ro-RO"/>
         </w:rPr>
-        <w:t xml:space="preserve">Având în vedere specificul activităților desfășurate în cadrul {{client.legalName}}, conform prevederilor din H.G. 1425/ 2006, Art. 96, alin. (2) stabilesc {{training.intervalPhrase}} pentru efectuarea instruirilor periodice:</w:t>
+        <w:t xml:space="preserve">Având în vedere specificul activităților desfășurate în cadrul {{client.legalName}}, conform prevederilor din H.G. 1425/ 2006, art. 96 alin. (2), {{training.intervalPhrase}} pentru efectuarea instruirilor periodice:</w:t>
       </w:r>
     </w:p>
     <w:p>
@@ -2226,53 +2151,13 @@
       </w:pPr>
       <w:r>
         <w:rPr>
-          <w:rFonts w:eastAsia="Arial" w:cs="Arial" w:ascii="Arial" w:hAnsi="Arial"/>
-          <w:color w:val="auto"/>
-          <w:spacing w:val="0"/>
-          <w:w w:val="100"/>
-          <w:sz w:val="20"/>
-          <w:szCs w:val="20"/>
-          <w:lang w:val="ro-RO"/>
-        </w:rPr>
-        <w:t>Verificarea efectuării instruirii periodice, însușirea cunoștințelor și modul de respectare a prevederilor legislative, regulilor, instrucțiunilor, deciziilor în cadrul {{cli</w:t>
-      </w:r>
-      <w:r>
-        <w:rPr>
-          <w:rStyle w:val="PageNumber"/>
-          <w:rFonts w:eastAsia="Arial" w:cs="Arial" w:ascii="Arial" w:hAnsi="Arial"/>
-          <w:color w:val="auto"/>
-          <w:spacing w:val="0"/>
-          <w:w w:val="100"/>
-          <w:sz w:val="20"/>
-          <w:szCs w:val="20"/>
-          <w:lang w:val="ro-RO"/>
-        </w:rPr>
-        <w:t>ent.legalName}}</w:t>
-      </w:r>
-      <w:r>
-        <w:rPr>
-          <w:rFonts w:eastAsia="Arial" w:cs="Arial" w:ascii="Arial" w:hAnsi="Arial"/>
-          <w:color w:val="auto"/>
-          <w:spacing w:val="0"/>
-          <w:w w:val="100"/>
-          <w:sz w:val="20"/>
-          <w:szCs w:val="20"/>
-          <w:lang w:val="ro-RO"/>
-        </w:rPr>
-        <w:t xml:space="preserve"> se va face selectiv și/ sau cumulat de către angajator, având parte de consultanță prin specialiștii în domeniul securității și sănătății în muncă din cadrul {{pro</w:t>
-      </w:r>
-      <w:r>
-        <w:rPr>
-          <w:rStyle w:val="PageNumber"/>
-          <w:rFonts w:eastAsia="Arial" w:cs="Arial" w:ascii="Arial" w:hAnsi="Arial"/>
-          <w:color w:val="auto"/>
-          <w:spacing w:val="0"/>
-          <w:w w:val="100"/>
-          <w:sz w:val="20"/>
-          <w:szCs w:val="20"/>
-          <w:lang w:val="ro-RO"/>
-        </w:rPr>
-        <w:t>vider.legalName}}.</w:t>
+          <w:rFonts w:ascii="Arial" w:hAnsi="Arial" w:cs="Arial" w:eastAsia="Arial"/>
+          <w:color w:val="auto"/>
+          <w:sz w:val="20"/>
+          <w:szCs w:val="20"/>
+          <w:lang w:val="ro-RO"/>
+        </w:rPr>
+        <w:t xml:space="preserve">Verificarea efectuării instruirii periodice, a însușirii cunoștințelor și a modului de respectare a prevederilor legislative, a regulilor, instrucțiunilor și deciziilor în cadrul {{client.legalName}} se va face selectiv și/ sau cumulat de către angajator, cu consultanța specialiștilor în domeniul securității și sănătății în muncă din cadrul {{provider.legalName}}.</w:t>
       </w:r>
     </w:p>
     <w:p>
@@ -2293,40 +2178,13 @@
       </w:pPr>
       <w:r>
         <w:rPr>
-          <w:rFonts w:eastAsia="Arial" w:cs="Arial" w:ascii="Arial" w:hAnsi="Arial"/>
-          <w:color w:val="auto"/>
-          <w:spacing w:val="0"/>
-          <w:w w:val="100"/>
-          <w:sz w:val="20"/>
-          <w:szCs w:val="20"/>
-          <w:lang w:val="ro-RO"/>
-        </w:rPr>
-        <w:t>În cazul în care persoanele numite pe funcții cu atribuții în domeniul securității și sănătății în muncă (personalul de conducere al locurilor de muncă menționat mai sus) se schimbă, noii angajați vor lua la cunoștință despre prezenta decizie prin semnarea</w:t>
-      </w:r>
-      <w:r>
-        <w:rPr>
-          <w:rFonts w:eastAsia="Arial" w:cs="Arial" w:ascii="Arial" w:hAnsi="Arial"/>
-          <w:b/>
-          <w:color w:val="auto"/>
-          <w:spacing w:val="0"/>
-          <w:w w:val="100"/>
-          <w:sz w:val="20"/>
-          <w:szCs w:val="20"/>
-          <w:lang w:val="ro-RO"/>
-        </w:rPr>
-        <w:t xml:space="preserve"> </w:t>
-      </w:r>
-      <w:r>
-        <w:rPr>
-          <w:rFonts w:eastAsia="Arial" w:cs="Arial" w:ascii="Arial" w:hAnsi="Arial"/>
-          <w:color w:val="auto"/>
-          <w:spacing w:val="0"/>
-          <w:w w:val="100"/>
-          <w:sz w:val="20"/>
-          <w:szCs w:val="20"/>
-          <w:lang w:val="ro-RO"/>
-        </w:rPr>
-        <w:t xml:space="preserve">procesului-verbal de luare la cunoștință și de primire a unui exemplar al prezentei decizii.</w:t>
+          <w:rFonts w:ascii="Arial" w:hAnsi="Arial" w:cs="Arial" w:eastAsia="Arial"/>
+          <w:color w:val="auto"/>
+          <w:sz w:val="20"/>
+          <w:szCs w:val="20"/>
+          <w:lang w:val="ro-RO"/>
+        </w:rPr>
+        <w:t xml:space="preserve">În cazul în care persoanele numite pe funcții cu atribuții în domeniul securității și sănătății în muncă (personalul de conducere al locurilor de muncă menționat mai sus) se schimbă, persoanele nou numite vor lua cunoștință de prezenta decizie prin semnarea procesului-verbal de luare la cunoștință și de primire a unui exemplar al prezentei decizii.</w:t>
       </w:r>
     </w:p>
     <w:p>

</xml_diff>

<commit_message>
fix(templates): the rest of the occupational safety pack prints its list labels at the size of the text: the general training material, the employer briefing, the equipment list, the hiring test, the risk assessment, decisions 1 and 1.5 and the control regulation; their dashes as plain en dashes in Arial, decision 1's no longer in Times and 11 pt; the risk assessment's positions row moves whole to the next page, where the in-app editor cut its number in two
</commit_message>
<xml_diff>
--- a/packages/document-engine/templates/1.1_decision_training.docx
+++ b/packages/document-engine/templates/1.1_decision_training.docx
@@ -3603,7 +3603,7 @@
     <w:lvl w:ilvl="2">
       <w:start w:val="7"/>
       <w:numFmt w:val="bullet"/>
-      <w:lvlText w:val="-"/>
+      <w:lvlText w:val="–"/>
       <w:lvlJc w:val="left"/>
       <w:pPr>
         <w:tabs>
@@ -3612,11 +3612,11 @@
         <w:ind w:left="1800" w:hanging="360"/>
       </w:pPr>
       <w:rPr>
-        <w:rFonts w:ascii="Times New Roman" w:hAnsi="Times New Roman" w:cs="Times New Roman" w:hint="default"/>
+        <w:rFonts w:ascii="Arial" w:hAnsi="Arial" w:cs="Arial"/>
         <w:b w:val="false"/>
         <w:i w:val="false"/>
-        <w:sz w:val="22"/>
-        <w:szCs w:val="22"/>
+        <w:sz w:val="20"/>
+        <w:szCs w:val="20"/>
       </w:rPr>
     </w:lvl>
     <w:lvl w:ilvl="3">
@@ -4042,7 +4042,7 @@
     <w:lvl w:ilvl="0">
       <w:start w:val="65535"/>
       <w:numFmt w:val="bullet"/>
-      <w:lvlText w:val="-"/>
+      <w:lvlText w:val="–"/>
       <w:lvlJc w:val="left"/>
       <w:pPr>
         <w:tabs>
@@ -4051,11 +4051,11 @@
         <w:ind w:left="1800" w:hanging="360"/>
       </w:pPr>
       <w:rPr>
-        <w:rFonts w:ascii="Times New Roman" w:hAnsi="Times New Roman" w:cs="Times New Roman" w:hint="default"/>
-        <w:b/>
+        <w:rFonts w:ascii="Arial" w:hAnsi="Arial" w:cs="Arial"/>
+        <w:b w:val="false"/>
         <w:i w:val="false"/>
-        <w:sz w:val="18"/>
-        <w:szCs w:val="18"/>
+        <w:sz w:val="20"/>
+        <w:szCs w:val="20"/>
       </w:rPr>
     </w:lvl>
     <w:lvl w:ilvl="1">
@@ -4159,7 +4159,7 @@
     <w:lvl w:ilvl="0">
       <w:start w:val="7"/>
       <w:numFmt w:val="bullet"/>
-      <w:lvlText w:val="-"/>
+      <w:lvlText w:val="–"/>
       <w:lvlJc w:val="left"/>
       <w:pPr>
         <w:tabs>
@@ -4168,11 +4168,11 @@
         <w:ind w:left="1080" w:hanging="360"/>
       </w:pPr>
       <w:rPr>
-        <w:rFonts w:ascii="Times New Roman" w:hAnsi="Times New Roman" w:cs="Times New Roman" w:hint="default"/>
+        <w:rFonts w:ascii="Arial" w:hAnsi="Arial" w:cs="Arial"/>
         <w:b w:val="false"/>
         <w:i w:val="false"/>
-        <w:sz w:val="22"/>
-        <w:szCs w:val="22"/>
+        <w:sz w:val="20"/>
+        <w:szCs w:val="20"/>
       </w:rPr>
     </w:lvl>
     <w:lvl w:ilvl="1">
@@ -4316,7 +4316,7 @@
     <w:lvl w:ilvl="2">
       <w:start w:val="65535"/>
       <w:numFmt w:val="bullet"/>
-      <w:lvlText w:val="-"/>
+      <w:lvlText w:val="–"/>
       <w:lvlJc w:val="left"/>
       <w:pPr>
         <w:tabs>
@@ -4325,11 +4325,11 @@
         <w:ind w:left="1800" w:hanging="360"/>
       </w:pPr>
       <w:rPr>
-        <w:rFonts w:ascii="Times New Roman" w:hAnsi="Times New Roman" w:cs="Times New Roman" w:hint="default"/>
-        <w:b/>
+        <w:rFonts w:ascii="Arial" w:hAnsi="Arial" w:cs="Arial"/>
+        <w:b w:val="false"/>
         <w:i w:val="false"/>
-        <w:sz w:val="18"/>
-        <w:szCs w:val="18"/>
+        <w:sz w:val="20"/>
+        <w:szCs w:val="20"/>
         <w:lang w:val="it-CH"/>
       </w:rPr>
     </w:lvl>

</xml_diff>